<commit_message>
Update Chapter 1 with Baltimore working-class context and user corrections
</commit_message>
<xml_diff>
--- a/The_Improbability_of_Me_Master_Draft.docx
+++ b/The_Improbability_of_Me_Master_Draft.docx
@@ -151,7 +151,7 @@
         <w:pStyle w:val="FirstParagraph"/>
       </w:pPr>
       <w:r>
-        <w:t xml:space="preserve">The security badge is a thick piece of white plastic, embedded with a passive RFID chip and a copper antenna that runs along the perimeter of the card. When I hold it up to the wall-mounted reader at the main entry portal of the corporate headquarters, the reader chirps a high-frequency, electronic tone, the status LED flashes from a solid amber to a brief, permission-granted green, and the heavy bulletproof glass doors slide open.</w:t>
+        <w:t xml:space="preserve">The security badge is a thick piece of plastic, embedded with a passive RFID chip and a copper antenna that runs along the perimeter of the card. When I hold it up to the floor-mounted reader at the main entry portal of the corporate headquarters, the reader chirps a high-frequency, electronic tone, the status LED flashes from a solid amber to a brief, permission-granted green, and the doors slide open.</w:t>
       </w:r>
     </w:p>
     <w:p>
@@ -195,15 +195,15 @@
         <w:pStyle w:val="BodyText"/>
       </w:pPr>
       <w:r>
-        <w:t xml:space="preserve">I am a process control and systems engineer. I am the Principal Engineer in charge of Critical Infrastructure and Systems at Walmart Headquarters. I have spent years as a senior cybersecurity architect at MITRE—the elite, federally funded think tank where the smartest minds in the defense and intelligence communities solve the nation’s hardest problems. I have worked on highly sensitive, classified national security architectures that I am legally barred from discussing for the rest of my life. I have sat in windowless, soundproof rooms in Washington, D.C., where my technical calculations and risk analyses directly shaped national-level infrastructure decisions that you have watched play out on the evening news. I have been the Director of OT Cybersecurity at the American Bureau of Shipping, and a Director at Koch Industries, managing the functional safety and resilience budget for a $1.7 billion plant modernization project where a single design error could create a toxic, chemical crater.</w:t>
-      </w:r>
-    </w:p>
-    <w:p>
-      <w:pPr>
-        <w:pStyle w:val="BodyText"/>
-      </w:pPr>
-      <w:r>
-        <w:t xml:space="preserve">And in almost every one of those elite boardrooms and secure bunkers, I am the only person sitting at the table who has stood before a circuit court judge, wearing hand-irons and an orange jumpsuit, waiting to hear how many years of his life were about to be deleted by the state.</w:t>
+        <w:t xml:space="preserve">I am a process control and systems engineer. I am the Principal Engineer in charge of Critical Infrastructure and Systems at Walmart Headquarters. I have spent years as a senior cybersecurity architect at MITRE—the elite, federally funded think tank where the smartest minds in the defense and intelligence communities solve the nation’s hardest problems. I have worked on highly sensitive, classified national security architectures that I am legally barred from discussing for the forseeable future. I have sat in windowless, soundproof rooms in Washington, D.C., where my technical calculations and risk analyses directly shaped national-level infrastructure decisions that you have watched play out on the evening news. I have been the Director of OT Cybersecurity at the American Bureau of Shipping, and a Director at Koch Industries, managing the functional safety and resilience budget for a multi billion dollar plant modernization project where a single design error could create a toxic, chemical crater.</w:t>
+      </w:r>
+    </w:p>
+    <w:p>
+      <w:pPr>
+        <w:pStyle w:val="BodyText"/>
+      </w:pPr>
+      <w:r>
+        <w:t xml:space="preserve">And in almost every one of those elite boardrooms and secure bunkers, I am the only person sitting at the table who has stood before a circuit court judge, wearing shackles and an orange jumpsuit, waiting to hear how many years of his life were about to be deleted by the state.</w:t>
       </w:r>
     </w:p>
     <w:p>
@@ -292,7 +292,19 @@
         <w:pStyle w:val="BodyText"/>
       </w:pPr>
       <w:r>
-        <w:t xml:space="preserve">I was a kid from Baltimore City—a real shit hole of a city—born on the bordering edge of absolute poverty. I grew up in a world where the system was fundamentally broken, where the inputs of hard work and honesty were routinely converted into the outputs of physical abuse and street violence. I was smart enough to recognize that the default path led straight to the cemetery or the cell block, but I was arrogant enough to believe that I could engineer my own route around the parameters.</w:t>
+        <w:t xml:space="preserve">I was a kid from Baltimore City—a real shit hole of a city—born in a working-class area. That was unusual in Baltimore, as most people</w:t>
+      </w:r>
+      <w:r>
+        <w:t xml:space="preserve"> </w:t>
+      </w:r>
+      <w:r>
+        <w:t xml:space="preserve">“work for the state.”</w:t>
+      </w:r>
+      <w:r>
+        <w:t xml:space="preserve"> </w:t>
+      </w:r>
+      <w:r>
+        <w:t xml:space="preserve">Now, when I say work for the state, I mean they collect welfare, run some kind of scam, or do something other than actually work. Shit, most of them work harder to not work. I was born on the bordering edge of absolute poverty, growing up in a world where the system was fundamentally broken, where the inputs of hard work and honesty were routinely converted into the outputs of physical abuse and street violence. I was smart enough to recognize that the default path led straight to the cemetery or the cell block, but I was arrogant enough to believe that I could engineer my own route around the parameters.</w:t>
       </w:r>
     </w:p>
     <w:p>

</xml_diff>

<commit_message>
Update Chapter 1: Refined intro, added Kintsugi analogy, and lessons learned
</commit_message>
<xml_diff>
--- a/The_Improbability_of_Me_Master_Draft.docx
+++ b/The_Improbability_of_Me_Master_Draft.docx
@@ -151,6 +151,26 @@
         <w:pStyle w:val="FirstParagraph"/>
       </w:pPr>
       <w:r>
+        <w:t xml:space="preserve">So I’m kind of a fuck-up. I’ll admit it. In fact, one of the most important things a fuck-up can do is admit to being fucked up. I heard this saying once attributed to Otto von Bismarck that goes something like,</w:t>
+      </w:r>
+      <w:r>
+        <w:t xml:space="preserve"> </w:t>
+      </w:r>
+      <w:r>
+        <w:t xml:space="preserve">“Only a fool learns from his own mistakes. The wise man learns from the mistakes of others.”</w:t>
+      </w:r>
+      <w:r>
+        <w:t xml:space="preserve"> </w:t>
+      </w:r>
+      <w:r>
+        <w:t xml:space="preserve">Fucking Otto had his shit together. Me? Well, not so much. Up until only a few years ago I was someone else’s fool. Someone else’s example of what not to do. When I decided to write this book, I felt it was important to share the foolish shit I did so a future Otto von Bismarck can indeed learn from my mistakes. I don’t mind being a cautionary tale. The first thing I’ll teach you is fuck pride. Pride never really helped anyone. So here you go, my gift to you: a thorough blueprint on how not to do it, and a plan to turn it around if you happen to fuck up like me.</w:t>
+      </w:r>
+    </w:p>
+    <w:p>
+      <w:pPr>
+        <w:pStyle w:val="BodyText"/>
+      </w:pPr>
+      <w:r>
         <w:t xml:space="preserve">The security badge is a thick piece of plastic, embedded with a passive RFID chip and a copper antenna that runs along the perimeter of the card. When I hold it up to the floor-mounted reader at the main entry portal of the corporate headquarters, the reader chirps a high-frequency, electronic tone, the status LED flashes from a solid amber to a brief, permission-granted green, and the doors slide open.</w:t>
       </w:r>
     </w:p>
@@ -159,7 +179,20 @@
         <w:pStyle w:val="BodyText"/>
       </w:pPr>
       <w:r>
-        <w:t xml:space="preserve">I step through the threshold, my sneakers squeaking softly against the polished granite floor. I am carrying a high-security laptop inside a nondescript backpack—I prefer to stay kind of nondescript—and a Master of Science degree in Systems Engineering from Johns Hopkins University in my profile. Systems Engineering is a brutal, highly rigorous, multi-disciplinary technical discipline designed to model, analyze, and control highly complex, interactive engineering matrices. In this field, you don’t just study a single circuit board or write a line of isolated code; you study the entire mathematical matrix of interactive dependencies, feedback loops, and failure modes across systems that could be the size of cities, nations, or the entire globe. It is the science of control and predictability in a chaotic universe. Armed with that training, I have</w:t>
+        <w:t xml:space="preserve">I step through the threshold, my sneakers squeaking softly against the polished granite floor. I am carrying a high-security laptop inside a nondescript backpack—I prefer to stay kind of nondescript—and at home hangs a Master of Science degree in Systems Engineering from Johns Hopkins University. Systems Engineering is a brutal, highly rigorous, multi-disciplinary technical discipline designed to model, analyze, and control highly complex, interactive engineering matrices. In this field, you don’t just study a single circuit board or write a line of isolated code; you study the entire mathematical matrix of interactive dependencies, feedback loops, and failure modes across systems that could be the size of cities, nations, or the entire globe. It is the science of control and predictability in a chaotic universe. The Germans have a word,</w:t>
+      </w:r>
+      <w:r>
+        <w:t xml:space="preserve"> </w:t>
+      </w:r>
+      <w:r>
+        <w:rPr>
+          <w:i/>
+          <w:iCs/>
+        </w:rPr>
+        <w:t xml:space="preserve">Weltanschauung</w:t>
+      </w:r>
+      <w:r>
+        <w:t xml:space="preserve">, world view. Systems Engineering teaches you how to see past it all and see the real world view. Armed with that training, I have</w:t>
       </w:r>
       <w:r>
         <w:t xml:space="preserve"> </w:t>
@@ -187,23 +220,23 @@
         <w:pStyle w:val="BodyText"/>
       </w:pPr>
       <w:r>
-        <w:t xml:space="preserve">Because the man walking through these secure corridors is the exact same man who carries a federal rap sheet.</w:t>
-      </w:r>
-    </w:p>
-    <w:p>
-      <w:pPr>
-        <w:pStyle w:val="BodyText"/>
-      </w:pPr>
-      <w:r>
-        <w:t xml:space="preserve">I am a process control and systems engineer. I am the Principal Engineer in charge of Critical Infrastructure and Systems at Walmart Headquarters. I have spent years as a senior cybersecurity architect at MITRE—the elite, federally funded think tank where the smartest minds in the defense and intelligence communities solve the nation’s hardest problems. I have worked on highly sensitive, classified national security architectures that I am legally barred from discussing for the forseeable future. I have sat in windowless, soundproof rooms in Washington, D.C., where my technical calculations and risk analyses directly shaped national-level infrastructure decisions that you have watched play out on the evening news. I have been the Director of OT Cybersecurity at the American Bureau of Shipping, and a Director at Koch Industries, managing the functional safety and resilience budget for a multi billion dollar plant modernization project where a single design error could create a toxic, chemical crater.</w:t>
-      </w:r>
-    </w:p>
-    <w:p>
-      <w:pPr>
-        <w:pStyle w:val="BodyText"/>
-      </w:pPr>
-      <w:r>
-        <w:t xml:space="preserve">And in almost every one of those elite boardrooms and secure bunkers, I am the only person sitting at the table who has stood before a circuit court judge, wearing shackles and an orange jumpsuit, waiting to hear how many years of his life were about to be deleted by the state.</w:t>
+        <w:t xml:space="preserve">Because the man walking through these secure corridors is the exact same man who carries a massive rap sheet littered with felonies.</w:t>
+      </w:r>
+    </w:p>
+    <w:p>
+      <w:pPr>
+        <w:pStyle w:val="BodyText"/>
+      </w:pPr>
+      <w:r>
+        <w:t xml:space="preserve">I am a process control and systems engineer. I am the Principal Engineer in charge of Critical Infrastructure and Systems at Walmart Headquarters. I have spent years as a Principal Engineer at MITRE—the elite, federally funded think tank where the smartest minds in the defense and intelligence communities solve the nation’s hardest problems. I have worked on highly sensitive, classified national security architectures that I am legally barred from discussing for the foreseeable future. I have sat in windowless, soundproof rooms in Washington, D.C., where my technical calculations and risk analyses directly shaped national-level infrastructure decisions that you have watched play out on the evening news. I have been the Director of OT Cybersecurity at the American Bureau of Shipping, and a Director at Koch Industries, managing the functional safety and resilience budget for a multi-billion dollar plant modernization project where a single design error could create a toxic, chemical crater.</w:t>
+      </w:r>
+    </w:p>
+    <w:p>
+      <w:pPr>
+        <w:pStyle w:val="BodyText"/>
+      </w:pPr>
+      <w:r>
+        <w:t xml:space="preserve">And in almost every one of those elite boardrooms and secure bunkers, I am the only person sitting at the table who has stood before a circuit court judge, wearing shackles and a jumpsuit, waiting to hear how many years of his life were about to be deleted by the state.</w:t>
       </w:r>
     </w:p>
     <w:p>
@@ -256,7 +289,19 @@
         <w:t xml:space="preserve">“intelligence and guile”</w:t>
       </w:r>
       <w:r>
-        <w:t xml:space="preserve">—a man so dangerous that the local police and federal agents launched a high-speed, multi-car ambush on Light Street in Baltimore while I was on foot, dropping my toddler daughter Gabby off to her mother. They argued that I was so dangerous, so well connected, that if given bail, my international connections would make sure I would never be found.</w:t>
+        <w:t xml:space="preserve">—a man so dangerous that the local police and federal agents launched a high-speed, multi-car ambush on Light Street in Baltimore while I was on foot, dropping my toddler daughter Gabby off to her mother. They argued that I was so dangerous, so well connected, that if given bail, my international connections would make sure I would never be found. This required I be stored in</w:t>
+      </w:r>
+      <w:r>
+        <w:t xml:space="preserve"> </w:t>
+      </w:r>
+      <w:r>
+        <w:t xml:space="preserve">“Killer K”</w:t>
+      </w:r>
+      <w:r>
+        <w:t xml:space="preserve"> </w:t>
+      </w:r>
+      <w:r>
+        <w:t xml:space="preserve">where those of us of significant distinction in the criminal underworld were kept.</w:t>
       </w:r>
     </w:p>
     <w:p>
@@ -284,7 +329,7 @@
         <w:t xml:space="preserve"> </w:t>
       </w:r>
       <w:r>
-        <w:t xml:space="preserve">is a heavy, theatrical word designed for television screens and prosecutorial career advancement. The truth is much simpler, much grittier, and entirely logical if you understand the mathematics of survival.</w:t>
+        <w:t xml:space="preserve">is a heavy, theatrical word designed for television screens and prosecutorial career advancement. The truth is much simpler, much grittier, and entirely logical if you understand how little things snowball into big things.</w:t>
       </w:r>
     </w:p>
     <w:p>
@@ -312,39 +357,39 @@
         <w:pStyle w:val="BodyText"/>
       </w:pPr>
       <w:r>
-        <w:t xml:space="preserve">I didn’t view the steroid remailing operation as a criminal enterprise. To my analytical brain, it was simply a highly profitable, high-efficiency logistics problem. I was an A&amp;P mechanic fixing Air Force Two by day, and a remailer breaking down bulk shipments from Thailand by night. I didn’t sell the gear on the streets; I simply managed the upstream dependencies, popping the metal seals on import cans, packaging the vials and pills, and routing them to the next node in the chain via secure, encrypted digital accounts. It was a beautiful, decentralized matrix—until the single point of failure at JFK Airport flipped, and the entire system cascaded into a catastrophic shutdown.</w:t>
-      </w:r>
-    </w:p>
-    <w:p>
-      <w:pPr>
-        <w:pStyle w:val="BodyText"/>
-      </w:pPr>
-      <w:r>
-        <w:t xml:space="preserve">I have been locked in a cage. I have had my freedom stripped down to an eight-ounce ankle monitor that rubbed against my leg as a constant reminder of my poor judgement while I tried to rebuild my life at Northrop Grumman. I have had a Baltimore judge look down his nose at me with a condescending, holier-than-thou arrogance, telling me my mere presence was an insult to his courtroom. I have had cancer try to eat my body from the inside out, and I have raw-dogged the recovery from a sawed-off titanium hip replacement while refusing the chemical surrender of opioids.</w:t>
-      </w:r>
-    </w:p>
-    <w:p>
-      <w:pPr>
-        <w:pStyle w:val="BodyText"/>
-      </w:pPr>
-      <w:r>
-        <w:t xml:space="preserve">Statistics say I should not be here. According to the actuarial tables and the state’s projections, I should be another nameless statistic, a permanent resident of a state penitentiary, or a broken component scraping by on the margins of the economy.</w:t>
-      </w:r>
-    </w:p>
-    <w:p>
-      <w:pPr>
-        <w:pStyle w:val="BodyText"/>
-      </w:pPr>
-      <w:r>
-        <w:t xml:space="preserve">Instead, I rebuilt the chassis.</w:t>
-      </w:r>
-    </w:p>
-    <w:p>
-      <w:pPr>
-        <w:pStyle w:val="BodyText"/>
-      </w:pPr>
-      <w:r>
-        <w:t xml:space="preserve">I realized that the survival instincts I forged on the streets of Baltimore were not bugs in my code; they were the ultimate operating system. The high-voltage, threat-scanning CPU that scanned Greenmount Avenue alleys for blades is the exact same mental engine that scans industrial control networks for cyber threats today. The cognitive scanning process never uninstalled; it was simply retrofitted for legitimate architecture.</w:t>
+        <w:t xml:space="preserve">I didn’t view the steroid distribution operation as a criminal enterprise. To my analytical brain, it was simply a highly profitable, high-efficiency logistics problem. At the time I was an A&amp;P mechanic fixing Air Force Two by day, and a remailer breaking down bulk shipments from Thailand by night. In my own mind I was an entrepreneurial playboy genius. I didn’t sell the gear on the streets; I simply managed the upstream dependencies, popping the metal seals on import cans, packaging the vials and pills, and routing them to the next node in the chain via secure, encrypted digital accounts. It was a beautiful, decentralized matrix—until the single point of failure at JFK Airport flipped, and the entire system cascaded into a catastrophic shutdown.</w:t>
+      </w:r>
+    </w:p>
+    <w:p>
+      <w:pPr>
+        <w:pStyle w:val="BodyText"/>
+      </w:pPr>
+      <w:r>
+        <w:t xml:space="preserve">I have been locked in a cage. I have had my freedom stripped down to an eight-ounce ankle monitor that rubbed against my leg as a constant reminder of my poor judgement while I tried to rebuild my life at Northrop Grumman. I have had a Baltimore judge look down his nose at me with a condescending, holier-than-thou arrogance, telling me my mere presence was an insult to his courtroom. I have had cancer try to eat my body from the inside out, and I have raw-dogged the recovery from a sawed-off titanium hip replacement while refusing the chemical surrender of opioids. Next lesson, if you are going to be dumb you damn sure better be tough. Grit, determination, the desire to win by attrition. To do what they won’t or do what they can’t, that’s the next lesson. No matter how fucked up shit gets. No matter how dark the cell, you just got to persevere. If it hurts it means you are still alive and you got to keep going.</w:t>
+      </w:r>
+    </w:p>
+    <w:p>
+      <w:pPr>
+        <w:pStyle w:val="BodyText"/>
+      </w:pPr>
+      <w:r>
+        <w:t xml:space="preserve">Statistics say I should not be here. According to the actuarial tables and the state’s projections, I should be another nameless statistic, a permanent resident of a state prison, or a broken component scraping by on the margins of the economy.</w:t>
+      </w:r>
+    </w:p>
+    <w:p>
+      <w:pPr>
+        <w:pStyle w:val="BodyText"/>
+      </w:pPr>
+      <w:r>
+        <w:t xml:space="preserve">I hit the bottom and instead of taking that shit, I re-engineered and rebuilt.</w:t>
+      </w:r>
+    </w:p>
+    <w:p>
+      <w:pPr>
+        <w:pStyle w:val="BodyText"/>
+      </w:pPr>
+      <w:r>
+        <w:t xml:space="preserve">I realized that the survival instincts I forged on the streets of Baltimore were not bugs in my code; they were the ultimate operating system. The high-voltage, threat-scanning CPU that scanned Greenmount and North Avenue sidewalks for trouble is the exact same mental engine that scans industrial control networks for cyber threats today. The cognitive scanning process never uninstalled; it was simply retrofitted for legitimate architecture.</w:t>
       </w:r>
     </w:p>
     <w:p>
@@ -364,15 +409,28 @@
         <w:t xml:space="preserve"> </w:t>
       </w:r>
       <w:r>
-        <w:t xml:space="preserve">I do not ask for your pity, and I will not offer you sentimentality. This is a story about the raw, cold physics of reconstruction. It is an audit of how a system can be pushed to the absolute redline of failure, shatter into a thousand jagged pieces, and still be re-engineered into something far stronger than the original design.</w:t>
-      </w:r>
-    </w:p>
-    <w:p>
-      <w:pPr>
-        <w:pStyle w:val="BodyText"/>
-      </w:pPr>
-      <w:r>
-        <w:t xml:space="preserve">But the systems thinking didn’t start in a university lecture hall or a corporate boardroom. The foundation was laid decades earlier, in the survival arithmetic of a teenager riding the Baltimore transit buses, learning how to scan a crowd, map exit routes, and calculate threat levels in real time.</w:t>
+        <w:t xml:space="preserve">I do not ask for your pity, and I will not offer you sentimentality. This is a story about the raw, cold physics of reconstruction. It is an audit of how a system can be pushed to the absolute redline of failure, shatter into a thousand jagged pieces, and still be re-engineered into something far stronger than the original design. The Japanese have this repair technique called</w:t>
+      </w:r>
+      <w:r>
+        <w:t xml:space="preserve"> </w:t>
+      </w:r>
+      <w:r>
+        <w:rPr>
+          <w:i/>
+          <w:iCs/>
+        </w:rPr>
+        <w:t xml:space="preserve">kintsugi</w:t>
+      </w:r>
+      <w:r>
+        <w:t xml:space="preserve">. When something breaks they repair it but don’t cover the cracks. They outline the cracks in gold. That’s how I look at my cracks. They happened, and while life would’ve been infinitely easier if I stayed the golden boy, the cracks are what made me, me.</w:t>
+      </w:r>
+    </w:p>
+    <w:p>
+      <w:pPr>
+        <w:pStyle w:val="BodyText"/>
+      </w:pPr>
+      <w:r>
+        <w:t xml:space="preserve">But the systems thinking didn’t start in a university lecture hall or a corporate boardroom. The foundation was laid decades earlier, in the survival arithmetic of a teenager riding the Baltimore city buses, learning how to scan a crowd, map exit routes, and calculate threat levels in real time.</w:t>
       </w:r>
     </w:p>
     <w:p>

</xml_diff>

<commit_message>
Update Chapter 2: Expanded on grandfather Jim and Pauline's chandelier story
</commit_message>
<xml_diff>
--- a/The_Improbability_of_Me_Master_Draft.docx
+++ b/The_Improbability_of_Me_Master_Draft.docx
@@ -482,7 +482,15 @@
         <w:pStyle w:val="BodyText"/>
       </w:pPr>
       <w:r>
-        <w:t xml:space="preserve">My factory was a row house with a basement on Williams Street, right in the Federal Hill neighborhood of Baltimore. My grandfather, Jim, bought the place with a GI loan for three thousand dollars. Today, Federal Hill is gentrified and expensive—a playground of high-end bistros and young professionals. Back then, it was just Baltimore—working-class, gritty, and smelling faintly of McCormick’s spices drifting off the harbor. On humid days, the air was heavy with the sweet, sharp scent of cinnamon and nutmeg, a bizarre, pleasant mask over the city’s harder realities.</w:t>
+        <w:t xml:space="preserve">My factory was a row house on Williams Street, right in the Federal Hill neighborhood of Baltimore. My grandfather, Jim, a career railroad man and Air Force Veteran from WW2, bought the place with a GI loan for three thousand dollars. Jim was a physically large man. 6’2” with a thick frame. Even into his 80s he was hunting and pulling deer out of the woods in West Virginia. Jim would go to sleep at sundown or 7 o’clock. Whichever came first. Then he would be up the next morning at 4:30 a.m. He was a man of incredible routine. He walked or rode the train everywhere. I don’t think he ever actually got a driver’s license.</w:t>
+      </w:r>
+    </w:p>
+    <w:p>
+      <w:pPr>
+        <w:pStyle w:val="BodyText"/>
+      </w:pPr>
+      <w:r>
+        <w:t xml:space="preserve">Today, Federal Hill is gentrified and expensive—a playground of high-end bistros and young professionals. Back then, it was just Baltimore—working-class, gritty, and smelling faintly of McCormick’s spices drifting off the harbor. On humid days, the air was heavy with the sweet, sharp scent of cinnamon and nutmeg, a bizarre, pleasant mask over the city’s harder realities.</w:t>
       </w:r>
     </w:p>
     <w:p>
@@ -506,15 +514,33 @@
         <w:pStyle w:val="BodyText"/>
       </w:pPr>
       <w:r>
-        <w:t xml:space="preserve">Pauline Sutherland was my maternal grandmother. She was a tiny, dark-skinned woman with high cheekbones and thick lips—my mother and I both look like her—and a presence that demanded absolute respect. She suffered no fools and took no bullshit. When you saw her ball up her fist, bite her tongue, and draw in a slow, silent breath, you knew what time it was. Someone was about to get an ass-whipping, and you just prayed it wasn’t you.</w:t>
-      </w:r>
-    </w:p>
-    <w:p>
-      <w:pPr>
-        <w:pStyle w:val="BodyText"/>
-      </w:pPr>
-      <w:r>
-        <w:t xml:space="preserve">She kept that massive house incredibly clean. The kitchen had black and white linoleum tiles, polished until they shone like glass. In the winter, when the old radiators clanked and shivered, the natural gas stove was always left on, its pale blue flames hissing quietly to provide auxiliary heat. It was a house defined by its rules, its cleanliness, and the undeniable gravity of my grandmother.</w:t>
+        <w:t xml:space="preserve">Pauline Sutherland was my maternal grandmother. She was a tiny, dark-skinned woman with high cheekbones and thick lips—my mother and I both look like her—and a presence that demanded absolute respect. She suffered no fools and took no bullshit. When you saw her ball up her fist, bite her tongue, and draw in a slow, silent breath, you knew what time it was. Someone was about to get an ass-whipping, and you just prayed it wasn’t you. I was mostly good but caught the occasional ass-whipping. She had a little plastic chandelier in her living room. I found out the individual ornaments looked like little swords. I sat there throwing a pillow up in the air knocking them off. Needless to say, when she found me it wasn’t an</w:t>
+      </w:r>
+      <w:r>
+        <w:t xml:space="preserve"> </w:t>
+      </w:r>
+      <w:r>
+        <w:t xml:space="preserve">‘oh that’s so sweet,’</w:t>
+      </w:r>
+      <w:r>
+        <w:t xml:space="preserve"> </w:t>
+      </w:r>
+      <w:r>
+        <w:t xml:space="preserve">it was</w:t>
+      </w:r>
+      <w:r>
+        <w:t xml:space="preserve"> </w:t>
+      </w:r>
+      <w:r>
+        <w:t xml:space="preserve">‘I’m gonna beat your little ass!’</w:t>
+      </w:r>
+    </w:p>
+    <w:p>
+      <w:pPr>
+        <w:pStyle w:val="BodyText"/>
+      </w:pPr>
+      <w:r>
+        <w:t xml:space="preserve">She kept that house incredibly clean. The kitchen had black and white linoleum tiles, polished until they shone like glass. In the winter, when the old radiators clanked and shivered, the natural gas stove was always left on, its pale blue flames hissing quietly to provide auxiliary heat. It was a house defined by its rules, its cleanliness, and the undeniable gravity of my grandmother.</w:t>
       </w:r>
     </w:p>
     <w:p>
@@ -530,7 +556,7 @@
         <w:pStyle w:val="BodyText"/>
       </w:pPr>
       <w:r>
-        <w:t xml:space="preserve">My mother was young, and she simply lacked those natural maternal instincts. Our relationship was complicated, mostly because it barely existed. I never felt like she actually wanted to be in my life. When she looked at me, I didn’t see warmth or connection; I saw the cold, flat gaze of a woman who viewed my existence as a mechanical inconvenience she hadn’t planned for.</w:t>
+        <w:t xml:space="preserve">My mother was young, and she simply lacked those natural maternal instincts at that stage of life. Our relationship was complicated, mostly because it barely existed. I never felt like she actually wanted to be in my life. When she looked at me, I didn’t see warmth or connection; I saw the cold, flat gaze of a woman who viewed my existence as a mechanical inconvenience she hadn’t planned for.</w:t>
       </w:r>
     </w:p>
     <w:p>

</xml_diff>

<commit_message>
Update Chapter 3: Added Locke Insulators context, dad's background, and ghetto video store details
</commit_message>
<xml_diff>
--- a/The_Improbability_of_Me_Master_Draft.docx
+++ b/The_Improbability_of_Me_Master_Draft.docx
@@ -768,7 +768,7 @@
         <w:pStyle w:val="FirstParagraph"/>
       </w:pPr>
       <w:r>
-        <w:t xml:space="preserve">Before the Paratrooper, before Johnson Street, and before the knives came out on Greenmount Avenue, there was Audrey Avenue.</w:t>
+        <w:t xml:space="preserve">Before the Paratrooper, before Johnson Street, and before the knife came out on North Avenue, there was Audrey Avenue.</w:t>
       </w:r>
     </w:p>
     <w:p>
@@ -792,7 +792,15 @@
         <w:pStyle w:val="BodyText"/>
       </w:pPr>
       <w:r>
-        <w:t xml:space="preserve">Just like my mother lacked maternal instincts, my dad was young and figuring out the father thing as we went. He did his best, but times were incredibly tough. He was working exhausting double shifts as a heavy diesel mechanic down at a commercial garage near the harbor. He would come home late at night, his steel-toed boots making a heavy, tired thud on the linoleum floor. I remember the smell that followed him into the apartment—a thick, industrial cocktail of carbon soot, WD-40, and old engine oil that had soaked deep into the fabric of his dark blue work shirts. His hands were mapped with black grease that never fully washed out, his fingernails permanently stained with the soot of diesel engines. He was running himself into the ground, trading his physical joints for the cash we needed to survive.</w:t>
+        <w:t xml:space="preserve">Just like my mother lacked maternal instincts, my dad was young and figuring out the father thing as we went. He did his best, but times were incredibly tough. He was working piecemeal work at Locke Insulators. Locke Insulators was probably one of the biggest polluters of the harbor. He used to tell me how they would just throw shit into the harbor. Everybody threw shit into the harbor; it’s almost like that’s what it’s for. It takes shit you no longer want or no longer want to be found. Now, that could be cracked insulators, chemical waste, guns, or bodies. Locke Insulators was adjacent to Cherry Hill; it was an even shittier place.</w:t>
+      </w:r>
+    </w:p>
+    <w:p>
+      <w:pPr>
+        <w:pStyle w:val="BodyText"/>
+      </w:pPr>
+      <w:r>
+        <w:t xml:space="preserve">He would come home late at night, his steel-toed boots making a heavy, tired thud on the floor. He was a kind of skilled laborer, crafting the big industrial insulators you see on electrical distribution lines. My father was actually a fairly intelligent man. He knew those streets, but he took a couple of college classes. He never graduated, but I always remember him having a sharp mind for math. My father has a thick old-school Baltimore City accent. My wife, a native of Detroit, cannot understand him. She’s not sure it’s actually English.</w:t>
       </w:r>
     </w:p>
     <w:p>
@@ -840,7 +848,7 @@
         <w:pStyle w:val="BodyText"/>
       </w:pPr>
       <w:r>
-        <w:t xml:space="preserve">For the most part, the people were nice, bound together by the shared gravity of poverty. There was a lady who worked sanitation—we just called her the garbage lady—who used to comb through the trash on her routes in the wealthier zip codes. Whenever she found toys that people in better neighborhoods had thrown away, she would carefully wash them off, bring them home in her canvas bag, and hand them out to us poor kids on the block. It was a beautiful, small act of kindness in a place that didn’t have much of it to spare.</w:t>
+        <w:t xml:space="preserve">For the most part, the people were nice, bound together by the shared gravity of poverty. There was a lady who worked sanitation—we just called her the garbage lady—who used to comb through the trash on her routes in the wealthier zip codes. Whenever she found toys that people in better neighborhoods had thrown away, she would bring them home in her canvas bag, and hand them out to us poor kids on the block. It was a beautiful, small act of kindness in a place that didn’t have much of it to spare.</w:t>
       </w:r>
     </w:p>
     <w:p>
@@ -912,15 +920,15 @@
         <w:pStyle w:val="BodyText"/>
       </w:pPr>
       <w:r>
-        <w:t xml:space="preserve">I remember one chilly afternoon, Nancy and Sandy’s brother, J.R., decided Misty needed to be punished. I don’t recall exactly what she did—I think she might have left the gas stove on unattended while boiling water. J.R. was absolutely livid. He was a big, blocky dude, and he stood over her screaming while she cowered on the floor, weeping.</w:t>
-      </w:r>
-    </w:p>
-    <w:p>
-      <w:pPr>
-        <w:pStyle w:val="BodyText"/>
-      </w:pPr>
-      <w:r>
-        <w:t xml:space="preserve">J.R. ordered her to bang her own head against the hardwood floor.</w:t>
+        <w:t xml:space="preserve">I remember one chilly afternoon, I was at Nancy’s house. Nancy’s husband ran like a ghetto video store out of his house. He would get movies and tape them and lend them out. I was hanging out with Nancy’s son when Nancy and Sandy’s brother, J.R., decided Misty needed to be punished. I don’t recall exactly what she did—I think she might have left the gas stove on unattended while boiling water. J.R. was absolutely livid. He was a big, blocky dude, and he stood over her screaming while she cowered on the floor, weeping.</w:t>
+      </w:r>
+    </w:p>
+    <w:p>
+      <w:pPr>
+        <w:pStyle w:val="BodyText"/>
+      </w:pPr>
+      <w:r>
+        <w:t xml:space="preserve">J.R. ordered her to bang her own head against the concrete floor.</w:t>
       </w:r>
     </w:p>
     <w:p>

</xml_diff>

<commit_message>
Update Chapter 4: Move Fat Charlie to Johnson Street (Chapter 4) from Chapter 3
</commit_message>
<xml_diff>
--- a/The_Improbability_of_Me_Master_Draft.docx
+++ b/The_Improbability_of_Me_Master_Draft.docx
@@ -864,14 +864,6 @@
         <w:pStyle w:val="BodyText"/>
       </w:pPr>
       <w:r>
-        <w:t xml:space="preserve">And then there was Fat Charlie. Charlie was a local guy in South Baltimore, a huge fat slob who bullied the younger kids. He was not fond of the blacks, which kept a kind of tense, unspoken balance in the neighborhood’s ecosystem. Baltimore has been mostly black for a long time. In many areas of the city, I was the clear minority, and I was routinely targeted, cornered, and jumped purely because of my race. It was a violent, geographic reality. But at least in South Baltimore, because of guys like Fat Charlie and the local pack, there was a boundary. There was a balance.</w:t>
-      </w:r>
-    </w:p>
-    <w:p>
-      <w:pPr>
-        <w:pStyle w:val="BodyText"/>
-      </w:pPr>
-      <w:r>
         <w:t xml:space="preserve">And then there were Nancy and Sandy.</w:t>
       </w:r>
     </w:p>
@@ -1159,6 +1151,14 @@
       </w:pPr>
       <w:r>
         <w:t xml:space="preserve">And then there was Jesse Wright. Jesse lived on the street directly behind my house, and he was a complete dirt ball. He was the kind of gritty, chaotic kid the neighborhood produced in spades—always scheming, always filthy, and entirely unbothered by the threat of getting caught doing whatever he wasn’t supposed to be doing.</w:t>
+      </w:r>
+    </w:p>
+    <w:p>
+      <w:pPr>
+        <w:pStyle w:val="BodyText"/>
+      </w:pPr>
+      <w:r>
+        <w:t xml:space="preserve">And then there was Fat Charlie. Charlie was a local guy in South Baltimore, a huge fat slob who bullied the younger kids. He was not fond of the blacks, which kept a kind of tense, unspoken balance in the neighborhood’s ecosystem. Baltimore has been mostly black for a long time. In many areas of the city, I was the clear minority, and I was routinely targeted, cornered, and jumped purely because of my race. It was a violent, geographic reality. But at least in South Baltimore, because of guys like Fat Charlie and the local pack, there was a boundary. There was a balance.</w:t>
       </w:r>
     </w:p>
     <w:p>

</xml_diff>

<commit_message>
Update Chapter 4: Add Fat Charlie Burger Time and Bruno fight anecdotes
</commit_message>
<xml_diff>
--- a/The_Improbability_of_Me_Master_Draft.docx
+++ b/The_Improbability_of_Me_Master_Draft.docx
@@ -1159,6 +1159,62 @@
       </w:pPr>
       <w:r>
         <w:t xml:space="preserve">And then there was Fat Charlie. Charlie was a local guy in South Baltimore, a huge fat slob who bullied the younger kids. He was not fond of the blacks, which kept a kind of tense, unspoken balance in the neighborhood’s ecosystem. Baltimore has been mostly black for a long time. In many areas of the city, I was the clear minority, and I was routinely targeted, cornered, and jumped purely because of my race. It was a violent, geographic reality. But at least in South Baltimore, because of guys like Fat Charlie and the local pack, there was a boundary. There was a balance.</w:t>
+      </w:r>
+    </w:p>
+    <w:p>
+      <w:pPr>
+        <w:pStyle w:val="BodyText"/>
+      </w:pPr>
+      <w:r>
+        <w:t xml:space="preserve">But that boundary didn’t mean you were safe from the local pack either. Fat Charlie was actually one of the first fights I got into after moving to South Baltimore. He was around seventeen or eighteen, and I was only eleven or twelve. He beat me up outside Woo’s, the local Korean corner store and sub shop. The reason? I beat his high score on the</w:t>
+      </w:r>
+      <w:r>
+        <w:t xml:space="preserve"> </w:t>
+      </w:r>
+      <w:r>
+        <w:rPr>
+          <w:i/>
+          <w:iCs/>
+        </w:rPr>
+        <w:t xml:space="preserve">Burger Time</w:t>
+      </w:r>
+      <w:r>
+        <w:t xml:space="preserve"> </w:t>
+      </w:r>
+      <w:r>
+        <w:t xml:space="preserve">arcade game.</w:t>
+      </w:r>
+    </w:p>
+    <w:p>
+      <w:pPr>
+        <w:pStyle w:val="BodyText"/>
+      </w:pPr>
+      <w:r>
+        <w:t xml:space="preserve">I fought him a second time at the basketball court outside my house. I had just gotten done whipping his cousin Bruno’s ass. That little bitch scrambled off crying, yelling,</w:t>
+      </w:r>
+      <w:r>
+        <w:t xml:space="preserve"> </w:t>
+      </w:r>
+      <w:r>
+        <w:t xml:space="preserve">“I’m going to get my cousin!”</w:t>
+      </w:r>
+      <w:r>
+        <w:t xml:space="preserve"> </w:t>
+      </w:r>
+      <w:r>
+        <w:t xml:space="preserve">I just laughed.</w:t>
+      </w:r>
+      <w:r>
+        <w:t xml:space="preserve"> </w:t>
+      </w:r>
+      <w:r>
+        <w:t xml:space="preserve">“Go get your fat fuck cousin!”</w:t>
+      </w:r>
+      <w:r>
+        <w:t xml:space="preserve"> </w:t>
+      </w:r>
+      <w:r>
+        <w:t xml:space="preserve">I yelled back. Well, he came. By the time Fat Charlie lumbered onto the court, my adrenaline had completely dumped. I felt like a newborn kitten. That was a hard lesson in combat physiology: always remember to control your adrenaline. Charlie threw me down on the concrete, punched me, and then literally bit me on my chest. Who the fuck bites a little kid on the chest? A fucking retarded psycho, that’s who.</w:t>
       </w:r>
     </w:p>
     <w:p>

</xml_diff>

<commit_message>
Update Chapter 4: Inline edits for Mike, Chris, Frank, Eddie, Artie, and Spunky intro
</commit_message>
<xml_diff>
--- a/The_Improbability_of_Me_Master_Draft.docx
+++ b/The_Improbability_of_Me_Master_Draft.docx
@@ -1050,7 +1050,7 @@
         <w:pStyle w:val="BodyText"/>
       </w:pPr>
       <w:r>
-        <w:t xml:space="preserve">Mike was the Paratrooper’s son. Like his father, he was a bit of a brute—thick-necked, solid, and entirely comfortable in the middle of a melee. We didn’t become friends through shared interests or polite introductions; we became friends through a 7th-grade schoolyard scuffle. Mike was supposed to be the tough guy on the playground, a reputation he guarded fiercely. I walked up to him during recess, bypassed the usual chest-thumping posturing, swept his legs out from under him with a rapid, clean sweep, and put him flat on his back in the dirt.</w:t>
+        <w:t xml:space="preserve">Mike was the Paratrooper’s son. Like his father, he was a bit of a brute—thick-necked, solid, and entirely comfortable in the middle of a melee. We didn’t become friends through shared interests or polite introductions; we became friends through a 7th-grade schoolyard scuffle. Mike was supposed to be the tough guy on the playground, a reputation he guarded fiercely. I walked up to him during recess, bypassed the usual chest-thumping posturing, swept his legs out from under him with a rapid, clean sweep, and put him flat on his back in the dirt. We have been friends for almost 40 years, and he still remembers that as a cheap shot and gives me shit to this day.</w:t>
       </w:r>
     </w:p>
     <w:p>
@@ -1080,15 +1080,15 @@
         <w:pStyle w:val="BodyText"/>
       </w:pPr>
       <w:r>
-        <w:t xml:space="preserve">Then there was Chris Smith. He was the one who stood behind me on the stoop in Curtis Bay holding the bayonet during the Jerry Rose standoff. Chris was solid as a brick wall, never raising his voice but never taking a step back either. His mom was a nurse, and his stepdad was a massive stevedore down at the docks named Frank Door.</w:t>
-      </w:r>
-    </w:p>
-    <w:p>
-      <w:pPr>
-        <w:pStyle w:val="BodyText"/>
-      </w:pPr>
-      <w:r>
-        <w:t xml:space="preserve">Frank was a legend in our circle, a hulking man with hands the size of dinner plates and a voice that rattled the windows. We called him</w:t>
+        <w:t xml:space="preserve">Then there was Chris Smith. He was the one who stood behind me on the stoop in Curtis Bay holding the bayonet during the Jerry Rose standoff. Chris was a fat slob and a bit of a pussy and spoiled. His mom was a nurse, and his stepdad was a massive stevedore down at the docks named Frank Door. A stevedore at the Baltimore docks is effectively an organized crime ring. They steal everything and do untold criminal activities. If it comes and goes through the port of Baltimore, these guys get some.</w:t>
+      </w:r>
+    </w:p>
+    <w:p>
+      <w:pPr>
+        <w:pStyle w:val="BodyText"/>
+      </w:pPr>
+      <w:r>
+        <w:t xml:space="preserve">Frank was a legend in our circle, a hulking man with a voice that rattled the windows. We called him</w:t>
       </w:r>
       <w:r>
         <w:t xml:space="preserve"> </w:t>
@@ -1100,7 +1100,7 @@
         <w:t xml:space="preserve"> </w:t>
       </w:r>
       <w:r>
-        <w:t xml:space="preserve">Whenever he got drunk, which was practically every weekend, he would stand up in the middle of the living room, point a thick, calloused finger at the ceiling, and start fiercely preaching fire-and-brimstone sermons to whoever was in the room, sweating through his tank top. Frank was also the man who gave me my moniker. After the incident on North Avenue—where the locking mechanism on my Buck folding knife failed and I ended up burying the collapsed blade into my attacker’s chest—Frank caught wind of the story. From that day forward, he refused to call me Michael.</w:t>
+        <w:t xml:space="preserve">Whenever he got drunk, which was practically every day, he would stand up in the middle of the living room on Light Street and start fiercely preaching fire-and-brimstone sermons to whoever was in the room, sweating through his tank top. Now, these weren’t ordinary sermons; they were usually about the fucking blacks or whoever he felt wronged him that day. Frank was also the man who gave me my moniker. After the incident on North Avenue—where the locking mechanism on my Buck folding knife failed and I ended up burying the collapsed blade into my attacker’s chest—Frank caught wind of the story. From that day forward, he refused to call me Michael.</w:t>
       </w:r>
     </w:p>
     <w:p>
@@ -1134,15 +1134,15 @@
         <w:pStyle w:val="BodyText"/>
       </w:pPr>
       <w:r>
-        <w:t xml:space="preserve">We had Eddie Arron, a good guy whose family was just as poor as ours, but his dad had a relentless, exhausting hustle, running a tiny, cramped corner store that sold stale bread, single cigarettes, and cheap soda to keep the lights on.</w:t>
-      </w:r>
-    </w:p>
-    <w:p>
-      <w:pPr>
-        <w:pStyle w:val="BodyText"/>
-      </w:pPr>
-      <w:r>
-        <w:t xml:space="preserve">We had Artie Buckalew. Artie was probably the poorest kid in our entire group, wearing the same faded, oil-stained t-shirt for days on end, but you wouldn’t know it from hanging out with him. He was a hilarious, fiercely loyal, good-hearted dude who spoke with a weird, thick speech impediment—a mushy, rapid-fire South Baltimore drawl that captured the perfect, old-school working-class sound of the neighborhood.</w:t>
+        <w:t xml:space="preserve">We had Eddie Arron, a good guy whose family was just as poor as ours, but his dad had a relentless, exhausting hustle, running a tiny, cramped corner store that sold stale bread, single cigarettes, and cheap soda to keep the lights on. Eddie also had some kind of bone deformity that made bones grow out of his joints at weird angles.</w:t>
+      </w:r>
+    </w:p>
+    <w:p>
+      <w:pPr>
+        <w:pStyle w:val="BodyText"/>
+      </w:pPr>
+      <w:r>
+        <w:t xml:space="preserve">We had Artie Buckalew. Artie was probably the poorest kid in our entire group, wearing the same faded, oil-stained t-shirt for days on end, but you wouldn’t know it from hanging out with him. He was a hilarious, fiercely loyal, good-hearted dude who spoke with a weird, thick speech impediment—a mushy, rapid-fire South Baltimore drawl that captured the perfect, old-school working-class sound of the neighborhood. He had a heated rivalry with Hammonds for a reason no one could remember. It might be due to Hammonds finding and smashing an old discarded guitar over his head.</w:t>
       </w:r>
     </w:p>
     <w:p>
@@ -1230,7 +1230,7 @@
         <w:pStyle w:val="BodyText"/>
       </w:pPr>
       <w:r>
-        <w:t xml:space="preserve">Spunky was intellectually disabled, but you never, under any circumstances, brought that up around him. In fact, Spunky possessed a strange, highly aggressive hatred for other mentally disabled people, viewing them as a personal insult. He also possessed a terrifying, freakish amount of physical strength and absolutely zero impulse control. Once, Spunky got into a petty dispute with a local family called the McFarlands. It started when the McFarland little brother, a mouthy twelve-year-old, threw a handful of wet dirt at Spunky’s back.</w:t>
+        <w:t xml:space="preserve">Spunky was intellectually disabled—he was retarded, but you never, under any circumstances, brought that up around him. In fact, Spunky possessed a strange, highly aggressive hatred for other mentally disabled people, viewing them as a personal insult. He also possessed a terrifying, freakish amount of physical strength and absolutely zero impulse control. Once, Spunky got into a petty dispute with a local family called the McFarlands. It started when the McFarland little brother, a mouthy twelve-year-old, threw a handful of wet dirt at Spunky’s back.</w:t>
       </w:r>
     </w:p>
     <w:p>

</xml_diff>

<commit_message>
Update Chapter 3: Add Timmy Heberle motorcycle crash and suicide story
</commit_message>
<xml_diff>
--- a/The_Improbability_of_Me_Master_Draft.docx
+++ b/The_Improbability_of_Me_Master_Draft.docx
@@ -856,7 +856,23 @@
         <w:pStyle w:val="BodyText"/>
       </w:pPr>
       <w:r>
-        <w:t xml:space="preserve">Then there were the Heberles. They were poor, but they were good, solid people. The older brother knew karate, carried himself with a quiet, lethal confidence, and stood like a sentinel on the block. The younger brother, Tim, was my age. Tim was way behind academically, struggling with severe learning disabilities that the neighborhood schools simply weren’t equipped to handle, but we hung out anyway, throwing rocks at train cars and navigating the broken pavement.</w:t>
+        <w:t xml:space="preserve">Then there were the Heberles. They were poor, but they were good, solid people. The older brother, Timmy, knew karate. He carried himself with a quiet, lethal confidence and stood like a sentinel on the block. The younger brother, John, was my age. John was way behind academically, struggling with severe learning disabilities that the neighborhood schools simply weren’t equipped to handle, but we hung out anyway, throwing rocks at train cars and navigating the broken pavement.</w:t>
+      </w:r>
+    </w:p>
+    <w:p>
+      <w:pPr>
+        <w:pStyle w:val="BodyText"/>
+      </w:pPr>
+      <w:r>
+        <w:t xml:space="preserve">Timmy had taken an interest in me and decided he was going to teach me how to use nunchucks. I was obsessed with the idea. I scraped together some money, walked down to the local hardware store, and bought a wooden dowel so we could build a pair. My dad picked me up on his motorcycle, and I hopped on the back, clutching that dowel. We were driving home when some bitch wasn’t paying attention and ran us completely over. We went down hard on the asphalt.</w:t>
+      </w:r>
+    </w:p>
+    <w:p>
+      <w:pPr>
+        <w:pStyle w:val="BodyText"/>
+      </w:pPr>
+      <w:r>
+        <w:t xml:space="preserve">I survived the crash, but the real tragedy hit a week later. Out of nowhere, Timmy shot himself. Just like that, the sentinel of the block was gone. It was a fast, brutal lesson in how quickly things could be violently taken away from you in that environment.</w:t>
       </w:r>
     </w:p>
     <w:p>

</xml_diff>

<commit_message>
Update Chapter 3: Add devastating details to Timmy's suicide and John's fire
</commit_message>
<xml_diff>
--- a/The_Improbability_of_Me_Master_Draft.docx
+++ b/The_Improbability_of_Me_Master_Draft.docx
@@ -872,7 +872,15 @@
         <w:pStyle w:val="BodyText"/>
       </w:pPr>
       <w:r>
-        <w:t xml:space="preserve">I survived the crash, but the real tragedy hit a week later. Out of nowhere, Timmy shot himself. Just like that, the sentinel of the block was gone. It was a fast, brutal lesson in how quickly things could be violently taken away from you in that environment.</w:t>
+        <w:t xml:space="preserve">I survived the crash, but the real tragedy hit a week later. Timmy shot himself. The truth was, he was gay, and in that neighborhood, in that era, he just couldn’t deal with the reality of it. The pressure broke him. I remember seeing the blood and the splatter left behind. To this day, it absolutely tears me up to think about it. Just like that, the sentinel of the block was gone.</w:t>
+      </w:r>
+    </w:p>
+    <w:p>
+      <w:pPr>
+        <w:pStyle w:val="BodyText"/>
+      </w:pPr>
+      <w:r>
+        <w:t xml:space="preserve">The trauma rippled right through the remaining family. A few days after the suicide, John, completely unmoored by the loss of his brother, caught their house on fire. It was a fast, brutal lesson in how quickly things could be violently taken away from you in that environment, and how destruction breeds destruction.</w:t>
       </w:r>
     </w:p>
     <w:p>

</xml_diff>

<commit_message>
Update Chapter 2: Insert mother's funeral anecdote about intelligence vs bloodline
</commit_message>
<xml_diff>
--- a/The_Improbability_of_Me_Master_Draft.docx
+++ b/The_Improbability_of_Me_Master_Draft.docx
@@ -557,6 +557,14 @@
       </w:pPr>
       <w:r>
         <w:t xml:space="preserve">My mother was young, and she simply lacked those natural maternal instincts at that stage of life. Our relationship was complicated, mostly because it barely existed. I never felt like she actually wanted to be in my life. When she looked at me, I didn’t see warmth or connection; I saw the cold, flat gaze of a woman who viewed my existence as a mechanical inconvenience she hadn’t planned for.</w:t>
+      </w:r>
+    </w:p>
+    <w:p>
+      <w:pPr>
+        <w:pStyle w:val="BodyText"/>
+      </w:pPr>
+      <w:r>
+        <w:t xml:space="preserve">Years later, at my mother’s funeral, the stark reality of my bloodline was put into sharp focus. My aunt’s boyfriend—a guy who knew both my mother and my father back in the day—was introducing me to some people at the service. He was talking about what I had accomplished and how smart I was. He paused, looked at me, and then told them point-blank that he had absolutely no idea where my intelligence came from, considering who my parents were. He wasn’t trying to be cruel; he was just stating a mathematical fact. The inputs didn’t match the outputs.</w:t>
       </w:r>
     </w:p>
     <w:p>

</xml_diff>

<commit_message>
Update Chapter 2: Expand on mother's drinking, pancreatic cancer, and lack of good memories
</commit_message>
<xml_diff>
--- a/The_Improbability_of_Me_Master_Draft.docx
+++ b/The_Improbability_of_Me_Master_Draft.docx
@@ -556,15 +556,23 @@
         <w:pStyle w:val="BodyText"/>
       </w:pPr>
       <w:r>
-        <w:t xml:space="preserve">My mother was young, and she simply lacked those natural maternal instincts at that stage of life. Our relationship was complicated, mostly because it barely existed. I never felt like she actually wanted to be in my life. When she looked at me, I didn’t see warmth or connection; I saw the cold, flat gaze of a woman who viewed my existence as a mechanical inconvenience she hadn’t planned for.</w:t>
-      </w:r>
-    </w:p>
-    <w:p>
-      <w:pPr>
-        <w:pStyle w:val="BodyText"/>
-      </w:pPr>
-      <w:r>
-        <w:t xml:space="preserve">Years later, at my mother’s funeral, the stark reality of my bloodline was put into sharp focus. My aunt’s boyfriend—a guy who knew both my mother and my father back in the day—was introducing me to some people at the service. He was talking about what I had accomplished and how smart I was. He paused, looked at me, and then told them point-blank that he had absolutely no idea where my intelligence came from, considering who my parents were. He wasn’t trying to be cruel; he was just stating a mathematical fact. The inputs didn’t match the outputs.</w:t>
+        <w:t xml:space="preserve">My mother was young, and she simply lacked those natural maternal instincts at that stage of life. Our relationship was complicated, mostly because it barely existed. She was a drinker. I rarely saw her; she was almost always in the bars. She would play the part of a loving mother to the outside world and talk fondly of me, but in reality, her actions never backed it up. She was a shadow in my life from childhood on. I never felt like she actually wanted to be there. When she looked at me, I didn’t see warmth or connection; I saw the cold, flat gaze of a woman who viewed my existence as a mechanical inconvenience she hadn’t planned for.</w:t>
+      </w:r>
+    </w:p>
+    <w:p>
+      <w:pPr>
+        <w:pStyle w:val="BodyText"/>
+      </w:pPr>
+      <w:r>
+        <w:t xml:space="preserve">Years later, my mother died of pancreatic cancer. It ate her away to absolutely nothing. Seeing her at the end of her life was a massive gut punch. After all, she was my mother. She gave me life. She sucked at parenting, but whatever. Seeing her in those final days gave me an unimaginable amount of pain. I got all the pain of watching her die, without any of the good memories to balance it out. How fucked up is that?</w:t>
+      </w:r>
+    </w:p>
+    <w:p>
+      <w:pPr>
+        <w:pStyle w:val="BodyText"/>
+      </w:pPr>
+      <w:r>
+        <w:t xml:space="preserve">It was at her funeral that the stark reality of my bloodline was put into sharp focus. My aunt’s boyfriend—a guy who knew both my mother and my father back in the day—was introducing me to some people at the service. He was talking about what I had accomplished and how smart I was. He paused, looked at me, and then told them point-blank that he had absolutely no idea where my intelligence came from, considering who my parents were. He wasn’t trying to be cruel; he was just stating a mathematical fact. The inputs didn’t match the outputs.</w:t>
       </w:r>
     </w:p>
     <w:p>

</xml_diff>

<commit_message>
Update Chapter 4: Rewrite Spunky story based on true events (Patrick Retzrick, shoe box, dropping the McFarlands)
</commit_message>
<xml_diff>
--- a/The_Improbability_of_Me_Master_Draft.docx
+++ b/The_Improbability_of_Me_Master_Draft.docx
@@ -1270,49 +1270,39 @@
         <w:pStyle w:val="BodyText"/>
       </w:pPr>
       <w:r>
-        <w:t xml:space="preserve">Spunky was intellectually disabled—he was retarded, but you never, under any circumstances, brought that up around him. In fact, Spunky possessed a strange, highly aggressive hatred for other mentally disabled people, viewing them as a personal insult. He also possessed a terrifying, freakish amount of physical strength and absolutely zero impulse control. Once, Spunky got into a petty dispute with a local family called the McFarlands. It started when the McFarland little brother, a mouthy twelve-year-old, threw a handful of wet dirt at Spunky’s back.</w:t>
-      </w:r>
-    </w:p>
-    <w:p>
-      <w:pPr>
-        <w:pStyle w:val="BodyText"/>
-      </w:pPr>
-      <w:r>
-        <w:t xml:space="preserve">It didn’t end with a shouting match. In a single afternoon, Spunky conducted a systematic campaign of domestic destruction.</w:t>
-      </w:r>
-    </w:p>
-    <w:p>
-      <w:pPr>
-        <w:pStyle w:val="BodyText"/>
-      </w:pPr>
-      <w:r>
-        <w:t xml:space="preserve">First, he walked down Williams Street, found the McFarland little brother sitting on a concrete stoop, and laid him out cold with a single, massive hammerfist to the crown of his skull. With the first node neutralized, Spunky marched three blocks down to the local corner grocery where the older McFarland brother, an eighteen-year-old high school drop-out, was working the register. Spunky burst through the screen door, grabbed the older brother by the throat, dragged him bodily over the counter and out onto the pavement, and beat him until his face was unrecognizable.</w:t>
-      </w:r>
-    </w:p>
-    <w:p>
-      <w:pPr>
-        <w:pStyle w:val="BodyText"/>
-      </w:pPr>
-      <w:r>
-        <w:t xml:space="preserve">Finally, Spunky sat on the hood of a parked car outside the McFarland rowhouse, calmly waiting for the father to return from his shift at the shipyards. The moment the father stepped out of his Ford F-150, lunchbox in hand, Spunky sprinted across the asphalt and leveled him with a flying tackle, systematically breaking the man’s collarbone on the curb. Spunky dismantled an entire family tree before the sun went down, entirely because his brain lacked the standard regulatory block that translates</w:t>
-      </w:r>
-      <w:r>
-        <w:t xml:space="preserve"> </w:t>
-      </w:r>
-      <w:r>
-        <w:t xml:space="preserve">“consequence”</w:t>
-      </w:r>
-      <w:r>
-        <w:t xml:space="preserve"> </w:t>
-      </w:r>
-      <w:r>
-        <w:t xml:space="preserve">into</w:t>
-      </w:r>
-      <w:r>
-        <w:t xml:space="preserve"> </w:t>
-      </w:r>
-      <w:r>
-        <w:t xml:space="preserve">“hesitation.”</w:t>
+        <w:t xml:space="preserve">Spunky’s real name was Patrick Retzrick. His parents called him Spunky because he was born really premature. They said he was so small they brought him home in a shoe box, and though the doctors thought he was going to die, he survived. One of them remarked he had a lot of spunk! Thus, Spunky! Again, probably a result of all the chemicals in the area. He was intellectually disabled—he was retarded, but you never, under any circumstances, brought that up around him. He was a bit of a wrecking ball. He was on the shorter side, but he had that retard strength.</w:t>
+      </w:r>
+    </w:p>
+    <w:p>
+      <w:pPr>
+        <w:pStyle w:val="BodyText"/>
+      </w:pPr>
+      <w:r>
+        <w:t xml:space="preserve">One day, we were hanging out on the front stoop of Spunk’s house. Spunk was minding his own business when the younger McFarland boy, his neighbor, came over and started shit with him. Spunk, being retarded, didn’t really have any conflict resolution skills outside of punching the opposing side in the fucking mouth. So Spunk—as I would envision a retarded version of the great debater Socrates would do—just hauled off and smashed the younger McFarland, folding him like a fourth-grade love letter.</w:t>
+      </w:r>
+    </w:p>
+    <w:p>
+      <w:pPr>
+        <w:pStyle w:val="BodyText"/>
+      </w:pPr>
+      <w:r>
+        <w:t xml:space="preserve">Well, when the boy got his shit together, he went in his house and got his older brother. Now, this is something that might be an uncommon practice now, but I still teach my kids: if someone fucks with your brother—and I don’t care if it’s a toddler, an old lady, a retard, a cripple, or whatever—you better beat that ass. This is our culture. Unfortunately, the older McFarland didn’t have a lot to give, but he knew his dad would beat his ass worse if he didn’t try.</w:t>
+      </w:r>
+    </w:p>
+    <w:p>
+      <w:pPr>
+        <w:pStyle w:val="BodyText"/>
+      </w:pPr>
+      <w:r>
+        <w:t xml:space="preserve">He came out running and threw a punch that hit Spunk but hardly registered. It basically acted as the trigger for Spunk to re-engage. Spunk, in his primitive mind, saw the new McFarland target, grabbed him, and started wailing on him. He was yelling and screaming, and the commotion brought the McFarland father running out of the house. The dad grabbed Spunk. Spunk turned and landed a wild-ass haymaker right to his jaw.</w:t>
+      </w:r>
+    </w:p>
+    <w:p>
+      <w:pPr>
+        <w:pStyle w:val="BodyText"/>
+      </w:pPr>
+      <w:r>
+        <w:t xml:space="preserve">Here is something I learned: always look at the back. If the opposition has a wide, strong back, their punch is definitely going to do damage. Spunk was a fat fuck, but he had a strong back. Strong back, weak mind. When Spunk connected with that wild-ass swing, bodies hit the floor. The progenitor of the McFarland family was no different. He dropped. In the course of minutes, Spunk put down the whole bloodline in an epic ass-whipping session.</w:t>
       </w:r>
     </w:p>
     <w:p>

</xml_diff>

<commit_message>
Update Chapter 4: Rewrite Big Ed story to include the true incidents of his cowardice, smashed teeth, and fearless thievery
</commit_message>
<xml_diff>
--- a/The_Improbability_of_Me_Master_Draft.docx
+++ b/The_Improbability_of_Me_Master_Draft.docx
@@ -1330,81 +1330,55 @@
         <w:t xml:space="preserve"> </w:t>
       </w:r>
       <w:r>
-        <w:t xml:space="preserve">due to his massive skull, went to high school with me at the prestigious Baltimore City College High School. Ed was a dreamer. He talked a massive game on the street corners, boasting about the street fights he would start and the crews he would run, but in reality, he was a coward. He would fold the absolute second the physical pressure was turned on, his face going pale and his eyes watering.</w:t>
-      </w:r>
-    </w:p>
-    <w:p>
-      <w:pPr>
-        <w:pStyle w:val="BodyText"/>
-      </w:pPr>
-      <w:r>
-        <w:t xml:space="preserve">But his cowardice wasn’t his tragedy. His tragedy was his brain.</w:t>
-      </w:r>
-    </w:p>
-    <w:p>
-      <w:pPr>
-        <w:pStyle w:val="BodyText"/>
-      </w:pPr>
-      <w:r>
-        <w:t xml:space="preserve">Big Ed had a brilliant, staggering mathematical mind. To this day, I believe he was actually smarter than I am in terms of raw computational speed. His raw processing power was breathtaking. I remember we were sitting in an advanced algebra class at City College. The teacher, an old, tired man named Mr. Harrison, had written a complex, multi-variable equation on the board that spanned three panels. The class was silent, defeated.</w:t>
-      </w:r>
-    </w:p>
-    <w:p>
-      <w:pPr>
-        <w:pStyle w:val="BodyText"/>
-      </w:pPr>
-      <w:r>
-        <w:t xml:space="preserve">Big Ed didn’t even pick up his pencil. He just stared at the board for three seconds, his jaw slack, and calmly blurted out the correct, simplified answer. Mr. Harrison stopped, stared at Ed, and dropped his chalk.</w:t>
-      </w:r>
-      <w:r>
-        <w:t xml:space="preserve"> </w:t>
-      </w:r>
-      <w:r>
-        <w:t xml:space="preserve">“How did you do that, Edward?”</w:t>
-      </w:r>
-      <w:r>
-        <w:t xml:space="preserve"> </w:t>
-      </w:r>
-      <w:r>
-        <w:t xml:space="preserve">he asked, completely speechless. Ed shrugged.</w:t>
-      </w:r>
-      <w:r>
-        <w:t xml:space="preserve"> </w:t>
-      </w:r>
-      <w:r>
-        <w:t xml:space="preserve">“The numbers just line up, Mr. Harrison. It’s just a balance.”</w:t>
-      </w:r>
-    </w:p>
-    <w:p>
-      <w:pPr>
-        <w:pStyle w:val="BodyText"/>
-      </w:pPr>
-      <w:r>
-        <w:t xml:space="preserve">He was a mathematical savant. But he lacked the drive, the execution, and the structural discipline to apply it to anything meaningful. Raw capacity without execution is just noise.</w:t>
-      </w:r>
-    </w:p>
-    <w:p>
-      <w:pPr>
-        <w:pStyle w:val="BodyText"/>
-      </w:pPr>
-      <w:r>
-        <w:t xml:space="preserve">One afternoon after school, three street kids from a rival block cornered us in an alley near the bus stop. They wanted our jackets and our cash. I immediately reached into my pocket, my fingers wrapping around my pen, my mind aligning the angles of escape and violence. Big Ed, the mathematical genius who could calculate complex equations in his head, completely dissolved. His hands shook violently, his voice cracked as he pleaded with them, and he literally fell to his knees in the dirt, entirely paralyzed by the threat. I had to step in, deliver a hard, sudden strike to the lead kid’s throat, and drag Ed’s weeping, 220-pound frame out of the alley.</w:t>
-      </w:r>
-    </w:p>
-    <w:p>
-      <w:pPr>
-        <w:pStyle w:val="BodyText"/>
-      </w:pPr>
-      <w:r>
-        <w:t xml:space="preserve">Ed let the environment dictate his trajectory instead of engineering his own way out. He had the CPU, but he lacked the power supply and the operating system.</w:t>
-      </w:r>
-    </w:p>
-    <w:p>
-      <w:pPr>
-        <w:pStyle w:val="BodyText"/>
-      </w:pPr>
-      <w:r>
-        <w:t xml:space="preserve">Today, while I secure global corporate infrastructure and consult on national cybersecurity, Big Ed works as a deli clerk, slicing lunch meat at a grocery store in Baltimore. Tremendous, staggering wasted potential. A brilliant processing engine reduced to measuring ounces of bologna.</w:t>
+        <w:t xml:space="preserve">due to his massive skull, went to high school with me at the prestigious Baltimore City College High School. Ed probably would’ve been a school shooter, but he was too much of a pussy. He constantly tried to craft an image as a badass, but we all knew him. He was a bitch. He was a heavy-set dude, probably around 5’10”, and he completely folded the absolute second physical pressure was turned on.</w:t>
+      </w:r>
+    </w:p>
+    <w:p>
+      <w:pPr>
+        <w:pStyle w:val="BodyText"/>
+      </w:pPr>
+      <w:r>
+        <w:t xml:space="preserve">Ed left his own brother to get beat up at the ’84 Rec center, and I had to go get him. Ed abandoned me on Greenmount Avenue when I had to stab a dude in the neck with a pen. Ed wouldn’t even get off the bus when three guys wanted to fight; my boy Rob Croft had to have my back instead.</w:t>
+      </w:r>
+    </w:p>
+    <w:p>
+      <w:pPr>
+        <w:pStyle w:val="BodyText"/>
+      </w:pPr>
+      <w:r>
+        <w:t xml:space="preserve">He lost all of his teeth one summer when we were playing wall ball at the abandoned warehouse down the street. Spunky had this big-ass wooden bat. He swung, and the bat slipped out of his hands. It flew over and hit Ed right in the mouth, just destroying all of his teeth. His family didn’t have insurance, so after a trip to the emergency room, he just carried on with a mouth full of fucking smashed teeth. I don’t think he ever got them fixed to this day. Now, getting hit in the face with a bat made Ed think he was a badass, but there was a sharp dichotomy: he was still a pussy at heart. He couldn’t fight, and he didn’t have the heart for it.</w:t>
+      </w:r>
+    </w:p>
+    <w:p>
+      <w:pPr>
+        <w:pStyle w:val="BodyText"/>
+      </w:pPr>
+      <w:r>
+        <w:t xml:space="preserve">But there was one area where Ed was absolutely fearless: stealing.</w:t>
+      </w:r>
+    </w:p>
+    <w:p>
+      <w:pPr>
+        <w:pStyle w:val="BodyText"/>
+      </w:pPr>
+      <w:r>
+        <w:t xml:space="preserve">Ed was a prolific thief. When Eddie Aaron got his driver’s license, we would get in his beat-up ass car and go to the Marley Station mall, where Ed would steal everything not nailed down. He was a coward in a fight, but a fearless thief. This motherfucker once stole an entire hockey stick by putting it down his shirt and threading it all the way down through his pant leg, then proceeded to walk out of the mall all stiff-legged like he had a crippling disorder.</w:t>
+      </w:r>
+    </w:p>
+    <w:p>
+      <w:pPr>
+        <w:pStyle w:val="BodyText"/>
+      </w:pPr>
+      <w:r>
+        <w:t xml:space="preserve">His tragedy was his brain. Ed had a staggering mathematical mind—exceptionally smart—but he was completely crippled by a total lack of emotional intelligence and drive. He was a weird fuck. He had the raw CPU, but he lacked the power supply, the operating system, and the heart.</w:t>
+      </w:r>
+    </w:p>
+    <w:p>
+      <w:pPr>
+        <w:pStyle w:val="BodyText"/>
+      </w:pPr>
+      <w:r>
+        <w:t xml:space="preserve">Today, while I secure global corporate infrastructure and consult on national cybersecurity, Big Ed became a lunch meat slicer at a couple of grocery stores in Baltimore. Tremendous, staggering wasted potential. A brilliant processing engine reduced to measuring ounces of bologna.</w:t>
       </w:r>
     </w:p>
     <w:p>

</xml_diff>

<commit_message>
Update Chapter 4: Add Stoop stories (Kirby house raids, random lady asking about her liver, Friday night fights)
</commit_message>
<xml_diff>
--- a/The_Improbability_of_Me_Master_Draft.docx
+++ b/The_Improbability_of_Me_Master_Draft.docx
@@ -1167,6 +1167,30 @@
       </w:r>
       <w:r>
         <w:t xml:space="preserve">“Make way for the Blade! The boy who don’t wait for the law!”</w:t>
+      </w:r>
+    </w:p>
+    <w:p>
+      <w:pPr>
+        <w:pStyle w:val="BodyText"/>
+      </w:pPr>
+      <w:r>
+        <w:t xml:space="preserve">We spent a lot of time sitting on Light Street on Chris’s front stoop, just watching what was going on. That stoop was our theater, and we saw some wild shit. Up the street, there was a little corner store owned by an old man that was a neighborhood staple. Directly across from it was Woo’s sub shop, where I would catch the bus for school. Across from the corner store was the Light House bar, and across from that was an old man bar whose name I forget. We saw countless fights between drunks pouring out of those bars. It was our version of Friday night fights.</w:t>
+      </w:r>
+    </w:p>
+    <w:p>
+      <w:pPr>
+        <w:pStyle w:val="BodyText"/>
+      </w:pPr>
+      <w:r>
+        <w:t xml:space="preserve">From that stoop, we would watch the goings-on at the Kirby house directly across the street from Chris’s place. Catfish Kirby lived there. The house would get raided by the police, and it would look like something straight out of a movie. The cops would rush in through the front door, and a split second later, you’d see Catfish throw himself out the second-floor window trying to escape. He almost never got away; they always get you. That same house sat there for years with absolutely no electricity. It was a crackhouse, but I’d say it was a crackhouse for a slightly higher caliber of crackhead.</w:t>
+      </w:r>
+    </w:p>
+    <w:p>
+      <w:pPr>
+        <w:pStyle w:val="BodyText"/>
+      </w:pPr>
+      <w:r>
+        <w:t xml:space="preserve">We saw all types of drunks and weirdos come down Light Street. Once, some random Black lady rolled up to the stoop and asked me if she could live with just one liver. She was obviously not right in the head, and I assumed the medical system had completely failed her. Some doctor probably told this crazy lady something was wrong with her that she couldn’t possibly understand, so she figured she would just ask a random white child for medical advice. I told her that she only had one liver, but she did have two kidneys. I told her she could live with one kidney, though. She was really glad to hear this, thanked me, and continued on her way down the block.</w:t>
       </w:r>
     </w:p>
     <w:p>

</xml_diff>

<commit_message>
Update Chapter 9: Remove fabricated tech school story and stick to the facts
</commit_message>
<xml_diff>
--- a/The_Improbability_of_Me_Master_Draft.docx
+++ b/The_Improbability_of_Me_Master_Draft.docx
@@ -3892,185 +3892,55 @@
         <w:pStyle w:val="BodyText"/>
       </w:pPr>
       <w:r>
-        <w:t xml:space="preserve">After boot camp, they sent me to Sheppard Air Force Base in Wichita Falls, Texas, for technical school. Wichita Falls was a flat, dusty, windswept expanse of asphalt and baking concrete, where the Texas heat rose off the runways in dizzying waves that smelled faintly of scorched grass and jet exhaust.</w:t>
-      </w:r>
-    </w:p>
-    <w:p>
-      <w:pPr>
-        <w:pStyle w:val="BodyText"/>
-      </w:pPr>
-      <w:r>
-        <w:t xml:space="preserve">I was enrolled in the training pipeline for the 2A6X6 specialty: Aerospace Electrical and Environmental Systems. For most recruits, this pipeline was a notorious meatgrinder designed to wash out anyone who couldn’t handle advanced logic and physics. It was six straight months of grueling, high-pressure instruction—a relentless barrage of electrical theory, solid-state electronics, AC/DC power generation, cabin pressurization dynamics, and the intricate troubleshooting of complex aircraft systems.</w:t>
-      </w:r>
-    </w:p>
-    <w:p>
-      <w:pPr>
-        <w:pStyle w:val="BodyText"/>
-      </w:pPr>
-      <w:r>
-        <w:t xml:space="preserve">For the average recruit, it was a nightmare. They would sit in the cold, fluorescent-lit classrooms, staring blankly at three-foot-wide, multi-folded technical schematics—known in the military as Technical Orders, or T.O.s. These blueprints were massive, dizzying webs of lines representing thousands of feet of wiring, cascading relays, logic gates, microswitches, and circuit breakers. To them, it was an alien language of pure noise. They would try to memorize the paths by rote, their eyes glazing over as they got lost in the labyrinth of copper and silicon.</w:t>
-      </w:r>
-    </w:p>
-    <w:p>
-      <w:pPr>
-        <w:pStyle w:val="BodyText"/>
-      </w:pPr>
-      <w:r>
-        <w:t xml:space="preserve">But to me, those schematics were beautiful. They were an absolute revelation.</w:t>
-      </w:r>
-    </w:p>
-    <w:p>
-      <w:pPr>
-        <w:pStyle w:val="BodyText"/>
-      </w:pPr>
-      <w:r>
-        <w:t xml:space="preserve">It was the first time in my life I realized that my brain ran on a different clock speed than the people around me. My raw cognitive processing power, which had spent years scanning alleyways and street corners for threats, was suddenly directed at a static, logical architecture.</w:t>
-      </w:r>
-    </w:p>
-    <w:p>
-      <w:pPr>
-        <w:pStyle w:val="BodyText"/>
-      </w:pPr>
-      <w:r>
-        <w:t xml:space="preserve">I didn’t try to memorize the schematics. I downloaded them.</w:t>
-      </w:r>
-    </w:p>
-    <w:p>
-      <w:pPr>
-        <w:pStyle w:val="BodyText"/>
-      </w:pPr>
-      <w:r>
-        <w:t xml:space="preserve">I would spend my evenings sitting at a long, scarred oak desk in the study hall, long after the mandatory hours had ended. While the other guys in the barracks were sneaking out to buy cheap pitchers of Shiner Bock or throwing dice in the laundry room, I was hunched over the T.O.s under the hum of a single desk lamp. The air smelled of hot solder, ozone from the training mock-ups, and the crisp, vanilla scent of old paper manuals.</w:t>
-      </w:r>
-    </w:p>
-    <w:p>
-      <w:pPr>
-        <w:pStyle w:val="BodyText"/>
-      </w:pPr>
-      <w:r>
-        <w:t xml:space="preserve">I would trace the electrical current with a yellow highlighter. I could see the voltage in my head, moving like liquid light through the pages. I watched it enter a generator control unit, pass through a series of steering diodes, activate a magnetic coil in a line contactor, and propagate down the main bus to close a landing gear safety switch. It was an elegant, flawless sequence of logic.</w:t>
-      </w:r>
-    </w:p>
-    <w:p>
-      <w:pPr>
-        <w:pStyle w:val="BodyText"/>
-      </w:pPr>
-      <w:r>
-        <w:t xml:space="preserve">It felt exactly like sitting on the cool hardwood floor of the Williams Street living room, reading about thermodynamics in Pauline’s black-leather encyclopedias while the gas stove hissed in the kitchen. The only difference was that this encyclopedia was alive. It was the nervous system of an F-15 Eagle or a C-130 Hercules.</w:t>
-      </w:r>
-    </w:p>
-    <w:p>
-      <w:pPr>
-        <w:pStyle w:val="BodyText"/>
-      </w:pPr>
-      <w:r>
-        <w:t xml:space="preserve">And I loved the absolute truth of it.</w:t>
-      </w:r>
-    </w:p>
-    <w:p>
-      <w:pPr>
-        <w:pStyle w:val="BodyText"/>
-      </w:pPr>
-      <w:r>
-        <w:t xml:space="preserve">On the streets of Baltimore, everything was volatile. A word could mean a fight, a look could get you shot, and the rules changed depending on who was standing on the corner. But a schematic had no ego. A wiring diagram didn’t lie, and it didn’t have bad days. It ran on pure, uncompromising physics. If an input went into a logic gate, the output was mathematically guaranteed. If a system failed, it wasn’t because it hated you or because it was having an emotional breakdown; it failed because a component had exceeded its design tolerances. There was an error. You could isolate the error, analyze the logic, and fix the system.</w:t>
-      </w:r>
-    </w:p>
-    <w:p>
-      <w:pPr>
-        <w:pStyle w:val="BodyText"/>
-      </w:pPr>
-      <w:r>
-        <w:t xml:space="preserve">Troubleshooting became my art form. The instructors would wire complex</w:t>
-      </w:r>
-      <w:r>
-        <w:t xml:space="preserve"> </w:t>
-      </w:r>
-      <w:r>
-        <w:t xml:space="preserve">“bugs”</w:t>
-      </w:r>
-      <w:r>
-        <w:t xml:space="preserve"> </w:t>
-      </w:r>
-      <w:r>
-        <w:t xml:space="preserve">into the training mock-ups—cutting a wire inside a hidden bundle, burning out a subtle diode, or sticking a tiny piece of paper inside a relay contact to prevent it from closing. The other students would spend hours randomly poking at the boards with multimeters, guessing, sweating, and failing the block.</w:t>
-      </w:r>
-    </w:p>
-    <w:p>
-      <w:pPr>
-        <w:pStyle w:val="BodyText"/>
-      </w:pPr>
-      <w:r>
-        <w:t xml:space="preserve">I would walk up to the mock-up, read the fault description on the work order, close my eyes to look at the mental map of the system, and narrow the failure down to two potential nodes before I even picked up a probe. I would take one reading with my meter, confirm the voltage drop, and point to the exact broken relay.</w:t>
-      </w:r>
-    </w:p>
-    <w:p>
-      <w:pPr>
-        <w:pStyle w:val="BodyText"/>
-      </w:pPr>
-      <w:r>
-        <w:t xml:space="preserve">“It’s K-104, sir,”</w:t>
-      </w:r>
-      <w:r>
-        <w:t xml:space="preserve"> </w:t>
-      </w:r>
-      <w:r>
-        <w:t xml:space="preserve">I’d tell the instructor, a grizzled Master Sergeant who had been fixing jets since Vietnam.</w:t>
-      </w:r>
-      <w:r>
-        <w:t xml:space="preserve"> </w:t>
-      </w:r>
-      <w:r>
-        <w:t xml:space="preserve">“The contacts are open.”</w:t>
-      </w:r>
-    </w:p>
-    <w:p>
-      <w:pPr>
-        <w:pStyle w:val="BodyText"/>
-      </w:pPr>
-      <w:r>
-        <w:t xml:space="preserve">He would stare at me, look down at his master key sheet, and shake his head in disbelief.</w:t>
-      </w:r>
-      <w:r>
-        <w:t xml:space="preserve"> </w:t>
-      </w:r>
-      <w:r>
-        <w:t xml:space="preserve">“How the hell did you find that in two minutes, Thompson? It’s a six-step isolation procedure.”</w:t>
-      </w:r>
-    </w:p>
-    <w:p>
-      <w:pPr>
-        <w:pStyle w:val="BodyText"/>
-      </w:pPr>
-      <w:r>
-        <w:t xml:space="preserve">“The math only lines up one way, Sergeant,”</w:t>
-      </w:r>
-      <w:r>
-        <w:t xml:space="preserve"> </w:t>
-      </w:r>
-      <w:r>
-        <w:t xml:space="preserve">I’d say, smiling.</w:t>
-      </w:r>
-      <w:r>
-        <w:t xml:space="preserve"> </w:t>
-      </w:r>
-      <w:r>
-        <w:t xml:space="preserve">“Every other path has a positive signal. It had to be the K-104.”</w:t>
-      </w:r>
-    </w:p>
-    <w:p>
-      <w:pPr>
-        <w:pStyle w:val="BodyText"/>
-      </w:pPr>
-      <w:r>
-        <w:t xml:space="preserve">I graduated at the top of my class, breaking the schoolhouse records for practical troubleshooting speed. I had taken the hyper-vigilance of Greenmount Avenue—the constant, scanning risk-assessment engine—and converted it into a highly refined technical instrument.</w:t>
-      </w:r>
-    </w:p>
-    <w:p>
-      <w:pPr>
-        <w:pStyle w:val="BodyText"/>
-      </w:pPr>
-      <w:r>
-        <w:t xml:space="preserve">I was officially an Air Force aerospace engineer. I was young, incredibly arrogant, and armed with a deep understanding of complex systems architecture. And the military was about to ship my raw processing engine across the Pacific to my first active duty station.</w:t>
+        <w:t xml:space="preserve">After boot camp, they sent me to Sheppard Air Force Base in Wichita Falls, Texas, for technical school. I was enrolled in the training pipeline for the 2A6X6 specialty: Aerospace Electrical and Environmental Systems.</w:t>
+      </w:r>
+    </w:p>
+    <w:p>
+      <w:pPr>
+        <w:pStyle w:val="BodyText"/>
+      </w:pPr>
+      <w:r>
+        <w:t xml:space="preserve">For the average recruit, it was a highly complex course. They would sit in classrooms staring blankly at three-foot-wide, multi-folded technical schematics—known in the military as Technical Orders, or T.O.s. These blueprints were massive webs of lines representing thousands of feet of wiring, relays, and circuit breakers.</w:t>
+      </w:r>
+    </w:p>
+    <w:p>
+      <w:pPr>
+        <w:pStyle w:val="BodyText"/>
+      </w:pPr>
+      <w:r>
+        <w:t xml:space="preserve">But to me, those schematics made perfect sense.</w:t>
+      </w:r>
+    </w:p>
+    <w:p>
+      <w:pPr>
+        <w:pStyle w:val="BodyText"/>
+      </w:pPr>
+      <w:r>
+        <w:t xml:space="preserve">It was the first time in my life I realized that my brain ran on a different clock speed than the people around me. My cognitive processing power, which had spent years scanning alleyways and street corners for threats, was suddenly directed at a static, logical architecture. I didn’t try to memorize the schematics. I downloaded them. I would spend my evenings sitting in the study hall hunched over the T.O.s while the other guys in the barracks were out.</w:t>
+      </w:r>
+    </w:p>
+    <w:p>
+      <w:pPr>
+        <w:pStyle w:val="BodyText"/>
+      </w:pPr>
+      <w:r>
+        <w:t xml:space="preserve">I loved the absolute truth of it. On the streets of Baltimore, everything was volatile. A word could mean a fight, a look could get you shot, and the rules changed depending on who was standing on the corner. But a schematic had no ego. A wiring diagram didn’t lie, and it didn’t have bad days. It ran on pure, uncompromising physics. If an input went into a logic gate, the output was mathematically guaranteed. There was an error, you isolated it, analyzed the logic, and fixed the system.</w:t>
+      </w:r>
+    </w:p>
+    <w:p>
+      <w:pPr>
+        <w:pStyle w:val="BodyText"/>
+      </w:pPr>
+      <w:r>
+        <w:t xml:space="preserve">Troubleshooting came naturally to me. I had taken the hyper-vigilance of the streets—the constant, scanning risk-assessment engine—and converted it into a refined technical instrument.</w:t>
+      </w:r>
+    </w:p>
+    <w:p>
+      <w:pPr>
+        <w:pStyle w:val="BodyText"/>
+      </w:pPr>
+      <w:r>
+        <w:t xml:space="preserve">I graduated the course officially an Air Force aerospace electrical specialist. I was young, arrogant, and armed with a deep understanding of complex systems architecture. And the military was about to ship my processing engine across the Pacific to my first active duty station.</w:t>
       </w:r>
     </w:p>
     <w:p>

</xml_diff>

<commit_message>
Update Chapters 5 & 6 based on user facts
</commit_message>
<xml_diff>
--- a/The_Improbability_of_Me_Master_Draft.docx
+++ b/The_Improbability_of_Me_Master_Draft.docx
@@ -1710,7 +1710,7 @@
         <w:t xml:space="preserve"> </w:t>
       </w:r>
       <w:r>
-        <w:t xml:space="preserve">“two things happen simultaneously. First, the pain is so intense, so biochemically overwhelming, that it completely floods his brain’s central processing unit. He physically cannot think about hitting you because his nervous system is screaming at maximum capacity. Second, he will start to bleed profusely from the temporal artery. He will be blinded by his own blood, and his psychological will to fight will completely evaporate. He will drop to his knees, clutching his head, trying to hold himself together. The fight is over.”</w:t>
+        <w:t xml:space="preserve">“that will take the fight right out of them.”</w:t>
       </w:r>
     </w:p>
     <w:p>
@@ -1744,21 +1744,21 @@
         <w:t xml:space="preserve"> </w:t>
       </w:r>
       <w:r>
-        <w:t xml:space="preserve">“If a man has you wrapped up, his face is going to be close to yours. You don’t try to headbutt him; you might break your own nose. You lean in, you open your mouth, and you bite the tip of his nose off.”</w:t>
-      </w:r>
-    </w:p>
-    <w:p>
-      <w:pPr>
-        <w:pStyle w:val="BodyText"/>
-      </w:pPr>
-      <w:r>
-        <w:t xml:space="preserve">He gestured to his own nose, which was slightly crooked from some long-forgotten conflict.</w:t>
-      </w:r>
-      <w:r>
-        <w:t xml:space="preserve"> </w:t>
-      </w:r>
-      <w:r>
-        <w:t xml:space="preserve">“The nose is another cartilage structure. It has high nerve density. If you sink your teeth in and bite down until you hit bone, then tear sideways, you will take the tip right off. The biological panic of having your airway filled with blood and your face mutilated is an absolute override. It doesn’t matter how big he is, or how much PCP he’s smoked. His body’s survival programming will force him to let go of you to protect his face.”</w:t>
+        <w:t xml:space="preserve">“If a man has you wrapped up, his face is going to be close to yours. You lean in, you open your mouth, and you bite the tip of his nose off.”</w:t>
+      </w:r>
+    </w:p>
+    <w:p>
+      <w:pPr>
+        <w:pStyle w:val="BodyText"/>
+      </w:pPr>
+      <w:r>
+        <w:t xml:space="preserve">He gestured to his own nose.</w:t>
+      </w:r>
+      <w:r>
+        <w:t xml:space="preserve"> </w:t>
+      </w:r>
+      <w:r>
+        <w:t xml:space="preserve">“If you sink your teeth in and tear it off, that will take the fight right out of them, too. It doesn’t matter how big he is. He’s going to let go.”</w:t>
       </w:r>
     </w:p>
     <w:p>
@@ -1910,7 +1910,7 @@
         <w:pStyle w:val="BodyText"/>
       </w:pPr>
       <w:r>
-        <w:t xml:space="preserve">We were halfway down the block when it happened. I didn’t hear footsteps. I didn’t hear yelling. I just felt my body jerk violently sideways. Before I could figure out what was happening, a grown man came flying in from behind and clotheslined me so hard my feet left the ground. My head snapped back. I hit the pavement—confused, dazed, stunned.</w:t>
+        <w:t xml:space="preserve">We were halfway down the block when it happened. I didn’t hear footsteps. I didn’t hear yelling. I just felt my body jerk violently sideways. Before I could figure out what was happening, a grown man came flying in from behind and clotheslined me so hard my feet left the ground. I hit the pavement hard. Before I could recover, they grabbed me and dragged me into the side street so they could beat me without the police seeing.</w:t>
       </w:r>
     </w:p>
     <w:p>
@@ -1926,7 +1926,7 @@
         <w:pStyle w:val="BodyText"/>
       </w:pPr>
       <w:r>
-        <w:t xml:space="preserve">Two grown men stood over me, screaming. “Why you do that yo? Why you do that yo?”</w:t>
+        <w:t xml:space="preserve">Two grown men stood over me in that side street, screaming. “Why you do that yo? Why you do that yo?”</w:t>
       </w:r>
     </w:p>
     <w:p>

</xml_diff>

<commit_message>
Add master thieves story at the end of Chapter 8
</commit_message>
<xml_diff>
--- a/The_Improbability_of_Me_Master_Draft.docx
+++ b/The_Improbability_of_Me_Master_Draft.docx
@@ -28,7 +28,7 @@
         </w:p>
       </w:sdtContent>
     </w:sdt>
-    <w:bookmarkStart w:id="9" w:name="title-page"/>
+    <w:bookmarkStart w:id="12" w:name="title-page"/>
     <w:p>
       <w:pPr>
         <w:pStyle w:val="Heading1"/>
@@ -44,8 +44,63 @@
         </w:pict>
       </w:r>
     </w:p>
-    <w:bookmarkEnd w:id="9"/>
-    <w:bookmarkStart w:id="10" w:name="the-improbability-of-me"/>
+    <w:p>
+      <w:pPr>
+        <w:pStyle w:val="CaptionedFigure"/>
+      </w:pPr>
+      <w:r>
+        <w:drawing>
+          <wp:inline>
+            <wp:extent cx="5334000" cy="7950532"/>
+            <wp:effectExtent b="0" l="0" r="0" t="0"/>
+            <wp:docPr descr="The Improbability of Me Book Cover" title="" id="10" name="Picture"/>
+            <a:graphic>
+              <a:graphicData uri="http://schemas.openxmlformats.org/drawingml/2006/picture">
+                <pic:pic>
+                  <pic:nvPicPr>
+                    <pic:cNvPr descr="book_cover.png" id="11" name="Picture"/>
+                    <pic:cNvPicPr>
+                      <a:picLocks noChangeArrowheads="1" noChangeAspect="1"/>
+                    </pic:cNvPicPr>
+                  </pic:nvPicPr>
+                  <pic:blipFill>
+                    <a:blip r:embed="rId9"/>
+                    <a:stretch>
+                      <a:fillRect/>
+                    </a:stretch>
+                  </pic:blipFill>
+                  <pic:spPr bwMode="auto">
+                    <a:xfrm>
+                      <a:off x="0" y="0"/>
+                      <a:ext cx="5334000" cy="7950532"/>
+                    </a:xfrm>
+                    <a:prstGeom prst="rect">
+                      <a:avLst/>
+                    </a:prstGeom>
+                    <a:noFill/>
+                    <a:ln w="9525">
+                      <a:noFill/>
+                      <a:headEnd/>
+                      <a:tailEnd/>
+                    </a:ln>
+                  </pic:spPr>
+                </pic:pic>
+              </a:graphicData>
+            </a:graphic>
+          </wp:inline>
+        </w:drawing>
+      </w:r>
+    </w:p>
+    <w:p>
+      <w:pPr>
+        <w:pStyle w:val="ImageCaption"/>
+      </w:pPr>
+      <w:r>
+        <w:t xml:space="preserve">The Improbability of Me Book Cover</w:t>
+      </w:r>
+    </w:p>
+    <w:bookmarkEnd w:id="12"/>
+    <w:bookmarkStart w:id="13" w:name="the-improbability-of-me"/>
     <w:p>
       <w:pPr>
         <w:pStyle w:val="Heading1"/>
@@ -117,8 +172,8 @@
         </w:pict>
       </w:r>
     </w:p>
-    <w:bookmarkEnd w:id="10"/>
-    <w:bookmarkStart w:id="11" w:name="chapter-1-the-improbability-of-me"/>
+    <w:bookmarkEnd w:id="13"/>
+    <w:bookmarkStart w:id="14" w:name="chapter-1-the-improbability-of-me"/>
     <w:p>
       <w:pPr>
         <w:pStyle w:val="Heading1"/>
@@ -282,8 +337,8 @@
         </w:pict>
       </w:r>
     </w:p>
-    <w:bookmarkEnd w:id="11"/>
-    <w:bookmarkStart w:id="12" w:name="X204e9764ec6521e2a3b16d8274f3f6726bc9e4d"/>
+    <w:bookmarkEnd w:id="14"/>
+    <w:bookmarkStart w:id="15" w:name="X204e9764ec6521e2a3b16d8274f3f6726bc9e4d"/>
     <w:p>
       <w:pPr>
         <w:pStyle w:val="Heading1"/>
@@ -558,8 +613,8 @@
         </w:pict>
       </w:r>
     </w:p>
-    <w:bookmarkEnd w:id="12"/>
-    <w:bookmarkStart w:id="13" w:name="chapter-3-audrey-avenue"/>
+    <w:bookmarkEnd w:id="15"/>
+    <w:bookmarkStart w:id="16" w:name="chapter-3-audrey-avenue"/>
     <w:p>
       <w:pPr>
         <w:pStyle w:val="Heading1"/>
@@ -840,8 +895,8 @@
         </w:pict>
       </w:r>
     </w:p>
-    <w:bookmarkEnd w:id="13"/>
-    <w:bookmarkStart w:id="14" w:name="chapter-4-the-neighborhood-boys"/>
+    <w:bookmarkEnd w:id="16"/>
+    <w:bookmarkStart w:id="17" w:name="chapter-4-the-neighborhood-boys"/>
     <w:p>
       <w:pPr>
         <w:pStyle w:val="Heading1"/>
@@ -1236,8 +1291,8 @@
         </w:pict>
       </w:r>
     </w:p>
-    <w:bookmarkEnd w:id="14"/>
-    <w:bookmarkStart w:id="15" w:name="X51a71318720734dfc4e1ba81fef4f822b3ed44c"/>
+    <w:bookmarkEnd w:id="17"/>
+    <w:bookmarkStart w:id="18" w:name="X51a71318720734dfc4e1ba81fef4f822b3ed44c"/>
     <w:p>
       <w:pPr>
         <w:pStyle w:val="Heading1"/>
@@ -1664,14 +1719,14 @@
         </w:pict>
       </w:r>
     </w:p>
-    <w:bookmarkEnd w:id="15"/>
-    <w:bookmarkStart w:id="16" w:name="chapter-6-mechanical-failures"/>
+    <w:bookmarkEnd w:id="18"/>
+    <w:bookmarkStart w:id="19" w:name="chapter-6-the-city-that-bleeds"/>
     <w:p>
       <w:pPr>
         <w:pStyle w:val="Heading1"/>
       </w:pPr>
       <w:r>
-        <w:t xml:space="preserve">Chapter 6: Mechanical Failures</w:t>
+        <w:t xml:space="preserve">Chapter 6: The City That Bleeds</w:t>
       </w:r>
     </w:p>
     <w:p>
@@ -1698,481 +1753,262 @@
         <w:pStyle w:val="FirstParagraph"/>
       </w:pPr>
       <w:r>
-        <w:t xml:space="preserve">I was fourteen the first time I had to stab someone.</w:t>
-      </w:r>
-      <w:r>
-        <w:t xml:space="preserve"> </w:t>
-      </w:r>
-      <w:r>
-        <w:t xml:space="preserve">It’s a fucking shame that a kid growing up in America has to say that sentence out loud. People hear it and assume I’m bragging or exaggerating. I’m not. I was a tall, lanky kid, still soft around the edges, who hadn’t fully grown into his bones yet. Baltimore didn’t care what I looked like. Baltimore only cared that I was standing in the wrong place.</w:t>
-      </w:r>
-      <w:r>
-        <w:t xml:space="preserve"> </w:t>
-      </w:r>
-      <w:r>
-        <w:t xml:space="preserve">Me and Big Ed were trying to get home. The bus broke down and the driver kicked everyone off. No explanations. No backup plan. Just “everybody off.” That was MTA back then. It still is in some places. We figured we’d walk to the next connecting stop.</w:t>
-      </w:r>
-      <w:r>
-        <w:t xml:space="preserve"> </w:t>
-      </w:r>
-      <w:r>
-        <w:t xml:space="preserve">Bad idea.</w:t>
-      </w:r>
-      <w:r>
-        <w:t xml:space="preserve"> </w:t>
-      </w:r>
-      <w:r>
-        <w:t xml:space="preserve">That walk took us down North Avenue, right across the street from Greenmount Cemetery. If you know Baltimore, you know Greenmount. High stone walls, miles of graves, dead leaves, and silence. A city of the dead sitting in the middle of the city of the living, or what passes for living. We were on the opposite side of the street, just trying to get past it.</w:t>
-      </w:r>
-      <w:r>
-        <w:t xml:space="preserve"> </w:t>
-      </w:r>
-      <w:r>
-        <w:t xml:space="preserve">We were halfway down the block when it happened.</w:t>
-      </w:r>
-      <w:r>
-        <w:t xml:space="preserve"> </w:t>
-      </w:r>
-      <w:r>
-        <w:t xml:space="preserve">I didn’t hear footsteps. I didn’t hear yelling. I just felt my body jerk violently sideways. A grown man came flying in from behind and clotheslined me so hard my feet left the ground. I hit the pavement hard. Before I could get up, they grabbed me and dragged me into a side street.</w:t>
-      </w:r>
-      <w:r>
-        <w:t xml:space="preserve"> </w:t>
-      </w:r>
-      <w:r>
-        <w:t xml:space="preserve">Ed didn’t wait. He ran. I can’t blame him. He was fourteen too. But that moment burned something into me: when things go bad, you might be completely alone.</w:t>
-      </w:r>
-      <w:r>
-        <w:t xml:space="preserve"> </w:t>
-      </w:r>
-      <w:r>
-        <w:t xml:space="preserve">Two grown men stood over me, screaming.</w:t>
-      </w:r>
-      <w:r>
-        <w:t xml:space="preserve"> </w:t>
-      </w:r>
-      <w:r>
-        <w:t xml:space="preserve">“Why you do that, yo? Why you do that, yo?”</w:t>
-      </w:r>
-      <w:r>
-        <w:t xml:space="preserve"> </w:t>
-      </w:r>
-      <w:r>
-        <w:t xml:space="preserve">I hadn’t said a word. I hadn’t even looked at them. But they kept repeating it like it gave them a reason to beat the hell out of a white kid. They punched me, kicked me into the brick wall, cracked my ribs. My confusion lasted maybe three seconds. Then instinct woke up.</w:t>
-      </w:r>
-      <w:r>
-        <w:t xml:space="preserve"> </w:t>
-      </w:r>
-      <w:r>
-        <w:t xml:space="preserve">I thought they were going to beat me to death.</w:t>
-      </w:r>
-      <w:r>
-        <w:t xml:space="preserve"> </w:t>
-      </w:r>
-      <w:r>
-        <w:t xml:space="preserve">I reached into my pocket. All I had was a cheap pen. I wasn’t carrying a knife yet. I was still innocent enough to think I didn’t need one. One of them grabbed my collar and yanked me up to his face. I remember thinking I was going to catch hell at home for letting them tear my dorky white-and-green striped shirt.</w:t>
-      </w:r>
-      <w:r>
-        <w:t xml:space="preserve"> </w:t>
-      </w:r>
-      <w:r>
-        <w:t xml:space="preserve">That was the moment my brain snapped from confusion to survival.</w:t>
-      </w:r>
-      <w:r>
-        <w:t xml:space="preserve"> </w:t>
-      </w:r>
-      <w:r>
-        <w:t xml:space="preserve">No thought. No hesitation. Just a wild, desperate swing.</w:t>
-      </w:r>
-      <w:r>
-        <w:t xml:space="preserve"> </w:t>
-      </w:r>
-      <w:r>
-        <w:t xml:space="preserve">I came in with a looping, icepick-style stab using everything I had. It felt like stabbing Play-Doh. The pen lodged deep. To this day I can’t remember the guy’s face, only his friend’s look of pure horror. People have told me that’s the mind protecting a fourteen-year-old boy. I remember the satisfying feeling of it sticking in there good, though. Even now it brings a small, dark smile. I hope that fucking loser lived and changed his ways. I believe in second chances.</w:t>
-      </w:r>
-      <w:r>
-        <w:t xml:space="preserve"> </w:t>
-      </w:r>
-      <w:r>
-        <w:t xml:space="preserve">He saw the motion, saw something pierce his friend’s neck, and ran like he’d been shot. I bolted. Full sprint. No looking back. I walked the rest of the way home, a long way, thinking one stupid thing the whole time: I hope I don’t get punished for the torn shirt.</w:t>
-      </w:r>
-      <w:r>
-        <w:t xml:space="preserve"> </w:t>
-      </w:r>
-      <w:r>
-        <w:t xml:space="preserve">I don’t know what happened to the guy I stabbed. All I know is he didn’t chase me.</w:t>
-      </w:r>
-      <w:r>
-        <w:t xml:space="preserve"> </w:t>
-      </w:r>
-      <w:r>
-        <w:t xml:space="preserve">That moment changed something in me. Not in a dramatic “this is the day I became a man” way. More like a quiet switch flipping. At fourteen I learned: grown men will hurt a kid, the world will not pause to help you, and your friends might run. Your only chance is whatever you can do in the next quarter-second.</w:t>
-      </w:r>
-      <w:r>
-        <w:t xml:space="preserve"> </w:t>
-      </w:r>
-      <w:r>
-        <w:t xml:space="preserve">People hear stories like this and think trauma. Pain. Psychological scars. For me it wasn’t a wound. It was information. The world showed me how it worked. I adjusted.</w:t>
-      </w:r>
-      <w:r>
-        <w:t xml:space="preserve"> </w:t>
-      </w:r>
-      <w:r>
-        <w:t xml:space="preserve">A year later, on that same road, the adjustment was tested.</w:t>
-      </w:r>
-      <w:r>
-        <w:t xml:space="preserve"> </w:t>
-      </w:r>
-      <w:r>
-        <w:t xml:space="preserve">The corner of St. Paul and North Avenue was the kind of place where something bad could find you even if you weren’t looking for it. It was November, creeping up on Thanksgiving. The sky was flat, cloudy gray. North Avenue was a busy four-lane divided street. The tall brick and concrete buildings on either side acted like a canyon, trapping the heavy smell of diesel and gas from the MTA buses. That constant hum of traffic and sharp, impatient horns mixed with the greasy scent of lake trout and chicken boxes drifting down the block.</w:t>
-      </w:r>
-      <w:r>
-        <w:t xml:space="preserve"> </w:t>
-      </w:r>
-      <w:r>
-        <w:t xml:space="preserve">It was busted pavement and a big black cast-iron fence in front of the old cathedral, a place that looked holy from a distance but meant nothing on the ground. God didn’t hang around there. The crackheads did. The stickup crews did. Kids like me did, because that was where the bus stopped.</w:t>
-      </w:r>
-      <w:r>
-        <w:t xml:space="preserve"> </w:t>
-      </w:r>
-      <w:r>
-        <w:t xml:space="preserve">I was fifteen and already carried myself like someone who knew the rules of the street. Not because I was tough, but because the alternative was getting hurt.</w:t>
-      </w:r>
-      <w:r>
-        <w:t xml:space="preserve"> </w:t>
-      </w:r>
-      <w:r>
-        <w:t xml:space="preserve">I saw them coming from a mile away.</w:t>
-      </w:r>
-      <w:r>
-        <w:t xml:space="preserve"> </w:t>
-      </w:r>
-      <w:r>
-        <w:t xml:space="preserve">My friend Matt and I were waiting for the next bus when a group of five guys walked by and eyed us. They saw Matt’s Starter jacket and went around the corner to plan their move. When they came back they walked straight up to him.</w:t>
-      </w:r>
-      <w:r>
-        <w:t xml:space="preserve"> </w:t>
-      </w:r>
-      <w:r>
-        <w:t xml:space="preserve">“I like your jacket, yo.”</w:t>
-      </w:r>
-      <w:r>
-        <w:t xml:space="preserve"> </w:t>
-      </w:r>
-      <w:r>
-        <w:t xml:space="preserve">Matt said, “I like it too.”</w:t>
-      </w:r>
-      <w:r>
-        <w:t xml:space="preserve"> </w:t>
-      </w:r>
-      <w:r>
-        <w:t xml:space="preserve">“Give it to me,” one of them said, and punched him.</w:t>
-      </w:r>
-      <w:r>
-        <w:t xml:space="preserve"> </w:t>
-      </w:r>
-      <w:r>
-        <w:t xml:space="preserve">Matt was a soccer player, not a fighter. He ran his ass off. I probably could have run too, but I had a secret.</w:t>
-      </w:r>
-      <w:r>
-        <w:t xml:space="preserve"> </w:t>
-      </w:r>
-      <w:r>
-        <w:t xml:space="preserve">Marcello came at me first.</w:t>
-      </w:r>
-      <w:r>
-        <w:t xml:space="preserve"> </w:t>
-      </w:r>
-      <w:r>
-        <w:t xml:space="preserve">Five of them circled in, tightening the space, my back pinned against the cast-iron fence. I remember his face like a sketch: hard eyes, lip curled.</w:t>
-      </w:r>
-      <w:r>
-        <w:t xml:space="preserve"> </w:t>
-      </w:r>
-      <w:r>
-        <w:t xml:space="preserve">“White motherfucker.”</w:t>
-      </w:r>
-      <w:r>
-        <w:t xml:space="preserve"> </w:t>
-      </w:r>
-      <w:r>
-        <w:t xml:space="preserve">He was talking shit, trying to get in my head. I was already past listening. My pulse was too loud. The only things that mattered were distance and timing. If he got close enough to grab me, the others would pile on and it would be over.</w:t>
-      </w:r>
-      <w:r>
-        <w:t xml:space="preserve"> </w:t>
-      </w:r>
-      <w:r>
-        <w:t xml:space="preserve">Instinct took over. Not training. Not technique. Just a kid who had fought enough to know you go first or you go down.</w:t>
-      </w:r>
-      <w:r>
-        <w:t xml:space="preserve"> </w:t>
-      </w:r>
-      <w:r>
-        <w:t xml:space="preserve">I snapped a front kick straight into his face. Fast. Clean. Reflex. The ball of my foot split his lip. For one second the circle hesitated.</w:t>
-      </w:r>
-      <w:r>
-        <w:t xml:space="preserve"> </w:t>
-      </w:r>
-      <w:r>
-        <w:t xml:space="preserve">Marcello wiped his mouth and grinned. “A karate boy. We like karate boys around here.”</w:t>
-      </w:r>
-      <w:r>
-        <w:t xml:space="preserve"> </w:t>
-      </w:r>
-      <w:r>
-        <w:t xml:space="preserve">Before the words finished, another one came in from behind and smashed me over the head with a board. The shock split my scalp open. Warm blood ran instantly. The world rang like metal. I staggered, and that was the opening Jesse needed.</w:t>
-      </w:r>
-      <w:r>
-        <w:t xml:space="preserve"> </w:t>
-      </w:r>
-      <w:r>
-        <w:t xml:space="preserve">He rushed me, grabbing, pulling, trying to drag me to the ground. He was bigger, older, heavier. If he got me down they would stomp me until there was nothing left. These guys didn’t like it when you fought back. They liked broken kids, not problems.</w:t>
-      </w:r>
-      <w:r>
-        <w:t xml:space="preserve"> </w:t>
-      </w:r>
-      <w:r>
-        <w:t xml:space="preserve">The world snapped into slow motion.</w:t>
-      </w:r>
-      <w:r>
-        <w:t xml:space="preserve"> </w:t>
-      </w:r>
-      <w:r>
-        <w:t xml:space="preserve">My left hand was already in my pocket, fingers wrapped around the handle of my old folding Buck knife. As Jesse tried to drag me down I turned sideways, flicked the blade open, and swung. It wasn’t a flashy move. It was a left hook to the body, with a knife. I didn’t show it to him. I just drove it straight into his chest like a hard punch.</w:t>
-      </w:r>
-      <w:r>
-        <w:t xml:space="preserve"> </w:t>
-      </w:r>
-      <w:r>
-        <w:t xml:space="preserve">I felt the blade pierce his thick jacket. I felt it slide through skin and muscle. Then I felt it hit bone.</w:t>
-      </w:r>
-      <w:r>
-        <w:t xml:space="preserve"> </w:t>
-      </w:r>
-      <w:r>
-        <w:t xml:space="preserve">That impact is what did it.</w:t>
-      </w:r>
-      <w:r>
-        <w:t xml:space="preserve"> </w:t>
-      </w:r>
-      <w:r>
-        <w:t xml:space="preserve">A sudden, sickening mechanical snap ran through my hand. The force driving into his ribs was too much for the pin. The locking mechanism failed. The blade collapsed violently back against the handle and cut me. It didn’t take my fingers off, but it was close.</w:t>
-      </w:r>
-      <w:r>
-        <w:t xml:space="preserve"> </w:t>
-      </w:r>
-      <w:r>
-        <w:t xml:space="preserve">I snapped my arm back to stab him again, ready to keep going, but I didn’t have to.</w:t>
-      </w:r>
-      <w:r>
-        <w:t xml:space="preserve"> </w:t>
-      </w:r>
-      <w:r>
-        <w:t xml:space="preserve">I heard the wet hiss of air leaving his chest like someone letting air out of a tire. The fight left him instantly. He deflated, practically melting off me as his legs gave out. His eyes went wide with the confused look of an animal asking why while he was in the middle of attacking me. The rest of the circle froze, paralyzed by the shock of a fifteen-year-old kid pulling steel.</w:t>
-      </w:r>
-      <w:r>
-        <w:t xml:space="preserve"> </w:t>
-      </w:r>
-      <w:r>
-        <w:t xml:space="preserve">That shock was the only gap I was going to get.</w:t>
-      </w:r>
-      <w:r>
-        <w:t xml:space="preserve"> </w:t>
-      </w:r>
-      <w:r>
-        <w:t xml:space="preserve">The circle broke for half a second. I ran straight through it and sprinted into North Avenue traffic without looking. Tires shrieked. Horns blasted. Cars swerved. I didn’t care. I hit the far sidewalk, grabbed the heavy door, and burst into the Kentucky Fried Chicken like a live grenade.</w:t>
-      </w:r>
-      <w:r>
-        <w:t xml:space="preserve"> </w:t>
-      </w:r>
-      <w:r>
-        <w:t xml:space="preserve">I had maybe ten seconds.</w:t>
-      </w:r>
-      <w:r>
-        <w:t xml:space="preserve"> </w:t>
-      </w:r>
-      <w:r>
-        <w:t xml:space="preserve">I ran to the counter and yelled at the workers behind the bulletproof plexiglass to call 911. They just stared and laughed like it was a joke.</w:t>
-      </w:r>
-      <w:r>
-        <w:t xml:space="preserve"> </w:t>
-      </w:r>
-      <w:r>
-        <w:t xml:space="preserve">Then the heavy glass doors blew open. The crew flooded in behind me.</w:t>
-      </w:r>
-      <w:r>
-        <w:t xml:space="preserve"> </w:t>
-      </w:r>
-      <w:r>
-        <w:t xml:space="preserve">They dragged Jesse inside and laid him across a booth. His chest barely moved. The moment he was down, the entire atmosphere shifted. The laughter behind the glass stopped. This wasn’t a joke anymore. This was one of their own bleeding out on a plastic table.</w:t>
-      </w:r>
-      <w:r>
-        <w:t xml:space="preserve"> </w:t>
-      </w:r>
-      <w:r>
-        <w:t xml:space="preserve">Suddenly it wasn’t just the crew. Grown adults who had nothing to do with the fight started shouting from the corners.</w:t>
-      </w:r>
-      <w:r>
-        <w:t xml:space="preserve"> </w:t>
-      </w:r>
-      <w:r>
-        <w:t xml:space="preserve">“Kill that white motherfucker!”</w:t>
-      </w:r>
-      <w:r>
-        <w:t xml:space="preserve"> </w:t>
-      </w:r>
-      <w:r>
-        <w:t xml:space="preserve">I was completely on my own again. Me against an entire neighborhood.</w:t>
-      </w:r>
-      <w:r>
-        <w:t xml:space="preserve"> </w:t>
-      </w:r>
-      <w:r>
-        <w:t xml:space="preserve">I looked down at my hand. The knife was useless, the lock sheared, the blade loose and dangerous. A mechanical failure in the middle of a war. But they didn’t know that. From the outside the lock still looked fine. All they knew was that a crazy white kid backed into a corner was holding a knife and clearly willing to use it.</w:t>
-      </w:r>
-      <w:r>
-        <w:t xml:space="preserve"> </w:t>
-      </w:r>
-      <w:r>
-        <w:t xml:space="preserve">The circle started forming again, tighter this time. They were trying to get behind me. I scrambled for anything I could throw: salt shakers, pepper shakers, plastic trays, anything to buy a few more seconds.</w:t>
-      </w:r>
-      <w:r>
-        <w:t xml:space="preserve"> </w:t>
-      </w:r>
-      <w:r>
-        <w:t xml:space="preserve">Then someone swung from my blind spot and smashed a forty-ounce bottle over my head.</w:t>
-      </w:r>
-      <w:r>
-        <w:t xml:space="preserve"> </w:t>
-      </w:r>
-      <w:r>
-        <w:t xml:space="preserve">The world detonated in white pain. The shockwave snapped front to back through my skull. My forehead split open. Blood poured into my eye, hot and thick, turning everything into a black-red blur. I tasted iron. I felt myself slipping.</w:t>
-      </w:r>
-      <w:r>
-        <w:t xml:space="preserve"> </w:t>
-      </w:r>
-      <w:r>
-        <w:t xml:space="preserve">Move.</w:t>
-      </w:r>
-      <w:r>
-        <w:t xml:space="preserve"> </w:t>
-      </w:r>
-      <w:r>
-        <w:t xml:space="preserve">I fought through a side gap and ran for the hallway to the bathroom. If I could get into a narrow space, only one or two could come at a time. Like Leonidas at Thermopylae. I hit them with the door, pushed inside, and slammed the lock.</w:t>
-      </w:r>
-      <w:r>
-        <w:t xml:space="preserve"> </w:t>
-      </w:r>
-      <w:r>
-        <w:t xml:space="preserve">The broken Buck knife went into the toilet. Evidence gone.</w:t>
-      </w:r>
-      <w:r>
-        <w:t xml:space="preserve"> </w:t>
-      </w:r>
-      <w:r>
-        <w:t xml:space="preserve">I looked in the mirror. My short spiked hair was matted with blood. One eye was swollen shut. I looked like the Terminator: half dead, half alive, all fight. I laughed. Not because it was funny. Because survival can make a man feel invincible for a second.</w:t>
-      </w:r>
-      <w:r>
-        <w:t xml:space="preserve"> </w:t>
-      </w:r>
-      <w:r>
-        <w:t xml:space="preserve">Then the knock came. Baltimore Police Department.</w:t>
-      </w:r>
-      <w:r>
-        <w:t xml:space="preserve"> </w:t>
-      </w:r>
-      <w:r>
-        <w:t xml:space="preserve">At first I didn’t believe them. I dropped to the floor, looked through the vent, and saw the blue pants. Real uniforms. I opened the door.</w:t>
-      </w:r>
-      <w:r>
-        <w:t xml:space="preserve"> </w:t>
-      </w:r>
-      <w:r>
-        <w:t xml:space="preserve">They kicked the shit out of me immediately. I don’t blame them. All they knew was that a crazy white kid had stabbed someone and was on a rampage inside a packed KFC on North Avenue. I kept saying, “They jumped me. They jumped me.” Eventually the story sorted itself out.</w:t>
-      </w:r>
-      <w:r>
-        <w:t xml:space="preserve"> </w:t>
-      </w:r>
-      <w:r>
-        <w:t xml:space="preserve">One cop stood in the hallway blocking Jesse’s aunt from reaching me. She was screaming that I killed her boy, that she wanted me dead. The officer, a big blond blocky dude, didn’t flinch.</w:t>
-      </w:r>
-      <w:r>
-        <w:t xml:space="preserve"> </w:t>
-      </w:r>
-      <w:r>
-        <w:t xml:space="preserve">“Bitch, if you come down this hall I will blow your fucking brains out. This place is a war zone. This is how you act in war.”</w:t>
-      </w:r>
-      <w:r>
-        <w:t xml:space="preserve"> </w:t>
-      </w:r>
-      <w:r>
-        <w:t xml:space="preserve">Paramedics finally got inside. They wrapped my head in so much gauze I looked like a mummy. When they rolled me out the crowd still wanted blood. I gave them the finger. Got one in.</w:t>
-      </w:r>
-      <w:r>
-        <w:t xml:space="preserve"> </w:t>
-      </w:r>
-      <w:r>
-        <w:t xml:space="preserve">In the ambulance the escorting cop told me not to worry. I did what I had to do. He even gave advice no cop would ever say on record:</w:t>
-      </w:r>
-      <w:r>
-        <w:t xml:space="preserve"> </w:t>
-      </w:r>
-      <w:r>
-        <w:t xml:space="preserve">“When you stab one of those animals, always yank the knife up to finish the job.”</w:t>
-      </w:r>
-      <w:r>
-        <w:t xml:space="preserve"> </w:t>
-      </w:r>
-      <w:r>
-        <w:t xml:space="preserve">They took Jesse and me to different hospitals on opposite sides of the city. The doctor dug glass out of my scalp, poked into the wound to make sure nothing was lodged, then stitched me closed. I felt every pull.</w:t>
-      </w:r>
-      <w:r>
-        <w:t xml:space="preserve"> </w:t>
-      </w:r>
-      <w:r>
-        <w:t xml:space="preserve">A few days later I went back to school. Instant legend.</w:t>
-      </w:r>
-      <w:r>
-        <w:t xml:space="preserve"> </w:t>
-      </w:r>
-      <w:r>
-        <w:t xml:space="preserve">My father told me flat out they would kill me if they saw me again. He handed me a .38 and said, “If they come at you, you better start shooting.”</w:t>
-      </w:r>
-      <w:r>
-        <w:t xml:space="preserve"> </w:t>
-      </w:r>
-      <w:r>
-        <w:t xml:space="preserve">Even the principal looked at me like she knew I was armed. To this day I appreciate Dr. Harris. She could have caused me a lot of trouble, but I think she understood I was just trying to go to school. There were certain realities when navigating the streets of Baltimore trying to get from A to B.</w:t>
-      </w:r>
-      <w:r>
-        <w:t xml:space="preserve"> </w:t>
-      </w:r>
-      <w:r>
-        <w:t xml:space="preserve">And I knew something else, too.</w:t>
-      </w:r>
-      <w:r>
-        <w:t xml:space="preserve"> </w:t>
-      </w:r>
-      <w:r>
-        <w:t xml:space="preserve">I never carried a folding knife again.</w:t>
-      </w:r>
-      <w:r>
-        <w:t xml:space="preserve"> </w:t>
-      </w:r>
-      <w:r>
-        <w:t xml:space="preserve">A lock is a promise, and promises break. A hinge is a weakness, a single point of failure in a safety-critical system. In engineering you learn that every moving part is a liability, a statistical probability of mechanical collapse under load. From that day on I only carried a fixed blade. Simple. One piece of steel. No moving parts to fail you when the world ends.</w:t>
-      </w:r>
-      <w:r>
-        <w:t xml:space="preserve"> </w:t>
-      </w:r>
-      <w:r>
-        <w:t xml:space="preserve">If the system was going to break, it wasn’t going to be because of the hardware.</w:t>
-      </w:r>
-      <w:r>
-        <w:t xml:space="preserve"> </w:t>
-      </w:r>
-      <w:r>
-        <w:t xml:space="preserve">I was still learning.</w:t>
+        <w:t xml:space="preserve">The irony of the Baltimore City Public School system is that trying to get a better education usually meant increasing your chances of getting killed on the way to class.</w:t>
+      </w:r>
+    </w:p>
+    <w:p>
+      <w:pPr>
+        <w:pStyle w:val="BodyText"/>
+      </w:pPr>
+      <w:r>
+        <w:t xml:space="preserve">My father meant well. When it came time for high school, he knew that Southern High School—my designated zoned school—was an absolute shithole. It was a holding pen for the neighborhood’s future inmates. So, he pushed for me to go somewhere better.</w:t>
+      </w:r>
+    </w:p>
+    <w:p>
+      <w:pPr>
+        <w:pStyle w:val="BodyText"/>
+      </w:pPr>
+      <w:r>
+        <w:t xml:space="preserve">I got accepted into Baltimore City College High School.</w:t>
+      </w:r>
+    </w:p>
+    <w:p>
+      <w:pPr>
+        <w:pStyle w:val="BodyText"/>
+      </w:pPr>
+      <w:r>
+        <w:t xml:space="preserve">We all loved</w:t>
+      </w:r>
+      <w:r>
+        <w:t xml:space="preserve"> </w:t>
+      </w:r>
+      <w:r>
+        <w:t xml:space="preserve">“City.”</w:t>
+      </w:r>
+      <w:r>
+        <w:t xml:space="preserve"> </w:t>
+      </w:r>
+      <w:r>
+        <w:t xml:space="preserve">We were proud of it. Founded in 1839, it’s the third-oldest public high school in the United States. It sits on a hill at 33rd Street and The Alameda, housed in a massive Gothic-style stone building. They literally call it the</w:t>
+      </w:r>
+      <w:r>
+        <w:t xml:space="preserve"> </w:t>
+      </w:r>
+      <w:r>
+        <w:t xml:space="preserve">“Castle on the Hill.”</w:t>
+      </w:r>
+      <w:r>
+        <w:t xml:space="preserve"> </w:t>
+      </w:r>
+      <w:r>
+        <w:t xml:space="preserve">It should be noted that City was a magnet school, designed to bring together the top ten percent of students from all of Baltimore City Schools. You didn’t just win a lottery to get in there. You had to be smart. It was an intellectual haven. The people there were good people, for the most part, especially after the great filter of freshman year where the intellectually weak were purged from the roster.</w:t>
+      </w:r>
+    </w:p>
+    <w:p>
+      <w:pPr>
+        <w:pStyle w:val="BodyText"/>
+      </w:pPr>
+      <w:r>
+        <w:t xml:space="preserve">Inside the Castle, we had teachers who actually cared if we survived. I vividly remember Ms. Stukes Maurice. She sat us down one day and explained the concept of</w:t>
+      </w:r>
+      <w:r>
+        <w:t xml:space="preserve"> </w:t>
+      </w:r>
+      <w:r>
+        <w:t xml:space="preserve">“code switching.”</w:t>
+      </w:r>
+      <w:r>
+        <w:t xml:space="preserve"> </w:t>
+      </w:r>
+      <w:r>
+        <w:t xml:space="preserve">She told us, point-blank, that if we wanted to make it in the professional world, we needed to know how to talk like white people. We needed to know how to turn the street off and turn the polish on. She was preparing us for a world that most kids in our neighborhoods would never see. Ms. Stukes Maurice was a Black Panther, and she was very proud of it. She made sure to tell us every chance she got. She was a nice lady. I always kind of felt like she didn’t like me because I was white, but she was all right.</w:t>
+      </w:r>
+    </w:p>
+    <w:p>
+      <w:pPr>
+        <w:pStyle w:val="BodyText"/>
+      </w:pPr>
+      <w:r>
+        <w:t xml:space="preserve">But to get to that world, to reach the Castle on the Hill, I had to survive the commute.</w:t>
+      </w:r>
+    </w:p>
+    <w:p>
+      <w:pPr>
+        <w:pStyle w:val="BodyText"/>
+      </w:pPr>
+      <w:r>
+        <w:t xml:space="preserve">In the late 1980s, Mayor Kurt Schmoke—who happened to be a City College alumni himself—launched a massive literacy campaign with a catchy slogan:</w:t>
+      </w:r>
+      <w:r>
+        <w:t xml:space="preserve"> </w:t>
+      </w:r>
+      <w:r>
+        <w:rPr>
+          <w:i/>
+          <w:iCs/>
+        </w:rPr>
+        <w:t xml:space="preserve">The City That Reads.</w:t>
+      </w:r>
+      <w:r>
+        <w:t xml:space="preserve"> </w:t>
+      </w:r>
+      <w:r>
+        <w:t xml:space="preserve">They painted it on benches all over town. But this was Baltimore. The murder rate was skyrocketing, and the reality of the streets was far darker than a PR campaign. It didn’t take long for the locals to take out their spray cans and correct the benches. Everywhere you looked, the slogan was crossed out and rewritten.</w:t>
+      </w:r>
+    </w:p>
+    <w:p>
+      <w:pPr>
+        <w:pStyle w:val="BodyText"/>
+      </w:pPr>
+      <w:r>
+        <w:t xml:space="preserve">It became</w:t>
+      </w:r>
+      <w:r>
+        <w:t xml:space="preserve"> </w:t>
+      </w:r>
+      <w:r>
+        <w:rPr>
+          <w:i/>
+          <w:iCs/>
+        </w:rPr>
+        <w:t xml:space="preserve">The City That Bleeds.</w:t>
+      </w:r>
+    </w:p>
+    <w:p>
+      <w:pPr>
+        <w:pStyle w:val="BodyText"/>
+      </w:pPr>
+      <w:r>
+        <w:t xml:space="preserve">I was a fresh, fourteen-year-old kid, and to get to my prestigious high school, I had to catch two different city buses straight through the absolute worst, most violent neighborhoods in a bleeding city. The first bus I caught every morning was right in front of Wu’s convenience store. Wu was a Korean lady who owned the sub shop on the corner of the 1800 block of Light Street. She knew Gabby’s grandmother, who owned the shop over in Westport. They didn’t compete; they actually all knew each other. The local Korean business owners participated in a traditional money-pooling system—like a</w:t>
+      </w:r>
+      <w:r>
+        <w:t xml:space="preserve"> </w:t>
+      </w:r>
+      <w:r>
+        <w:rPr>
+          <w:i/>
+          <w:iCs/>
+        </w:rPr>
+        <w:t xml:space="preserve">kye</w:t>
+      </w:r>
+      <w:r>
+        <w:t xml:space="preserve">—where every month, twenty of them would throw in thousands of dollars, and they’d take turns collecting the pot to do renovations or handle big expenses. It was a fascinating way to do business.</w:t>
+      </w:r>
+    </w:p>
+    <w:p>
+      <w:pPr>
+        <w:pStyle w:val="BodyText"/>
+      </w:pPr>
+      <w:r>
+        <w:t xml:space="preserve">But out on the street, business was different.</w:t>
+      </w:r>
+    </w:p>
+    <w:p>
+      <w:pPr>
+        <w:pStyle w:val="BodyText"/>
+      </w:pPr>
+      <w:r>
+        <w:t xml:space="preserve">There is a distinct, unforgettable stink to a Baltimore City bus. It’s a humid mixture of exhaust, stale sweat, cheap malt liquor, and desperation. Those buses were rolling thunderdomes. You were packed into a metal tube with a cross-section of the city’s collapsing social fabric.</w:t>
+      </w:r>
+    </w:p>
+    <w:p>
+      <w:pPr>
+        <w:pStyle w:val="BodyText"/>
+      </w:pPr>
+      <w:r>
+        <w:t xml:space="preserve">One of our regular sights on the route was a schizophrenic guy we called the</w:t>
+      </w:r>
+      <w:r>
+        <w:t xml:space="preserve"> </w:t>
+      </w:r>
+      <w:r>
+        <w:t xml:space="preserve">“Devil Dog from Hell.”</w:t>
+      </w:r>
+      <w:r>
+        <w:t xml:space="preserve"> </w:t>
+      </w:r>
+      <w:r>
+        <w:t xml:space="preserve">He would stand at the bus stop right in front of Wu’s, violently beating a payphone with a black plastic trash bag, screaming at the top of his lungs about the devil dogs from hell and how the phone company was putting things into his head. He was a wild one, but honestly, he was the least of our problems. The crazy ones were predictable. It was the sane ones you had to worry about.</w:t>
+      </w:r>
+    </w:p>
+    <w:p>
+      <w:pPr>
+        <w:pStyle w:val="BodyText"/>
+      </w:pPr>
+      <w:r>
+        <w:t xml:space="preserve">On those buses, the threat of violence was just the ambient temperature of the room. Fights would break out over absolutely nothing. Eye contact held a second too long. A scuffed sneaker. A perceived slight.</w:t>
+      </w:r>
+    </w:p>
+    <w:p>
+      <w:pPr>
+        <w:pStyle w:val="BodyText"/>
+      </w:pPr>
+      <w:r>
+        <w:t xml:space="preserve">That was the environment. That was the baseline. The absolute, sociopathic desensitization to extreme violence was just what it took to commute to school. You had to project an aura of pure volatility, or you would become prey.</w:t>
+      </w:r>
+    </w:p>
+    <w:p>
+      <w:pPr>
+        <w:pStyle w:val="BodyText"/>
+      </w:pPr>
+      <w:r>
+        <w:t xml:space="preserve">But I wasn’t just projecting. The environment was shaping the hardware.</w:t>
+      </w:r>
+    </w:p>
+    <w:p>
+      <w:pPr>
+        <w:pStyle w:val="BodyText"/>
+      </w:pPr>
+      <w:r>
+        <w:t xml:space="preserve">A kid named Jake caught on to it. Jake was one of the guys at school, and one day at lunch, he was looking at me, analyzing my behavior.</w:t>
+      </w:r>
+    </w:p>
+    <w:p>
+      <w:pPr>
+        <w:pStyle w:val="BodyText"/>
+      </w:pPr>
+      <w:r>
+        <w:t xml:space="preserve">“I act crazy so people don’t mess with me,”</w:t>
+      </w:r>
+      <w:r>
+        <w:t xml:space="preserve"> </w:t>
+      </w:r>
+      <w:r>
+        <w:t xml:space="preserve">Jake said, shaking his head.</w:t>
+      </w:r>
+      <w:r>
+        <w:t xml:space="preserve"> </w:t>
+      </w:r>
+      <w:r>
+        <w:t xml:space="preserve">“But I’m really actually normal. I feel like you are the other way around. I feel like you are acting normal.”</w:t>
+      </w:r>
+    </w:p>
+    <w:p>
+      <w:pPr>
+        <w:pStyle w:val="BodyText"/>
+      </w:pPr>
+      <w:r>
+        <w:t xml:space="preserve">He was right. Inside the Castle on the Hill, I was learning to code switch. I was learning to turn on the polish. But out on the streets, catching those two buses through the worst neighborhoods in the city, the</w:t>
+      </w:r>
+      <w:r>
+        <w:t xml:space="preserve"> </w:t>
+      </w:r>
+      <w:r>
+        <w:t xml:space="preserve">“normal”</w:t>
+      </w:r>
+      <w:r>
+        <w:t xml:space="preserve"> </w:t>
+      </w:r>
+      <w:r>
+        <w:t xml:space="preserve">kid was dying, and something much darker was taking the wheel. I was adapting to the environment.</w:t>
+      </w:r>
+    </w:p>
+    <w:p>
+      <w:pPr>
+        <w:pStyle w:val="BodyText"/>
+      </w:pPr>
+      <w:r>
+        <w:t xml:space="preserve">And that adaptation was about to lead directly to North Avenue.</w:t>
       </w:r>
     </w:p>
     <w:p>
@@ -2182,14 +2018,14 @@
         </w:pict>
       </w:r>
     </w:p>
-    <w:bookmarkEnd w:id="16"/>
-    <w:bookmarkStart w:id="17" w:name="Xa7d5c734265f2935159e57c2c2b3a22751cac93"/>
+    <w:bookmarkEnd w:id="19"/>
+    <w:bookmarkStart w:id="20" w:name="chapter-7-mechanical-failures"/>
     <w:p>
       <w:pPr>
         <w:pStyle w:val="Heading1"/>
       </w:pPr>
       <w:r>
-        <w:t xml:space="preserve">Chapter 7: The Bayonet and the Rules of Engagement</w:t>
+        <w:t xml:space="preserve">Chapter 7: Mechanical Failures</w:t>
       </w:r>
     </w:p>
     <w:p>
@@ -2216,295 +2052,779 @@
         <w:pStyle w:val="FirstParagraph"/>
       </w:pPr>
       <w:r>
-        <w:t xml:space="preserve">There are shitholes, and then there is Curtis Bay.</w:t>
-      </w:r>
-      <w:r>
-        <w:t xml:space="preserve"> </w:t>
-      </w:r>
-      <w:r>
-        <w:t xml:space="preserve">It sits on the southern tip of the city, smelling like chemical runoff and industrial exhaust. I was there hanging out at my friend Chris’s grandmother’s house. I had brought something with me that day. A piece of history. My grandfather, Charlie Thompson, was a Marine in World War II. He had given me his old service bayonet. Heavy steel. Bakelite handle. A weapon designed for the Pacific theater, now sitting on a stoop in South Baltimore because Chris’s grandmother’s husband liked war memorabilia. Chris’s grandfather was a good man. He died of cancer. Everyone in Curtis Bay dies of cancer.</w:t>
-      </w:r>
-      <w:r>
-        <w:t xml:space="preserve"> </w:t>
-      </w:r>
-      <w:r>
-        <w:t xml:space="preserve">We were sitting out front when the trouble started. It was stupid. Trouble in Baltimore usually is.</w:t>
-      </w:r>
-      <w:r>
-        <w:t xml:space="preserve"> </w:t>
-      </w:r>
-      <w:r>
-        <w:t xml:space="preserve">Some neighborhood girls were walking by, messing with Chris. They were flirting in that aggressive way people do around there, throwing shaving cream at him. Chris wiped it off his face and flicked it back. It was playing. It was nothing.</w:t>
-      </w:r>
-      <w:r>
-        <w:t xml:space="preserve"> </w:t>
-      </w:r>
-      <w:r>
-        <w:t xml:space="preserve">Except the foam didn’t hit the girls. It landed on Jerry Rose.</w:t>
-      </w:r>
-      <w:r>
-        <w:t xml:space="preserve"> </w:t>
-      </w:r>
-      <w:r>
-        <w:t xml:space="preserve">Jerry was a local guy who, in typical Baltimore fashion, had an ego made of glass. He didn’t see the joke. He became inconsolable. He started screaming, posturing, demanding respect. He wanted to fight Chris.</w:t>
-      </w:r>
-      <w:r>
-        <w:t xml:space="preserve"> </w:t>
-      </w:r>
-      <w:r>
-        <w:t xml:space="preserve">Now, Chris was a good friend, but he wasn’t built for that. I knew it, and he knew it. I stepped in.</w:t>
-      </w:r>
-      <w:r>
-        <w:t xml:space="preserve"> </w:t>
-      </w:r>
-      <w:r>
-        <w:t xml:space="preserve">“Come on,”</w:t>
-      </w:r>
-      <w:r>
-        <w:t xml:space="preserve"> </w:t>
-      </w:r>
-      <w:r>
-        <w:t xml:space="preserve">Jerry said, turning his focus to me.</w:t>
-      </w:r>
-      <w:r>
-        <w:t xml:space="preserve"> </w:t>
-      </w:r>
-      <w:r>
-        <w:t xml:space="preserve">“I’ll knock you out.”</w:t>
-      </w:r>
-      <w:r>
-        <w:t xml:space="preserve"> </w:t>
-      </w:r>
-      <w:r>
-        <w:t xml:space="preserve">I didn’t even respond.</w:t>
-      </w:r>
-      <w:r>
-        <w:t xml:space="preserve"> </w:t>
-      </w:r>
-      <w:r>
-        <w:t xml:space="preserve">Then he added it, the line that somehow hit different:</w:t>
-      </w:r>
-      <w:r>
-        <w:t xml:space="preserve"> </w:t>
-      </w:r>
-      <w:r>
-        <w:t xml:space="preserve">“I’ll knock you out, big boy.”</w:t>
-      </w:r>
-      <w:r>
-        <w:t xml:space="preserve"> </w:t>
-      </w:r>
-      <w:r>
-        <w:t xml:space="preserve">For some reason that one phrase struck a nerve. To this day I still don’t know exactly why. Maybe it was the cocky tone. Maybe it was the disrespect. But something in me flipped.</w:t>
-      </w:r>
-      <w:r>
-        <w:t xml:space="preserve"> </w:t>
-      </w:r>
-      <w:r>
-        <w:t xml:space="preserve">“Let’s go then.”</w:t>
-      </w:r>
-      <w:r>
-        <w:t xml:space="preserve"> </w:t>
-      </w:r>
-      <w:r>
-        <w:t xml:space="preserve">I didn’t wait for him to get ready. I walked him down. He started backpedaling across the street, realizing too late that I wasn’t intimidated. I caught him in the middle of Church Street.</w:t>
-      </w:r>
-      <w:r>
-        <w:t xml:space="preserve"> </w:t>
-      </w:r>
-      <w:r>
-        <w:t xml:space="preserve">I didn’t throw a haymaker. I threw a low roundhouse, Muay Thai style, chopping into his thigh. The moment his leg buckled, I followed it with a straight cross that put him on the asphalt.</w:t>
-      </w:r>
-      <w:r>
-        <w:t xml:space="preserve"> </w:t>
-      </w:r>
-      <w:r>
-        <w:t xml:space="preserve">He wasn’t out, but he was done. He jumped up, humiliated, and took off running down the alley.</w:t>
-      </w:r>
-      <w:r>
-        <w:t xml:space="preserve"> </w:t>
-      </w:r>
-      <w:r>
-        <w:t xml:space="preserve">“I’ll be back, motherfucker!”</w:t>
-      </w:r>
-      <w:r>
-        <w:t xml:space="preserve"> </w:t>
-      </w:r>
-      <w:r>
-        <w:t xml:space="preserve">I walked back to the stoop and sat down. Me and Chris laughed about it. We thought it was over.</w:t>
-      </w:r>
-      <w:r>
-        <w:t xml:space="preserve"> </w:t>
-      </w:r>
-      <w:r>
-        <w:t xml:space="preserve">Ten minutes later, the alley filled up.</w:t>
-      </w:r>
-      <w:r>
-        <w:t xml:space="preserve"> </w:t>
-      </w:r>
-      <w:r>
-        <w:t xml:space="preserve">Chris nudged me. “I bet Jerry is in that crowd.”</w:t>
-      </w:r>
-      <w:r>
-        <w:t xml:space="preserve"> </w:t>
-      </w:r>
-      <w:r>
-        <w:t xml:space="preserve">He was right. A mob was moving toward us, and right in the front was Jerry’s little muppet ass, bouncing around, pointing, yelling, “I told you I’d be back, bitch!”</w:t>
-      </w:r>
-      <w:r>
-        <w:t xml:space="preserve"> </w:t>
-      </w:r>
-      <w:r>
-        <w:t xml:space="preserve">The math had changed. One on one is a fight. One on ten is a hospitalization.</w:t>
-      </w:r>
-      <w:r>
-        <w:t xml:space="preserve"> </w:t>
-      </w:r>
-      <w:r>
-        <w:t xml:space="preserve">I jumped off the stoop. I grabbed the bayonet.</w:t>
-      </w:r>
-      <w:r>
-        <w:t xml:space="preserve"> </w:t>
-      </w:r>
-      <w:r>
-        <w:t xml:space="preserve">I pulled it from its metal sheath. It made a loud, satisfying shiiiing sound. The sound of real steel. I walked out to the center of the street to meet the line. I didn’t hold it like a knife. I held it like the tool of war it was.</w:t>
-      </w:r>
-      <w:r>
-        <w:t xml:space="preserve"> </w:t>
-      </w:r>
-      <w:r>
-        <w:t xml:space="preserve">“If it’s going to be all of you against me,” I said, sweeping the blade across the horizon of them, “it’s going to be me and this against all of you.”</w:t>
-      </w:r>
-      <w:r>
-        <w:t xml:space="preserve"> </w:t>
-      </w:r>
-      <w:r>
-        <w:t xml:space="preserve">The crowd hesitated. They wanted to stomp a kid, not get gutted by an antique Marine weapon.</w:t>
-      </w:r>
-      <w:r>
-        <w:t xml:space="preserve"> </w:t>
-      </w:r>
-      <w:r>
-        <w:t xml:space="preserve">Chris chimed in from the back, his voice matter-of-fact. “He will stab you. He has stabbed people before.”</w:t>
-      </w:r>
-      <w:r>
-        <w:t xml:space="preserve"> </w:t>
-      </w:r>
-      <w:r>
-        <w:t xml:space="preserve">It was the best reference letter I ever got.</w:t>
-      </w:r>
-      <w:r>
-        <w:t xml:space="preserve"> </w:t>
-      </w:r>
-      <w:r>
-        <w:t xml:space="preserve">The hesitation turned into a full stop. One of the guys stepped forward, hands up. “It don’t gotta be like that, man. Jerry just wants another go.”</w:t>
-      </w:r>
-      <w:r>
-        <w:t xml:space="preserve"> </w:t>
-      </w:r>
-      <w:r>
-        <w:t xml:space="preserve">I looked at Jerry. I looked at the crowd.</w:t>
-      </w:r>
-      <w:r>
-        <w:t xml:space="preserve"> </w:t>
-      </w:r>
-      <w:r>
-        <w:t xml:space="preserve">Truth is, I was way more balls than brains back then. I was fucking dumb. It was far more likely they would just jump me the second the bayonet was out of reach. But man, it felt so good beating Jerry’s ass earlier. My risk analysis was terrible, but I went ahead with it anyway.</w:t>
-      </w:r>
-      <w:r>
-        <w:t xml:space="preserve"> </w:t>
-      </w:r>
-      <w:r>
-        <w:t xml:space="preserve">“Fine,” I said.</w:t>
-      </w:r>
-      <w:r>
-        <w:t xml:space="preserve"> </w:t>
-      </w:r>
-      <w:r>
-        <w:t xml:space="preserve">I turned to Chris and handed him the bayonet. “Hold this. If they jump me, just bring it to me. I’ll handle the rest.” While I know Chris wasn’t built for that life, I was confident that he knew I would fuck him up if he let me get jumped and didn’t at least bring me the bayonet.</w:t>
-      </w:r>
-      <w:r>
-        <w:t xml:space="preserve"> </w:t>
-      </w:r>
-      <w:r>
-        <w:t xml:space="preserve">I was a little nervous. Handing away my force multiplier was a risk. But I’ve done dumber shit.</w:t>
-      </w:r>
-      <w:r>
-        <w:t xml:space="preserve"> </w:t>
-      </w:r>
-      <w:r>
-        <w:t xml:space="preserve">I met Jerry on the street line. Here we go again.</w:t>
-      </w:r>
-      <w:r>
-        <w:t xml:space="preserve"> </w:t>
-      </w:r>
-      <w:r>
-        <w:t xml:space="preserve">As soon as I got close enough, I threw the exact same combination. Muscle memory. The leg kick landed hard. I missed the cross, but the damage was done. Jerry stumbled back, rubbing his thigh, looking panicked.</w:t>
-      </w:r>
-      <w:r>
-        <w:t xml:space="preserve"> </w:t>
-      </w:r>
-      <w:r>
-        <w:t xml:space="preserve">“Hey!” he yelled. “No kicking!”</w:t>
-      </w:r>
-      <w:r>
-        <w:t xml:space="preserve"> </w:t>
-      </w:r>
-      <w:r>
-        <w:t xml:space="preserve">I actually laughed. “You asked for this. There ain’t no rules.”</w:t>
-      </w:r>
-      <w:r>
-        <w:t xml:space="preserve"> </w:t>
-      </w:r>
-      <w:r>
-        <w:t xml:space="preserve">“No kicking,” he pleaded. The crowd was silent. They were watching their champion try to negotiate the terms of his own ass-kicking.</w:t>
-      </w:r>
-      <w:r>
-        <w:t xml:space="preserve"> </w:t>
-      </w:r>
-      <w:r>
-        <w:t xml:space="preserve">“The next time I touch you,” I said, “it’s going to be worse.”</w:t>
-      </w:r>
-      <w:r>
-        <w:t xml:space="preserve"> </w:t>
-      </w:r>
-      <w:r>
-        <w:t xml:space="preserve">Jerry started rethinking his life choices. That pain from the second unchecked leg kick he ate must’ve been setting in. He lost his nerve. He looked back at his friends, hoping they would save him, but they just encouraged him to get back in there. They wanted blood, even if it was his.</w:t>
-      </w:r>
-      <w:r>
-        <w:t xml:space="preserve"> </w:t>
-      </w:r>
-      <w:r>
-        <w:t xml:space="preserve">He came back out for one last try. He was slow, hesitant.</w:t>
-      </w:r>
-      <w:r>
-        <w:t xml:space="preserve"> </w:t>
-      </w:r>
-      <w:r>
-        <w:t xml:space="preserve">I didn’t even punch him. I just bitch-slapped the shit out of him. The sound cracked through the street. It was worse than a punch. A punch is violence. A slap is disrespect.</w:t>
-      </w:r>
-      <w:r>
-        <w:t xml:space="preserve"> </w:t>
-      </w:r>
-      <w:r>
-        <w:t xml:space="preserve">Jerry wilted. He turned around, walked back into the crowd, and disappeared down the alley.</w:t>
-      </w:r>
-      <w:r>
-        <w:t xml:space="preserve"> </w:t>
-      </w:r>
-      <w:r>
-        <w:t xml:space="preserve">His friends lingered for a second. Some of them actually came over and nodded, saying we were cool. They respected the outcome. I nodded back, but I walked straight to Chris and took the bayonet back. I stayed on edge until we were back inside the house with the door locked.</w:t>
-      </w:r>
-      <w:r>
-        <w:t xml:space="preserve"> </w:t>
-      </w:r>
-      <w:r>
-        <w:t xml:space="preserve">I looked at the bayonet. It had done its job without drawing a drop of blood.</w:t>
-      </w:r>
-      <w:r>
-        <w:t xml:space="preserve"> </w:t>
-      </w:r>
-      <w:r>
-        <w:t xml:space="preserve">Another lesson learned: The threat of violence is often more effective than its actual use. Sometimes you don’t need to use the weapon. They just need to know you’re willing to take it to the end. Ill never forget how the temperature changed when Chris mentioned I stabbed people before. I didnt say it , I didnt brag, I didnt talk shit but the calm matter of fact manner that he mentioned the prior events just took everyone from a riled up mob to a much more demure group. I guess no one really wants to get stabbed.</w:t>
+        <w:t xml:space="preserve">I was fourteen the first time I had to stab someone.</w:t>
+      </w:r>
+      <w:r>
+        <w:t xml:space="preserve"> </w:t>
+      </w:r>
+      <w:r>
+        <w:t xml:space="preserve">It’s a fucking shame that a kid growing up in America has to say that sentence out loud. People hear it and assume I’m bragging or exaggerating. I’m not. I was a tall, lanky kid, still soft around the edges, who hadn’t fully grown into his bones yet. Baltimore didn’t care what I looked like. Baltimore only cared that I was standing in the wrong place.</w:t>
+      </w:r>
+      <w:r>
+        <w:t xml:space="preserve"> </w:t>
+      </w:r>
+      <w:r>
+        <w:t xml:space="preserve">Me and Big Ed were trying to get home. The bus broke down and the driver kicked everyone off. No explanations. No backup plan. Just “everybody off.” That was MTA back then. It still is in some places. We figured we’d walk to the next connecting stop.</w:t>
+      </w:r>
+      <w:r>
+        <w:t xml:space="preserve"> </w:t>
+      </w:r>
+      <w:r>
+        <w:t xml:space="preserve">Bad idea.</w:t>
+      </w:r>
+      <w:r>
+        <w:t xml:space="preserve"> </w:t>
+      </w:r>
+      <w:r>
+        <w:t xml:space="preserve">That walk took us down North Avenue, right across the street from Greenmount Cemetery. If you know Baltimore, you know Greenmount. High stone walls, miles of graves, dead leaves, and silence. A city of the dead sitting in the middle of the city of the living, or what passes for living. We were on the opposite side of the street, just trying to get past it.</w:t>
+      </w:r>
+      <w:r>
+        <w:t xml:space="preserve"> </w:t>
+      </w:r>
+      <w:r>
+        <w:t xml:space="preserve">We were halfway down the block when it happened.</w:t>
+      </w:r>
+      <w:r>
+        <w:t xml:space="preserve"> </w:t>
+      </w:r>
+      <w:r>
+        <w:t xml:space="preserve">I didn’t hear footsteps. I didn’t hear yelling. I just felt my body jerk violently sideways. A grown man came flying in from behind and clotheslined me so hard my feet left the ground. I hit the pavement hard. Before I could get up, they grabbed me and dragged me into a side street.</w:t>
+      </w:r>
+      <w:r>
+        <w:t xml:space="preserve"> </w:t>
+      </w:r>
+      <w:r>
+        <w:t xml:space="preserve">Ed didn’t wait. He ran. I can’t blame him. He was fourteen too. But that moment burned something into me: when things go bad, you might be completely alone.</w:t>
+      </w:r>
+      <w:r>
+        <w:t xml:space="preserve"> </w:t>
+      </w:r>
+      <w:r>
+        <w:t xml:space="preserve">Two grown men stood over me, screaming.</w:t>
+      </w:r>
+      <w:r>
+        <w:t xml:space="preserve"> </w:t>
+      </w:r>
+      <w:r>
+        <w:t xml:space="preserve">“Why you do that, yo? Why you do that, yo?”</w:t>
+      </w:r>
+      <w:r>
+        <w:t xml:space="preserve"> </w:t>
+      </w:r>
+      <w:r>
+        <w:t xml:space="preserve">I hadn’t said a word. I hadn’t even looked at them. But they kept repeating it like it gave them a reason to beat the hell out of a white kid. They punched me, kicked me into the brick wall, cracked my ribs. My confusion lasted maybe three seconds. Then instinct woke up.</w:t>
+      </w:r>
+      <w:r>
+        <w:t xml:space="preserve"> </w:t>
+      </w:r>
+      <w:r>
+        <w:t xml:space="preserve">I thought they were going to beat me to death.</w:t>
+      </w:r>
+      <w:r>
+        <w:t xml:space="preserve"> </w:t>
+      </w:r>
+      <w:r>
+        <w:t xml:space="preserve">I reached into my pocket. All I had was a cheap pen. I wasn’t carrying a knife yet. I was still innocent enough to think I didn’t need one. One of them grabbed my collar and yanked me up to his face. I remember thinking I was going to catch hell at home for letting them tear my dorky white-and-green striped shirt.</w:t>
+      </w:r>
+      <w:r>
+        <w:t xml:space="preserve"> </w:t>
+      </w:r>
+      <w:r>
+        <w:t xml:space="preserve">That was the moment my brain snapped from confusion to survival.</w:t>
+      </w:r>
+      <w:r>
+        <w:t xml:space="preserve"> </w:t>
+      </w:r>
+      <w:r>
+        <w:t xml:space="preserve">No thought. No hesitation. Just a wild, desperate swing.</w:t>
+      </w:r>
+      <w:r>
+        <w:t xml:space="preserve"> </w:t>
+      </w:r>
+      <w:r>
+        <w:t xml:space="preserve">I came in with a looping, icepick-style stab using everything I had. It felt like stabbing Play-Doh. The pen lodged deep. To this day I can’t remember the guy’s face, only his friend’s look of pure horror. People have told me that’s the mind protecting a fourteen-year-old boy. I remember the satisfying feeling of it sticking in there good, though. Even now it brings a small, dark smile. I hope that fucking loser lived and changed his ways. I believe in second chances.</w:t>
+      </w:r>
+      <w:r>
+        <w:t xml:space="preserve"> </w:t>
+      </w:r>
+      <w:r>
+        <w:t xml:space="preserve">He saw the motion, saw something pierce his friend’s neck, and ran like he’d been shot. I bolted. Full sprint. No looking back. I walked the rest of the way home, a long way, thinking one stupid thing the whole time: I hope I don’t get punished for the torn shirt.</w:t>
+      </w:r>
+      <w:r>
+        <w:t xml:space="preserve"> </w:t>
+      </w:r>
+      <w:r>
+        <w:t xml:space="preserve">I don’t know what happened to the guy I stabbed. All I know is he didn’t chase me.</w:t>
+      </w:r>
+      <w:r>
+        <w:t xml:space="preserve"> </w:t>
+      </w:r>
+      <w:r>
+        <w:t xml:space="preserve">That moment changed something in me. Not in a dramatic “this is the day I became a man” way. More like a quiet switch flipping. At fourteen I learned: grown men will hurt a kid, the world will not pause to help you, and your friends might run. Your only chance is whatever you can do in the next quarter-second.</w:t>
+      </w:r>
+      <w:r>
+        <w:t xml:space="preserve"> </w:t>
+      </w:r>
+      <w:r>
+        <w:t xml:space="preserve">People hear stories like this and think trauma. Pain. Psychological scars. For me it wasn’t a wound. It was information. The world showed me how it worked. I adjusted.</w:t>
+      </w:r>
+    </w:p>
+    <w:p>
+      <w:pPr>
+        <w:pStyle w:val="BodyText"/>
+      </w:pPr>
+      <w:r>
+        <w:t xml:space="preserve">That adjustment became the new baseline. Sometime later that same year, I was catching the bus from City College to the number 64 switch at North Avenue. It was me, Big Ed—who had fled during the pen stabbing—and a kid named Rob Croft.</w:t>
+      </w:r>
+    </w:p>
+    <w:p>
+      <w:pPr>
+        <w:pStyle w:val="BodyText"/>
+      </w:pPr>
+      <w:r>
+        <w:t xml:space="preserve">Rob was a ginger with strawberry blonde hair, and he had the most hollow, dead eyes I had ever seen on a kid. He was white trash like me, but he was broken on a level I couldn’t even comprehend. The rumor was that he was a victim of the local</w:t>
+      </w:r>
+      <w:r>
+        <w:t xml:space="preserve"> </w:t>
+      </w:r>
+      <w:r>
+        <w:t xml:space="preserve">“pay for play”</w:t>
+      </w:r>
+      <w:r>
+        <w:t xml:space="preserve"> </w:t>
+      </w:r>
+      <w:r>
+        <w:t xml:space="preserve">pedophiles in his neighborhood. Whatever happened to him, it left him profoundly damaged. But we were school friends, and I liked talking to him.</w:t>
+      </w:r>
+    </w:p>
+    <w:p>
+      <w:pPr>
+        <w:pStyle w:val="BodyText"/>
+      </w:pPr>
+      <w:r>
+        <w:t xml:space="preserve">We were on the bus when this skinny little skater punk and his friends started running their mouths. He was with a fat kid who looked like the Hawaiian Punch mascot, a tall, goofy kid in a trench coat, and a pretty girl named Sasha. They were all white kids. The skater punk had a piece of paper with a printed-out joke on it—something stupid like,</w:t>
+      </w:r>
+      <w:r>
+        <w:t xml:space="preserve"> </w:t>
+      </w:r>
+      <w:r>
+        <w:t xml:space="preserve">“Speak slowly, I’m blonde.”</w:t>
+      </w:r>
+    </w:p>
+    <w:p>
+      <w:pPr>
+        <w:pStyle w:val="BodyText"/>
+      </w:pPr>
+      <w:r>
+        <w:t xml:space="preserve">I didn’t get the joke. I told him as much.</w:t>
+      </w:r>
+    </w:p>
+    <w:p>
+      <w:pPr>
+        <w:pStyle w:val="BodyText"/>
+      </w:pPr>
+      <w:r>
+        <w:t xml:space="preserve">“Well, you’re fucking retarded,”</w:t>
+      </w:r>
+      <w:r>
+        <w:t xml:space="preserve"> </w:t>
+      </w:r>
+      <w:r>
+        <w:t xml:space="preserve">he said.</w:t>
+      </w:r>
+    </w:p>
+    <w:p>
+      <w:pPr>
+        <w:pStyle w:val="BodyText"/>
+      </w:pPr>
+      <w:r>
+        <w:t xml:space="preserve">I was instantly furious. I hadn’t even engaged this kid, and he was taking shots. The argument escalated for the entire fifteen-minute ride to North Avenue. I finally told him to get off the bus at the next stop so I could beat his ass.</w:t>
+      </w:r>
+    </w:p>
+    <w:p>
+      <w:pPr>
+        <w:pStyle w:val="BodyText"/>
+      </w:pPr>
+      <w:r>
+        <w:t xml:space="preserve">I turned to Big Ed.</w:t>
+      </w:r>
+      <w:r>
+        <w:t xml:space="preserve"> </w:t>
+      </w:r>
+      <w:r>
+        <w:t xml:space="preserve">“There’s three of them. You got my back?”</w:t>
+      </w:r>
+      <w:r>
+        <w:t xml:space="preserve"> </w:t>
+      </w:r>
+      <w:r>
+        <w:t xml:space="preserve">“No,”</w:t>
+      </w:r>
+      <w:r>
+        <w:t xml:space="preserve"> </w:t>
+      </w:r>
+      <w:r>
+        <w:t xml:space="preserve">Ed said.</w:t>
+      </w:r>
+      <w:r>
+        <w:t xml:space="preserve"> </w:t>
+      </w:r>
+      <w:r>
+        <w:t xml:space="preserve">“I don’t want to get involved.”</w:t>
+      </w:r>
+      <w:r>
+        <w:t xml:space="preserve"> </w:t>
+      </w:r>
+      <w:r>
+        <w:t xml:space="preserve">“Can you at least hold my books? If they beat my ass and throw my books down the sewer, my dad is going to kill me.”</w:t>
+      </w:r>
+      <w:r>
+        <w:t xml:space="preserve"> </w:t>
+      </w:r>
+      <w:r>
+        <w:t xml:space="preserve">“I don’t want to be involved,”</w:t>
+      </w:r>
+      <w:r>
+        <w:t xml:space="preserve"> </w:t>
+      </w:r>
+      <w:r>
+        <w:t xml:space="preserve">Ed repeated.</w:t>
+      </w:r>
+    </w:p>
+    <w:p>
+      <w:pPr>
+        <w:pStyle w:val="BodyText"/>
+      </w:pPr>
+      <w:r>
+        <w:t xml:space="preserve">That was Big Ed. Always reliable when the temperature rose.</w:t>
+      </w:r>
+    </w:p>
+    <w:p>
+      <w:pPr>
+        <w:pStyle w:val="BodyText"/>
+      </w:pPr>
+      <w:r>
+        <w:t xml:space="preserve">Rob Croft, sitting there in a cheap grey jacket with black sleeves, looked at me. His voice was ice-cold.</w:t>
+      </w:r>
+      <w:r>
+        <w:t xml:space="preserve"> </w:t>
+      </w:r>
+      <w:r>
+        <w:t xml:space="preserve">“I got your back. Don’t worry about it.”</w:t>
+      </w:r>
+    </w:p>
+    <w:p>
+      <w:pPr>
+        <w:pStyle w:val="BodyText"/>
+      </w:pPr>
+      <w:r>
+        <w:t xml:space="preserve">We got off the bus at North Avenue. The skater punk, Hawaiian Punch, Trench Coat, and Sasha followed us out.</w:t>
+      </w:r>
+    </w:p>
+    <w:p>
+      <w:pPr>
+        <w:pStyle w:val="BodyText"/>
+      </w:pPr>
+      <w:r>
+        <w:t xml:space="preserve">The bus driver didn’t pull away. He put the bus in park, leaned out the window, and settled in to watch the show.</w:t>
+      </w:r>
+    </w:p>
+    <w:p>
+      <w:pPr>
+        <w:pStyle w:val="BodyText"/>
+      </w:pPr>
+      <w:r>
+        <w:t xml:space="preserve">The skater punk started yapping again, trying to build himself up. Before I could even swing, Rob Croft stepped forward. He didn’t yell. He didn’t posture. He just looked at Hawaiian Punch and Trench Coat with those dead eyes and pointed at Sasha.</w:t>
+      </w:r>
+    </w:p>
+    <w:p>
+      <w:pPr>
+        <w:pStyle w:val="BodyText"/>
+      </w:pPr>
+      <w:r>
+        <w:t xml:space="preserve">“If one of you motherfuckers jump in,”</w:t>
+      </w:r>
+      <w:r>
+        <w:t xml:space="preserve"> </w:t>
+      </w:r>
+      <w:r>
+        <w:t xml:space="preserve">Rob said, his voice flat and calm,</w:t>
+      </w:r>
+      <w:r>
+        <w:t xml:space="preserve"> </w:t>
+      </w:r>
+      <w:r>
+        <w:t xml:space="preserve">“when we’re done beating your ass, I’m gonna rape your girlfriend right here.”</w:t>
+      </w:r>
+    </w:p>
+    <w:p>
+      <w:pPr>
+        <w:pStyle w:val="BodyText"/>
+      </w:pPr>
+      <w:r>
+        <w:t xml:space="preserve">The temperature on the street plummeted to absolute zero. I was kind of stunned by this myself. I mean, who fucking says that? Well, Rob did, because he was dead inside and broken. It was his way of standing up for his friend.</w:t>
+      </w:r>
+    </w:p>
+    <w:p>
+      <w:pPr>
+        <w:pStyle w:val="BodyText"/>
+      </w:pPr>
+      <w:r>
+        <w:t xml:space="preserve">The two friends froze. They were expecting a standard teenage fistfight. They were not accustomed to that level of pure, sociopathic darkness. There were no skateboards to hit me with. They were defenseless against that kind of threat. They completely backed off. It was just me and the skater punk.</w:t>
+      </w:r>
+    </w:p>
+    <w:p>
+      <w:pPr>
+        <w:pStyle w:val="BodyText"/>
+      </w:pPr>
+      <w:r>
+        <w:t xml:space="preserve">The kid panicked and dove at me, trying to grab my balls for a desperate takedown. In South Baltimore, we are taught from an early age to protect our balls from cheap shots. I easily stuffed it, sprawled, and brawled, dropping him to the pavement. I just rained punches on him.</w:t>
+      </w:r>
+      <w:r>
+        <w:t xml:space="preserve"> </w:t>
+      </w:r>
+      <w:r>
+        <w:rPr>
+          <w:i/>
+          <w:iCs/>
+        </w:rPr>
+        <w:t xml:space="preserve">Boom, boom, boom.</w:t>
+      </w:r>
+      <w:r>
+        <w:t xml:space="preserve"> </w:t>
+      </w:r>
+      <w:r>
+        <w:t xml:space="preserve">Beating the absolute hell out of him. He was crying like a little bitch. Not an ounce of self-respect. I didn’t even stab him. I just gave him an ass-whipping on the same level I would’ve given anyone. There was no malice to it.</w:t>
+      </w:r>
+    </w:p>
+    <w:p>
+      <w:pPr>
+        <w:pStyle w:val="BodyText"/>
+      </w:pPr>
+      <w:r>
+        <w:t xml:space="preserve">And the entire time, the adult bus driver was hanging out of his window, cheering.</w:t>
+      </w:r>
+      <w:r>
+        <w:t xml:space="preserve"> </w:t>
+      </w:r>
+      <w:r>
+        <w:t xml:space="preserve">“You go, champ! You go, champ!”</w:t>
+      </w:r>
+    </w:p>
+    <w:p>
+      <w:pPr>
+        <w:pStyle w:val="BodyText"/>
+      </w:pPr>
+      <w:r>
+        <w:t xml:space="preserve">The kid eventually scrambled up, wiped the blood off his face, and wandered off with his friends. I never saw any of them again. A lot of kids disappeared during the</w:t>
+      </w:r>
+      <w:r>
+        <w:t xml:space="preserve"> </w:t>
+      </w:r>
+      <w:r>
+        <w:t xml:space="preserve">“great filter”</w:t>
+      </w:r>
+      <w:r>
+        <w:t xml:space="preserve"> </w:t>
+      </w:r>
+      <w:r>
+        <w:t xml:space="preserve">of freshman year at City. Rob Croft was probably one of them. He was another tragic loss to the streets of Baltimore. I don’t know what happened to him, but if he didn’t kill himself, he almost certainly ended up in prison for murder. There was no coming back from where he was.</w:t>
+      </w:r>
+    </w:p>
+    <w:p>
+      <w:pPr>
+        <w:pStyle w:val="BodyText"/>
+      </w:pPr>
+      <w:r>
+        <w:t xml:space="preserve">But the next day, when I got on the bus, that same driver pointed to the seat right behind him.</w:t>
+      </w:r>
+    </w:p>
+    <w:p>
+      <w:pPr>
+        <w:pStyle w:val="BodyText"/>
+      </w:pPr>
+      <w:r>
+        <w:t xml:space="preserve">“I got a seat for you, Champ,”</w:t>
+      </w:r>
+      <w:r>
+        <w:t xml:space="preserve"> </w:t>
+      </w:r>
+      <w:r>
+        <w:t xml:space="preserve">he said. He saved that seat for me and called me</w:t>
+      </w:r>
+      <w:r>
+        <w:t xml:space="preserve"> </w:t>
+      </w:r>
+      <w:r>
+        <w:t xml:space="preserve">“Champ”</w:t>
+      </w:r>
+      <w:r>
+        <w:t xml:space="preserve"> </w:t>
+      </w:r>
+      <w:r>
+        <w:t xml:space="preserve">for the rest of the year.</w:t>
+      </w:r>
+    </w:p>
+    <w:p>
+      <w:pPr>
+        <w:pStyle w:val="BodyText"/>
+      </w:pPr>
+      <w:r>
+        <w:t xml:space="preserve">That was North Avenue. That was the environment. And a year later, on that same road, that environment was tested again.</w:t>
+      </w:r>
+      <w:r>
+        <w:t xml:space="preserve"> </w:t>
+      </w:r>
+      <w:r>
+        <w:t xml:space="preserve">The corner of St. Paul and North Avenue was the kind of place where something bad could find you even if you weren’t looking for it. It was November, creeping up on Thanksgiving. The sky was flat, cloudy gray. North Avenue was a busy four-lane divided street. The tall brick and concrete buildings on either side acted like a canyon, trapping the heavy smell of diesel and gas from the MTA buses. That constant hum of traffic and sharp, impatient horns mixed with the greasy scent of lake trout and chicken boxes drifting down the block.</w:t>
+      </w:r>
+      <w:r>
+        <w:t xml:space="preserve"> </w:t>
+      </w:r>
+      <w:r>
+        <w:t xml:space="preserve">It was busted pavement and a big black cast-iron fence in front of the old cathedral, a place that looked holy from a distance but meant nothing on the ground. God didn’t hang around there. The crackheads did. The stickup crews did. Kids like me did, because that was where the bus stopped.</w:t>
+      </w:r>
+      <w:r>
+        <w:t xml:space="preserve"> </w:t>
+      </w:r>
+      <w:r>
+        <w:t xml:space="preserve">I was fifteen and already carried myself like someone who knew the rules of the street. Not because I was tough, but because the alternative was getting hurt.</w:t>
+      </w:r>
+      <w:r>
+        <w:t xml:space="preserve"> </w:t>
+      </w:r>
+      <w:r>
+        <w:t xml:space="preserve">I saw them coming from a mile away.</w:t>
+      </w:r>
+      <w:r>
+        <w:t xml:space="preserve"> </w:t>
+      </w:r>
+      <w:r>
+        <w:t xml:space="preserve">My friend Matt and I were waiting for the next bus when a group of five guys walked by and eyed us. They saw Matt’s Starter jacket and went around the corner to plan their move. When they came back they walked straight up to him.</w:t>
+      </w:r>
+      <w:r>
+        <w:t xml:space="preserve"> </w:t>
+      </w:r>
+      <w:r>
+        <w:t xml:space="preserve">“I like your jacket, yo.”</w:t>
+      </w:r>
+      <w:r>
+        <w:t xml:space="preserve"> </w:t>
+      </w:r>
+      <w:r>
+        <w:t xml:space="preserve">Matt said, “I like it too.”</w:t>
+      </w:r>
+      <w:r>
+        <w:t xml:space="preserve"> </w:t>
+      </w:r>
+      <w:r>
+        <w:t xml:space="preserve">“Give it to me,” one of them said, and punched him.</w:t>
+      </w:r>
+      <w:r>
+        <w:t xml:space="preserve"> </w:t>
+      </w:r>
+      <w:r>
+        <w:t xml:space="preserve">Matt was a soccer player, not a fighter. He ran his ass off. I probably could have run too, but I had a secret.</w:t>
+      </w:r>
+      <w:r>
+        <w:t xml:space="preserve"> </w:t>
+      </w:r>
+      <w:r>
+        <w:t xml:space="preserve">Marcello came at me first.</w:t>
+      </w:r>
+      <w:r>
+        <w:t xml:space="preserve"> </w:t>
+      </w:r>
+      <w:r>
+        <w:t xml:space="preserve">Five of them circled in, tightening the space, my back pinned against the cast-iron fence. I remember his face like a sketch: hard eyes, lip curled.</w:t>
+      </w:r>
+      <w:r>
+        <w:t xml:space="preserve"> </w:t>
+      </w:r>
+      <w:r>
+        <w:t xml:space="preserve">“White motherfucker.”</w:t>
+      </w:r>
+      <w:r>
+        <w:t xml:space="preserve"> </w:t>
+      </w:r>
+      <w:r>
+        <w:t xml:space="preserve">He was talking shit, trying to get in my head. I was already past listening. My pulse was too loud. The only things that mattered were distance and timing. If he got close enough to grab me, the others would pile on and it would be over.</w:t>
+      </w:r>
+      <w:r>
+        <w:t xml:space="preserve"> </w:t>
+      </w:r>
+      <w:r>
+        <w:t xml:space="preserve">Instinct took over. Not training. Not technique. Just a kid who had fought enough to know you go first or you go down.</w:t>
+      </w:r>
+      <w:r>
+        <w:t xml:space="preserve"> </w:t>
+      </w:r>
+      <w:r>
+        <w:t xml:space="preserve">I snapped a front kick straight into his face. Fast. Clean. Reflex. The ball of my foot split his lip. For one second the circle hesitated.</w:t>
+      </w:r>
+      <w:r>
+        <w:t xml:space="preserve"> </w:t>
+      </w:r>
+      <w:r>
+        <w:t xml:space="preserve">Marcello wiped his mouth and grinned. “A karate boy. We like karate boys around here.”</w:t>
+      </w:r>
+      <w:r>
+        <w:t xml:space="preserve"> </w:t>
+      </w:r>
+      <w:r>
+        <w:t xml:space="preserve">Before the words finished, another one came in from behind and smashed me over the head with a board. The shock split my scalp open. Warm blood ran instantly. The world rang like metal. I staggered, and that was the opening Jesse needed.</w:t>
+      </w:r>
+      <w:r>
+        <w:t xml:space="preserve"> </w:t>
+      </w:r>
+      <w:r>
+        <w:t xml:space="preserve">He rushed me, grabbing, pulling, trying to drag me to the ground. He was bigger, older, heavier. If he got me down they would stomp me until there was nothing left. These guys didn’t like it when you fought back. They liked broken kids, not problems.</w:t>
+      </w:r>
+      <w:r>
+        <w:t xml:space="preserve"> </w:t>
+      </w:r>
+      <w:r>
+        <w:t xml:space="preserve">The world snapped into slow motion.</w:t>
+      </w:r>
+      <w:r>
+        <w:t xml:space="preserve"> </w:t>
+      </w:r>
+      <w:r>
+        <w:t xml:space="preserve">My left hand was already in my pocket, fingers wrapped around the handle of my old folding Buck knife. As Jesse tried to drag me down I turned sideways, flicked the blade open, and swung. It wasn’t a flashy move. It was a left hook to the body, with a knife. I didn’t show it to him. I just drove it straight into his chest like a hard punch.</w:t>
+      </w:r>
+      <w:r>
+        <w:t xml:space="preserve"> </w:t>
+      </w:r>
+      <w:r>
+        <w:t xml:space="preserve">I felt the blade pierce his thick jacket. I felt it slide through skin and muscle. Then I felt it hit bone.</w:t>
+      </w:r>
+      <w:r>
+        <w:t xml:space="preserve"> </w:t>
+      </w:r>
+      <w:r>
+        <w:t xml:space="preserve">That impact is what did it.</w:t>
+      </w:r>
+      <w:r>
+        <w:t xml:space="preserve"> </w:t>
+      </w:r>
+      <w:r>
+        <w:t xml:space="preserve">A sudden, sickening mechanical snap ran through my hand. The force driving into his ribs was too much for the pin. The locking mechanism failed. The blade collapsed violently back against the handle and cut me. It didn’t take my fingers off, but it was close.</w:t>
+      </w:r>
+      <w:r>
+        <w:t xml:space="preserve"> </w:t>
+      </w:r>
+      <w:r>
+        <w:t xml:space="preserve">I snapped my arm back to stab him again, ready to keep going, but I didn’t have to.</w:t>
+      </w:r>
+      <w:r>
+        <w:t xml:space="preserve"> </w:t>
+      </w:r>
+      <w:r>
+        <w:t xml:space="preserve">I heard the wet hiss of air leaving his chest like someone letting air out of a tire. The fight left him instantly. He deflated, practically melting off me as his legs gave out. His eyes went wide with the confused look of an animal asking why while he was in the middle of attacking me. The rest of the circle froze, paralyzed by the shock of a fifteen-year-old kid pulling steel.</w:t>
+      </w:r>
+      <w:r>
+        <w:t xml:space="preserve"> </w:t>
+      </w:r>
+      <w:r>
+        <w:t xml:space="preserve">That shock was the only gap I was going to get.</w:t>
+      </w:r>
+      <w:r>
+        <w:t xml:space="preserve"> </w:t>
+      </w:r>
+      <w:r>
+        <w:t xml:space="preserve">The circle broke for half a second. I ran straight through it and sprinted into North Avenue traffic without looking. Tires shrieked. Horns blasted. Cars swerved. I didn’t care. I hit the far sidewalk, grabbed the heavy door, and burst into the Kentucky Fried Chicken like a live grenade.</w:t>
+      </w:r>
+      <w:r>
+        <w:t xml:space="preserve"> </w:t>
+      </w:r>
+      <w:r>
+        <w:t xml:space="preserve">I had maybe ten seconds.</w:t>
+      </w:r>
+      <w:r>
+        <w:t xml:space="preserve"> </w:t>
+      </w:r>
+      <w:r>
+        <w:t xml:space="preserve">I ran to the counter and yelled at the workers behind the bulletproof plexiglass to call 911. They just stared and laughed like it was a joke.</w:t>
+      </w:r>
+      <w:r>
+        <w:t xml:space="preserve"> </w:t>
+      </w:r>
+      <w:r>
+        <w:t xml:space="preserve">Then the heavy glass doors blew open. The crew flooded in behind me.</w:t>
+      </w:r>
+      <w:r>
+        <w:t xml:space="preserve"> </w:t>
+      </w:r>
+      <w:r>
+        <w:t xml:space="preserve">They dragged Jesse inside and laid him across a booth. His chest barely moved. The moment he was down, the entire atmosphere shifted. The laughter behind the glass stopped. This wasn’t a joke anymore. This was one of their own bleeding out on a plastic table.</w:t>
+      </w:r>
+      <w:r>
+        <w:t xml:space="preserve"> </w:t>
+      </w:r>
+      <w:r>
+        <w:t xml:space="preserve">Suddenly it wasn’t just the crew. Grown adults who had nothing to do with the fight started shouting from the corners.</w:t>
+      </w:r>
+      <w:r>
+        <w:t xml:space="preserve"> </w:t>
+      </w:r>
+      <w:r>
+        <w:t xml:space="preserve">“Kill that white motherfucker!”</w:t>
+      </w:r>
+      <w:r>
+        <w:t xml:space="preserve"> </w:t>
+      </w:r>
+      <w:r>
+        <w:t xml:space="preserve">I was completely on my own again. Me against an entire neighborhood.</w:t>
+      </w:r>
+      <w:r>
+        <w:t xml:space="preserve"> </w:t>
+      </w:r>
+      <w:r>
+        <w:t xml:space="preserve">I looked down at my hand. The knife was useless, the lock sheared, the blade loose and dangerous. A mechanical failure in the middle of a war. But they didn’t know that. From the outside the lock still looked fine. All they knew was that a crazy white kid backed into a corner was holding a knife and clearly willing to use it.</w:t>
+      </w:r>
+      <w:r>
+        <w:t xml:space="preserve"> </w:t>
+      </w:r>
+      <w:r>
+        <w:t xml:space="preserve">The circle started forming again, tighter this time. They were trying to get behind me. I scrambled for anything I could throw: salt shakers, pepper shakers, plastic trays, anything to buy a few more seconds.</w:t>
+      </w:r>
+      <w:r>
+        <w:t xml:space="preserve"> </w:t>
+      </w:r>
+      <w:r>
+        <w:t xml:space="preserve">Then someone swung from my blind spot and smashed a forty-ounce bottle over my head.</w:t>
+      </w:r>
+      <w:r>
+        <w:t xml:space="preserve"> </w:t>
+      </w:r>
+      <w:r>
+        <w:t xml:space="preserve">The world detonated in white pain. The shockwave snapped front to back through my skull. My forehead split open. Blood poured into my eye, hot and thick, turning everything into a black-red blur. I tasted iron. I felt myself slipping.</w:t>
+      </w:r>
+      <w:r>
+        <w:t xml:space="preserve"> </w:t>
+      </w:r>
+      <w:r>
+        <w:t xml:space="preserve">Move.</w:t>
+      </w:r>
+      <w:r>
+        <w:t xml:space="preserve"> </w:t>
+      </w:r>
+      <w:r>
+        <w:t xml:space="preserve">I fought through a side gap and ran for the hallway to the bathroom. If I could get into a narrow space, only one or two could come at a time. Like Leonidas at Thermopylae. I hit them with the door, pushed inside, and slammed the lock.</w:t>
+      </w:r>
+      <w:r>
+        <w:t xml:space="preserve"> </w:t>
+      </w:r>
+      <w:r>
+        <w:t xml:space="preserve">The broken Buck knife went into the toilet. Evidence gone.</w:t>
+      </w:r>
+      <w:r>
+        <w:t xml:space="preserve"> </w:t>
+      </w:r>
+      <w:r>
+        <w:t xml:space="preserve">I looked in the mirror. My short spiked hair was matted with blood. One eye was swollen shut. I looked like the Terminator: half dead, half alive, all fight. I laughed. Not because it was funny. Because survival can make a man feel invincible for a second.</w:t>
+      </w:r>
+      <w:r>
+        <w:t xml:space="preserve"> </w:t>
+      </w:r>
+      <w:r>
+        <w:t xml:space="preserve">Then the knock came. Baltimore Police Department.</w:t>
+      </w:r>
+      <w:r>
+        <w:t xml:space="preserve"> </w:t>
+      </w:r>
+      <w:r>
+        <w:t xml:space="preserve">At first I didn’t believe them. I dropped to the floor, looked through the vent, and saw the blue pants. Real uniforms. I opened the door.</w:t>
+      </w:r>
+      <w:r>
+        <w:t xml:space="preserve"> </w:t>
+      </w:r>
+      <w:r>
+        <w:t xml:space="preserve">They kicked the shit out of me immediately. I don’t blame them. All they knew was that a crazy white kid had stabbed someone and was on a rampage inside a packed KFC on North Avenue. I kept saying, “They jumped me. They jumped me.” Eventually the story sorted itself out.</w:t>
+      </w:r>
+      <w:r>
+        <w:t xml:space="preserve"> </w:t>
+      </w:r>
+      <w:r>
+        <w:t xml:space="preserve">One cop stood in the hallway blocking Jesse’s aunt from reaching me. She was screaming that I killed her boy, that she wanted me dead. The officer, a big blond blocky dude, didn’t flinch.</w:t>
+      </w:r>
+      <w:r>
+        <w:t xml:space="preserve"> </w:t>
+      </w:r>
+      <w:r>
+        <w:t xml:space="preserve">“Bitch, if you come down this hall I will blow your fucking brains out. This place is a war zone. This is how you act in war.”</w:t>
+      </w:r>
+      <w:r>
+        <w:t xml:space="preserve"> </w:t>
+      </w:r>
+      <w:r>
+        <w:t xml:space="preserve">Paramedics finally got inside. They wrapped my head in so much gauze I looked like a mummy. When they rolled me out the crowd still wanted blood. I gave them the finger. Got one in.</w:t>
+      </w:r>
+      <w:r>
+        <w:t xml:space="preserve"> </w:t>
+      </w:r>
+      <w:r>
+        <w:t xml:space="preserve">In the ambulance the escorting cop told me not to worry. I did what I had to do. He even gave advice no cop would ever say on record:</w:t>
+      </w:r>
+      <w:r>
+        <w:t xml:space="preserve"> </w:t>
+      </w:r>
+      <w:r>
+        <w:t xml:space="preserve">“When you stab one of those animals, always yank the knife up to finish the job.”</w:t>
+      </w:r>
+      <w:r>
+        <w:t xml:space="preserve"> </w:t>
+      </w:r>
+      <w:r>
+        <w:t xml:space="preserve">They took Jesse and me to different hospitals on opposite sides of the city. The doctor dug glass out of my scalp, poked into the wound to make sure nothing was lodged, then stitched me closed. I felt every pull.</w:t>
+      </w:r>
+      <w:r>
+        <w:t xml:space="preserve"> </w:t>
+      </w:r>
+      <w:r>
+        <w:t xml:space="preserve">A few days later I went back to school. Instant legend.</w:t>
+      </w:r>
+      <w:r>
+        <w:t xml:space="preserve"> </w:t>
+      </w:r>
+      <w:r>
+        <w:t xml:space="preserve">My father told me flat out they would kill me if they saw me again. He handed me a .38 and said, “If they come at you, you better start shooting.”</w:t>
+      </w:r>
+      <w:r>
+        <w:t xml:space="preserve"> </w:t>
+      </w:r>
+      <w:r>
+        <w:t xml:space="preserve">Even the principal looked at me like she knew I was armed. To this day I appreciate Dr. Harris. She could have caused me a lot of trouble, but I think she understood I was just trying to go to school. There were certain realities when navigating the streets of Baltimore trying to get from A to B.</w:t>
+      </w:r>
+      <w:r>
+        <w:t xml:space="preserve"> </w:t>
+      </w:r>
+      <w:r>
+        <w:t xml:space="preserve">And I knew something else, too.</w:t>
+      </w:r>
+      <w:r>
+        <w:t xml:space="preserve"> </w:t>
+      </w:r>
+      <w:r>
+        <w:t xml:space="preserve">I never carried a folding knife again.</w:t>
+      </w:r>
+      <w:r>
+        <w:t xml:space="preserve"> </w:t>
+      </w:r>
+      <w:r>
+        <w:t xml:space="preserve">A lock is a promise, and promises break. A hinge is a weakness, a single point of failure in a safety-critical system. In engineering you learn that every moving part is a liability, a statistical probability of mechanical collapse under load. From that day on I only carried a fixed blade. Simple. One piece of steel. No moving parts to fail you when the world ends.</w:t>
+      </w:r>
+      <w:r>
+        <w:t xml:space="preserve"> </w:t>
+      </w:r>
+      <w:r>
+        <w:t xml:space="preserve">If the system was going to break, it wasn’t going to be because of the hardware.</w:t>
+      </w:r>
+      <w:r>
+        <w:t xml:space="preserve"> </w:t>
+      </w:r>
+      <w:r>
+        <w:t xml:space="preserve">I was still learning.</w:t>
       </w:r>
     </w:p>
     <w:p>
@@ -2514,14 +2834,14 @@
         </w:pict>
       </w:r>
     </w:p>
-    <w:bookmarkEnd w:id="17"/>
-    <w:bookmarkStart w:id="18" w:name="chapter-8-the-stet-docket"/>
+    <w:bookmarkEnd w:id="20"/>
+    <w:bookmarkStart w:id="21" w:name="Xc7f51bae443ee57455858b79d92340219cff2fa"/>
     <w:p>
       <w:pPr>
         <w:pStyle w:val="Heading1"/>
       </w:pPr>
       <w:r>
-        <w:t xml:space="preserve">Chapter 8: The Stet Docket</w:t>
+        <w:t xml:space="preserve">Chapter 8: The Bayonet and the Rules of Engagement</w:t>
       </w:r>
     </w:p>
     <w:p>
@@ -2548,6 +2868,501 @@
         <w:pStyle w:val="FirstParagraph"/>
       </w:pPr>
       <w:r>
+        <w:t xml:space="preserve">There are shitholes, and then there is Curtis Bay.</w:t>
+      </w:r>
+    </w:p>
+    <w:p>
+      <w:pPr>
+        <w:pStyle w:val="BodyText"/>
+      </w:pPr>
+      <w:r>
+        <w:t xml:space="preserve">It sits on the southern tip of the city, smelling like chemical runoff and industrial exhaust. I was there hanging out at my friend Chris’s grandmother’s house. I had brought something with me that day. A piece of history. My grandfather, Charlie Thompson, was a Marine in World War II. He had given me his old service bayonet. Heavy steel. Bakelite handle. A weapon designed for the Pacific theater, now sitting on a stoop in South Baltimore because Chris’s grandmother’s husband liked war memorabilia. Chris’s grandfather was a good man. He died of cancer. Everyone in Curtis Bay dies of cancer.</w:t>
+      </w:r>
+    </w:p>
+    <w:p>
+      <w:pPr>
+        <w:pStyle w:val="BodyText"/>
+      </w:pPr>
+      <w:r>
+        <w:t xml:space="preserve">We were sitting out front when the trouble started. It was stupid. Trouble in Baltimore usually is.</w:t>
+      </w:r>
+    </w:p>
+    <w:p>
+      <w:pPr>
+        <w:pStyle w:val="BodyText"/>
+      </w:pPr>
+      <w:r>
+        <w:t xml:space="preserve">Some neighborhood girls were walking by, messing with Chris. They were flirting in that aggressive way people do around there, throwing shaving cream at him. Chris wiped it off his face and flicked it back. It was playing. It was nothing.</w:t>
+      </w:r>
+    </w:p>
+    <w:p>
+      <w:pPr>
+        <w:pStyle w:val="BodyText"/>
+      </w:pPr>
+      <w:r>
+        <w:t xml:space="preserve">Except the foam didn’t hit the girls. It landed on Jerry Rose.</w:t>
+      </w:r>
+    </w:p>
+    <w:p>
+      <w:pPr>
+        <w:pStyle w:val="BodyText"/>
+      </w:pPr>
+      <w:r>
+        <w:t xml:space="preserve">Jerry was a local guy who, in typical Baltimore fashion, had an ego made of glass. He didn’t see the joke. He became inconsolable. He started screaming, posturing, demanding respect. He wanted to fight Chris.</w:t>
+      </w:r>
+    </w:p>
+    <w:p>
+      <w:pPr>
+        <w:pStyle w:val="BodyText"/>
+      </w:pPr>
+      <w:r>
+        <w:t xml:space="preserve">Now, Chris was a good friend, but he wasn’t built for that. I knew it, and he knew it. I stepped in.</w:t>
+      </w:r>
+    </w:p>
+    <w:p>
+      <w:pPr>
+        <w:pStyle w:val="BodyText"/>
+      </w:pPr>
+      <w:r>
+        <w:t xml:space="preserve">“Come on,” Jerry said, turning his focus to me. “I’ll knock you out.”</w:t>
+      </w:r>
+    </w:p>
+    <w:p>
+      <w:pPr>
+        <w:pStyle w:val="BodyText"/>
+      </w:pPr>
+      <w:r>
+        <w:t xml:space="preserve">I didn’t respond.</w:t>
+      </w:r>
+    </w:p>
+    <w:p>
+      <w:pPr>
+        <w:pStyle w:val="BodyText"/>
+      </w:pPr>
+      <w:r>
+        <w:t xml:space="preserve">Then he added the line that somehow hit different:</w:t>
+      </w:r>
+    </w:p>
+    <w:p>
+      <w:pPr>
+        <w:pStyle w:val="BodyText"/>
+      </w:pPr>
+      <w:r>
+        <w:t xml:space="preserve">“I’ll knock you out, big boy.”</w:t>
+      </w:r>
+    </w:p>
+    <w:p>
+      <w:pPr>
+        <w:pStyle w:val="BodyText"/>
+      </w:pPr>
+      <w:r>
+        <w:t xml:space="preserve">For some reason that one phrase struck a nerve I still can’t explain. Something in me flipped.</w:t>
+      </w:r>
+    </w:p>
+    <w:p>
+      <w:pPr>
+        <w:pStyle w:val="BodyText"/>
+      </w:pPr>
+      <w:r>
+        <w:t xml:space="preserve">“Let’s go then.”</w:t>
+      </w:r>
+    </w:p>
+    <w:p>
+      <w:pPr>
+        <w:pStyle w:val="BodyText"/>
+      </w:pPr>
+      <w:r>
+        <w:t xml:space="preserve">I didn’t wait. I walked him down. He started backpedaling across the street, realizing too late that I wasn’t playing. I caught him in the middle of Church Street.</w:t>
+      </w:r>
+    </w:p>
+    <w:p>
+      <w:pPr>
+        <w:pStyle w:val="BodyText"/>
+      </w:pPr>
+      <w:r>
+        <w:t xml:space="preserve">I threw a low kick into his calf. I had success doing this sparring with my friends, so I kept it in my bag. Being my friend wasn’t always easy. I used to practice on them and would routinely knock them down with that same leg sweep. We played rough as hell.</w:t>
+      </w:r>
+    </w:p>
+    <w:p>
+      <w:pPr>
+        <w:pStyle w:val="BodyText"/>
+      </w:pPr>
+      <w:r>
+        <w:t xml:space="preserve">The moment his leg buckled I followed with a straight cross that dropped him to the asphalt.</w:t>
+      </w:r>
+    </w:p>
+    <w:p>
+      <w:pPr>
+        <w:pStyle w:val="BodyText"/>
+      </w:pPr>
+      <w:r>
+        <w:t xml:space="preserve">He wasn’t out, but he was done. He scrambled up, humiliated, and ran down the alley.</w:t>
+      </w:r>
+    </w:p>
+    <w:p>
+      <w:pPr>
+        <w:pStyle w:val="BodyText"/>
+      </w:pPr>
+      <w:r>
+        <w:t xml:space="preserve">“I’ll be back, motherfucker!”</w:t>
+      </w:r>
+    </w:p>
+    <w:p>
+      <w:pPr>
+        <w:pStyle w:val="BodyText"/>
+      </w:pPr>
+      <w:r>
+        <w:t xml:space="preserve">I walked back to the stoop and sat down. Me and Chris laughed about it. We thought it was over.</w:t>
+      </w:r>
+    </w:p>
+    <w:p>
+      <w:pPr>
+        <w:pStyle w:val="BodyText"/>
+      </w:pPr>
+      <w:r>
+        <w:t xml:space="preserve">Ten minutes later, the alley filled up.</w:t>
+      </w:r>
+    </w:p>
+    <w:p>
+      <w:pPr>
+        <w:pStyle w:val="BodyText"/>
+      </w:pPr>
+      <w:r>
+        <w:t xml:space="preserve">Chris nudged me. “I bet Jerry is in that crowd.”</w:t>
+      </w:r>
+    </w:p>
+    <w:p>
+      <w:pPr>
+        <w:pStyle w:val="BodyText"/>
+      </w:pPr>
+      <w:r>
+        <w:t xml:space="preserve">He was right. A mob was moving toward us, and right in the front was Jerry’s little muppet ass, bouncing around, pointing, yelling, “I told you I’d be back, bitch!”</w:t>
+      </w:r>
+    </w:p>
+    <w:p>
+      <w:pPr>
+        <w:pStyle w:val="BodyText"/>
+      </w:pPr>
+      <w:r>
+        <w:t xml:space="preserve">The math had changed. One on one is a fight. One on ten is a hospitalization.</w:t>
+      </w:r>
+    </w:p>
+    <w:p>
+      <w:pPr>
+        <w:pStyle w:val="BodyText"/>
+      </w:pPr>
+      <w:r>
+        <w:t xml:space="preserve">I jumped off the stoop. I grabbed the bayonet.</w:t>
+      </w:r>
+    </w:p>
+    <w:p>
+      <w:pPr>
+        <w:pStyle w:val="BodyText"/>
+      </w:pPr>
+      <w:r>
+        <w:t xml:space="preserve">Just like back on North Avenue, I had choices. I could’ve run. I was fast and in great shape from being on the wrestling team. No one would’ve known, and if they did, they would’ve done the same thing facing what I faced. But I didn’t. I just had a problem with that concept. I wasn’t brave. I was fucking stupid. I could’ve just gone inside, but unfortunately my risk analysis was still maturing. I had the opportunity to do the smart thing but I didn’t have the capability. A theme that would continue to trouble me.</w:t>
+      </w:r>
+    </w:p>
+    <w:p>
+      <w:pPr>
+        <w:pStyle w:val="BodyText"/>
+      </w:pPr>
+      <w:r>
+        <w:t xml:space="preserve">I pulled it from its metal sheath. It made a loud, satisfying shiiiing sound. The sound of real steel. I walked out to the center of the street to meet the line. I didn’t hold it like a knife. I held it like the tool of war it was.</w:t>
+      </w:r>
+    </w:p>
+    <w:p>
+      <w:pPr>
+        <w:pStyle w:val="BodyText"/>
+      </w:pPr>
+      <w:r>
+        <w:t xml:space="preserve">“If it’s going to be all of you against me,” I said, sweeping the blade across the horizon of them, “it’s going to be me and this against all of you.”</w:t>
+      </w:r>
+    </w:p>
+    <w:p>
+      <w:pPr>
+        <w:pStyle w:val="BodyText"/>
+      </w:pPr>
+      <w:r>
+        <w:t xml:space="preserve">The crowd hesitated. They wanted to stomp a kid, not get gutted by an antique Marine weapon.</w:t>
+      </w:r>
+    </w:p>
+    <w:p>
+      <w:pPr>
+        <w:pStyle w:val="BodyText"/>
+      </w:pPr>
+      <w:r>
+        <w:t xml:space="preserve">Chris chimed in from the back, his voice matter-of-fact but with a melancholy tone. Like he already knew the outcome and almost felt bad for them. “He will stab you. He has stabbed people before.”</w:t>
+      </w:r>
+    </w:p>
+    <w:p>
+      <w:pPr>
+        <w:pStyle w:val="BodyText"/>
+      </w:pPr>
+      <w:r>
+        <w:t xml:space="preserve">It was the best reference letter I ever got. The tone and statement were chilling. The riled-up mob suddenly got real quiet. No one wants to get stabbed.</w:t>
+      </w:r>
+    </w:p>
+    <w:p>
+      <w:pPr>
+        <w:pStyle w:val="BodyText"/>
+      </w:pPr>
+      <w:r>
+        <w:t xml:space="preserve">The hesitation turned into a full stop. One of the guys stepped forward, hands up. “It don’t gotta be like that, man. Jerry just wants another go.”</w:t>
+      </w:r>
+    </w:p>
+    <w:p>
+      <w:pPr>
+        <w:pStyle w:val="BodyText"/>
+      </w:pPr>
+      <w:r>
+        <w:t xml:space="preserve">I looked at Jerry. I looked at the crowd.</w:t>
+      </w:r>
+    </w:p>
+    <w:p>
+      <w:pPr>
+        <w:pStyle w:val="BodyText"/>
+      </w:pPr>
+      <w:r>
+        <w:t xml:space="preserve">Truth is, I was way more balls than brains back then. I was fucking dumb. It was far more likely they would just jump me the second the bayonet was out of reach. But man, it felt so good beating Jerry’s ass earlier. My risk analysis was terrible, but I went ahead with it anyway.</w:t>
+      </w:r>
+    </w:p>
+    <w:p>
+      <w:pPr>
+        <w:pStyle w:val="BodyText"/>
+      </w:pPr>
+      <w:r>
+        <w:t xml:space="preserve">“Fine,” I said.</w:t>
+      </w:r>
+    </w:p>
+    <w:p>
+      <w:pPr>
+        <w:pStyle w:val="BodyText"/>
+      </w:pPr>
+      <w:r>
+        <w:t xml:space="preserve">I turned to Chris and handed him the bayonet. “Hold this. If they jump me, just bring it to me. I’ll handle the rest.” While I know Chris wasn’t built for that life, I was confident that he knew I would fuck him up if he let me get jumped and didn’t at least bring me the bayonet.</w:t>
+      </w:r>
+    </w:p>
+    <w:p>
+      <w:pPr>
+        <w:pStyle w:val="BodyText"/>
+      </w:pPr>
+      <w:r>
+        <w:t xml:space="preserve">I was a little nervous. Handing away my force multiplier was a risk. But I’ve done dumber shit.</w:t>
+      </w:r>
+    </w:p>
+    <w:p>
+      <w:pPr>
+        <w:pStyle w:val="BodyText"/>
+      </w:pPr>
+      <w:r>
+        <w:t xml:space="preserve">I met Jerry on the street line. Here we go again.</w:t>
+      </w:r>
+    </w:p>
+    <w:p>
+      <w:pPr>
+        <w:pStyle w:val="BodyText"/>
+      </w:pPr>
+      <w:r>
+        <w:t xml:space="preserve">As soon as I got close enough, I threw the exact same combination. Muscle memory. The leg kick landed hard. I missed the cross, but the damage was done. Jerry stumbled back limping and looking panicked.</w:t>
+      </w:r>
+    </w:p>
+    <w:p>
+      <w:pPr>
+        <w:pStyle w:val="BodyText"/>
+      </w:pPr>
+      <w:r>
+        <w:t xml:space="preserve">“Hey!” he yelled. “No kicking!”</w:t>
+      </w:r>
+    </w:p>
+    <w:p>
+      <w:pPr>
+        <w:pStyle w:val="BodyText"/>
+      </w:pPr>
+      <w:r>
+        <w:t xml:space="preserve">I actually laughed. “You asked for this. There ain’t no rules.”</w:t>
+      </w:r>
+    </w:p>
+    <w:p>
+      <w:pPr>
+        <w:pStyle w:val="BodyText"/>
+      </w:pPr>
+      <w:r>
+        <w:t xml:space="preserve">“No kicking,” he pleaded. The crowd was silent. They were watching their champion try to negotiate the terms of his own ass-kicking.</w:t>
+      </w:r>
+    </w:p>
+    <w:p>
+      <w:pPr>
+        <w:pStyle w:val="BodyText"/>
+      </w:pPr>
+      <w:r>
+        <w:t xml:space="preserve">“The next time I touch you,” I said, “it’s going to be worse.”</w:t>
+      </w:r>
+    </w:p>
+    <w:p>
+      <w:pPr>
+        <w:pStyle w:val="BodyText"/>
+      </w:pPr>
+      <w:r>
+        <w:t xml:space="preserve">Jerry started rethinking his life choices. That pain from the second unchecked leg kick he ate must’ve been setting in. He lost his nerve. He looked back at his friends, hoping they would save him, but they just encouraged him to get back in there. They wanted blood, even if it was his.</w:t>
+      </w:r>
+    </w:p>
+    <w:p>
+      <w:pPr>
+        <w:pStyle w:val="BodyText"/>
+      </w:pPr>
+      <w:r>
+        <w:t xml:space="preserve">He came back out for one last try. He was slow, hesitant.</w:t>
+      </w:r>
+    </w:p>
+    <w:p>
+      <w:pPr>
+        <w:pStyle w:val="BodyText"/>
+      </w:pPr>
+      <w:r>
+        <w:t xml:space="preserve">I didn’t even punch him. I just bitch-slapped the shit out of him. The sound cracked through the street. It was worse than a punch. A punch is violence. A slap is disrespect.</w:t>
+      </w:r>
+    </w:p>
+    <w:p>
+      <w:pPr>
+        <w:pStyle w:val="BodyText"/>
+      </w:pPr>
+      <w:r>
+        <w:t xml:space="preserve">Jerry wilted. He turned around, walked back into the crowd, and disappeared down the alley.</w:t>
+      </w:r>
+    </w:p>
+    <w:p>
+      <w:pPr>
+        <w:pStyle w:val="BodyText"/>
+      </w:pPr>
+      <w:r>
+        <w:t xml:space="preserve">His friends lingered for a second. Some of them actually came over and nodded, saying we were cool. They respected the outcome. I nodded back, but I walked straight to Chris and took the bayonet back. I stayed on edge until we were back inside the house with the door locked.</w:t>
+      </w:r>
+    </w:p>
+    <w:p>
+      <w:pPr>
+        <w:pStyle w:val="BodyText"/>
+      </w:pPr>
+      <w:r>
+        <w:t xml:space="preserve">I looked at the bayonet. It had done its job without drawing a drop of blood.</w:t>
+      </w:r>
+    </w:p>
+    <w:p>
+      <w:pPr>
+        <w:pStyle w:val="BodyText"/>
+      </w:pPr>
+      <w:r>
+        <w:t xml:space="preserve">Another lesson learned: Violence implied can sometimes be as effective as violence applied. Sometimes you don’t need to use the weapon. They just need to know you’re willing to take it to the end. I’ll never forget how the temperature changed when Chris mentioned I stabbed people before. I didn’t say it, I didn’t brag, I didn’t talk shit, but the calm matter-of-fact manner that he mentioned the prior events just took everyone from a riled up mob to a much more demure group. No one really wants to get stabbed.</w:t>
+      </w:r>
+    </w:p>
+    <w:p>
+      <w:r>
+        <w:pict>
+          <v:rect style="width:0;height:1.5pt" o:hralign="center" o:hrstd="t" o:hr="t"/>
+        </w:pict>
+      </w:r>
+    </w:p>
+    <w:p>
+      <w:pPr>
+        <w:pStyle w:val="FirstParagraph"/>
+      </w:pPr>
+      <w:r>
+        <w:t xml:space="preserve">I personally was never a thief. I have a disdain for thievery. I think it’s the absolute lowest form of shit that you could be. But not everyone in my crew shared that sentiment.</w:t>
+      </w:r>
+    </w:p>
+    <w:p>
+      <w:pPr>
+        <w:pStyle w:val="BodyText"/>
+      </w:pPr>
+      <w:r>
+        <w:t xml:space="preserve">Around that time, Eddie Aaron got his driver’s license and picked up a cheap old truck—maybe a Toyota Tacoma or something like that. It was a little beat-up truck, but it meant freedom. We would put our pennies together, pile in, and drive out to a place in Glen Burnie that made incredible ribs.</w:t>
+      </w:r>
+    </w:p>
+    <w:p>
+      <w:pPr>
+        <w:pStyle w:val="BodyText"/>
+      </w:pPr>
+      <w:r>
+        <w:t xml:space="preserve">Eddie would usually bring Artie Buckalew and Big Head along. Now, as I mentioned before, Big Head was a huge pussy who betrayed me at every possible chance he got. But for whatever reason, there must be some overlap between being a coward and being a thief, because Big Head was a master at it. He could steal the toast from underneath butter before it even melted.</w:t>
+      </w:r>
+    </w:p>
+    <w:p>
+      <w:pPr>
+        <w:pStyle w:val="BodyText"/>
+      </w:pPr>
+      <w:r>
+        <w:t xml:space="preserve">Eddie would drive us out to Marley Station Mall, and Big Head would basically go shopping. He’d wander around Sam Goody and steal CDs. Because he was built like a combine, he would wear a trench coat and just load up. He’d hit up Sports Authority or Dick’s Sporting Goods and steal anything he could get his hands on. This motherfucker once stole an entire hockey stick by shoving it down his shirt, threading it through his pant leg, and stiff-walking bow-legged right out the front doors.</w:t>
+      </w:r>
+    </w:p>
+    <w:p>
+      <w:pPr>
+        <w:pStyle w:val="BodyText"/>
+      </w:pPr>
+      <w:r>
+        <w:t xml:space="preserve">Artie Buckalew was right there with him—another master thief who could lift just about anything. And Eddie? Eddie was a genius at getting CDs out of those rigid, theft-resistant plastic security cases. Again, a totally wasted mind and wasted potential, but he was brilliant at it. If he ever slipped up and the door alarms went off, Eddie would just stop, put his hands up with a confused look on his face like,</w:t>
+      </w:r>
+      <w:r>
+        <w:t xml:space="preserve"> </w:t>
+      </w:r>
+      <w:r>
+        <w:t xml:space="preserve">“What’s going on?”</w:t>
+      </w:r>
+      <w:r>
+        <w:t xml:space="preserve"> </w:t>
+      </w:r>
+      <w:r>
+        <w:t xml:space="preserve">The mall cops would usually just wave him through. None of them ever got busted. None of them ever had to pay the consequences.</w:t>
+      </w:r>
+    </w:p>
+    <w:p>
+      <w:pPr>
+        <w:pStyle w:val="BodyText"/>
+      </w:pPr>
+      <w:r>
+        <w:t xml:space="preserve">It was just the daily crime wave of these assholes riding around in a cheap truck, stealing everything they could get their hands on, completely immune to the rules of the civilized world.</w:t>
+      </w:r>
+    </w:p>
+    <w:p>
+      <w:r>
+        <w:pict>
+          <v:rect style="width:0;height:1.5pt" o:hralign="center" o:hrstd="t" o:hr="t"/>
+        </w:pict>
+      </w:r>
+    </w:p>
+    <w:bookmarkEnd w:id="21"/>
+    <w:bookmarkStart w:id="22" w:name="chapter-9-the-stet-docket"/>
+    <w:p>
+      <w:pPr>
+        <w:pStyle w:val="Heading1"/>
+      </w:pPr>
+      <w:r>
+        <w:t xml:space="preserve">Chapter 9: The Stet Docket</w:t>
+      </w:r>
+    </w:p>
+    <w:p>
+      <w:pPr>
+        <w:pStyle w:val="BlockText"/>
+      </w:pPr>
+      <w:r>
+        <w:rPr>
+          <w:i/>
+          <w:iCs/>
+        </w:rPr>
+        <w:t xml:space="preserve">STATUS: DRAFTED — from Gemini sessions.</w:t>
+      </w:r>
+    </w:p>
+    <w:p>
+      <w:r>
+        <w:pict>
+          <v:rect style="width:0;height:1.5pt" o:hralign="center" o:hrstd="t" o:hr="t"/>
+        </w:pict>
+      </w:r>
+    </w:p>
+    <w:p>
+      <w:pPr>
+        <w:pStyle w:val="FirstParagraph"/>
+      </w:pPr>
+      <w:r>
         <w:t xml:space="preserve">The years rolled on, and the walls of Baltimore started to feel closer together. I needed an exit strategy.</w:t>
       </w:r>
     </w:p>
@@ -3315,14 +4130,14 @@
         </w:pict>
       </w:r>
     </w:p>
-    <w:bookmarkEnd w:id="18"/>
-    <w:bookmarkStart w:id="19" w:name="chapter-9-bo-derek-and-the-asvab"/>
+    <w:bookmarkEnd w:id="22"/>
+    <w:bookmarkStart w:id="23" w:name="chapter-10-bo-derek-and-the-asvab"/>
     <w:p>
       <w:pPr>
         <w:pStyle w:val="Heading1"/>
       </w:pPr>
       <w:r>
-        <w:t xml:space="preserve">Chapter 9: Bo Derek and the ASVAB</w:t>
+        <w:t xml:space="preserve">Chapter 10: Bo Derek and the ASVAB</w:t>
       </w:r>
     </w:p>
     <w:p>
@@ -3610,14 +4425,14 @@
         </w:pict>
       </w:r>
     </w:p>
-    <w:bookmarkEnd w:id="19"/>
-    <w:bookmarkStart w:id="20" w:name="chapter-10-culture-shock-and-cobra-gold"/>
+    <w:bookmarkEnd w:id="23"/>
+    <w:bookmarkStart w:id="24" w:name="chapter-11-culture-shock-and-cobra-gold"/>
     <w:p>
       <w:pPr>
         <w:pStyle w:val="Heading1"/>
       </w:pPr>
       <w:r>
-        <w:t xml:space="preserve">Chapter 10: Culture Shock and Cobra Gold</w:t>
+        <w:t xml:space="preserve">Chapter 11: Culture Shock and Cobra Gold</w:t>
       </w:r>
     </w:p>
     <w:p>
@@ -4634,14 +5449,14 @@
         </w:pict>
       </w:r>
     </w:p>
-    <w:bookmarkEnd w:id="20"/>
-    <w:bookmarkStart w:id="21" w:name="chapter-11-the-note-from-spartak"/>
+    <w:bookmarkEnd w:id="24"/>
+    <w:bookmarkStart w:id="25" w:name="chapter-12-the-note-from-spartak"/>
     <w:p>
       <w:pPr>
         <w:pStyle w:val="Heading1"/>
       </w:pPr>
       <w:r>
-        <w:t xml:space="preserve">Chapter 11: The Note from Spartak</w:t>
+        <w:t xml:space="preserve">Chapter 12: The Note from Spartak</w:t>
       </w:r>
     </w:p>
     <w:p>
@@ -4879,14 +5694,14 @@
         </w:pict>
       </w:r>
     </w:p>
-    <w:bookmarkEnd w:id="21"/>
-    <w:bookmarkStart w:id="22" w:name="chapter-12-the-happy-birthday-cans"/>
+    <w:bookmarkEnd w:id="25"/>
+    <w:bookmarkStart w:id="26" w:name="chapter-13-the-happy-birthday-cans"/>
     <w:p>
       <w:pPr>
         <w:pStyle w:val="Heading1"/>
       </w:pPr>
       <w:r>
-        <w:t xml:space="preserve">Chapter 12: The Happy Birthday Cans</w:t>
+        <w:t xml:space="preserve">Chapter 13: The Happy Birthday Cans</w:t>
       </w:r>
     </w:p>
     <w:p>
@@ -5174,14 +5989,14 @@
         </w:pict>
       </w:r>
     </w:p>
-    <w:bookmarkEnd w:id="22"/>
-    <w:bookmarkStart w:id="23" w:name="X22eab85afb817c1d5cc9d0080cf1cfe90f4699c"/>
+    <w:bookmarkEnd w:id="26"/>
+    <w:bookmarkStart w:id="27" w:name="Xefef34374e18af50c52750198778f3ab66d33f9"/>
     <w:p>
       <w:pPr>
         <w:pStyle w:val="Heading1"/>
       </w:pPr>
       <w:r>
-        <w:t xml:space="preserve">Chapter 13: The Customs Guy and the Western Union</w:t>
+        <w:t xml:space="preserve">Chapter 14: The Customs Guy and the Western Union</w:t>
       </w:r>
     </w:p>
     <w:p>
@@ -5346,14 +6161,14 @@
         </w:pict>
       </w:r>
     </w:p>
-    <w:bookmarkEnd w:id="23"/>
-    <w:bookmarkStart w:id="24" w:name="X3bada5e16cc96bc5013f65cc0131bf723217c67"/>
+    <w:bookmarkEnd w:id="27"/>
+    <w:bookmarkStart w:id="28" w:name="X3afd49238157d6c9014254cda31b43184195b1d"/>
     <w:p>
       <w:pPr>
         <w:pStyle w:val="Heading1"/>
       </w:pPr>
       <w:r>
-        <w:t xml:space="preserve">Chapter 14: The Jason Bourne Misunderstanding</w:t>
+        <w:t xml:space="preserve">Chapter 15: The Jason Bourne Misunderstanding</w:t>
       </w:r>
     </w:p>
     <w:p>
@@ -5976,14 +6791,14 @@
         </w:pict>
       </w:r>
     </w:p>
-    <w:bookmarkEnd w:id="24"/>
-    <w:bookmarkStart w:id="25" w:name="chapter-15-the-plea-deal"/>
+    <w:bookmarkEnd w:id="28"/>
+    <w:bookmarkStart w:id="29" w:name="chapter-16-the-plea-deal"/>
     <w:p>
       <w:pPr>
         <w:pStyle w:val="Heading1"/>
       </w:pPr>
       <w:r>
-        <w:t xml:space="preserve">Chapter 15: The Plea Deal</w:t>
+        <w:t xml:space="preserve">Chapter 16: The Plea Deal</w:t>
       </w:r>
     </w:p>
     <w:p>
@@ -6268,7 +7083,7 @@
         <w:pStyle w:val="BodyText"/>
       </w:pPr>
       <w:r>
-        <w:t xml:space="preserve">I was on house arrest, but I wasn’t dead. The state thought they had permanently sidelined me, turning me into a statistic—another kid from Baltimore who got caught up and ruined his life. They thought the ankle monitor was the end of the story.</w:t>
+        <w:t xml:space="preserve">I was on house arrest, but I wasn’t dead. The state thought they had permanently sidelined me, turning me into a statistic���another kid from Baltimore who got caught up and ruined his life. They thought the ankle monitor was the end of the story.</w:t>
       </w:r>
     </w:p>
     <w:p>
@@ -6286,14 +7101,14 @@
         </w:pict>
       </w:r>
     </w:p>
-    <w:bookmarkEnd w:id="25"/>
-    <w:bookmarkStart w:id="26" w:name="chapter-16-hiding-the-hardware"/>
+    <w:bookmarkEnd w:id="29"/>
+    <w:bookmarkStart w:id="30" w:name="chapter-17-hiding-the-hardware"/>
     <w:p>
       <w:pPr>
         <w:pStyle w:val="Heading1"/>
       </w:pPr>
       <w:r>
-        <w:t xml:space="preserve">Chapter 16: Hiding the Hardware</w:t>
+        <w:t xml:space="preserve">Chapter 17: Hiding the Hardware</w:t>
       </w:r>
     </w:p>
     <w:p>
@@ -6674,14 +7489,14 @@
         </w:pict>
       </w:r>
     </w:p>
-    <w:bookmarkEnd w:id="26"/>
-    <w:bookmarkStart w:id="27" w:name="X2d98043cd02b06c6fbc4849380d175af424d034"/>
+    <w:bookmarkEnd w:id="30"/>
+    <w:bookmarkStart w:id="31" w:name="Xcbd6c05966d0d6a5f4c019e30913fe2a22aaf6e"/>
     <w:p>
       <w:pPr>
         <w:pStyle w:val="Heading1"/>
       </w:pPr>
       <w:r>
-        <w:t xml:space="preserve">Chapter 17: The Cheesecake Factory and the Personals Ad</w:t>
+        <w:t xml:space="preserve">Chapter 18: The Cheesecake Factory and the Personals Ad</w:t>
       </w:r>
     </w:p>
     <w:p>
@@ -6942,14 +7757,14 @@
         </w:pict>
       </w:r>
     </w:p>
-    <w:bookmarkEnd w:id="27"/>
-    <w:bookmarkStart w:id="28" w:name="chapter-18-the-linthicum-theater"/>
+    <w:bookmarkEnd w:id="31"/>
+    <w:bookmarkStart w:id="32" w:name="chapter-19-the-linthicum-theater"/>
     <w:p>
       <w:pPr>
         <w:pStyle w:val="Heading1"/>
       </w:pPr>
       <w:r>
-        <w:t xml:space="preserve">Chapter 18: The Linthicum Theater</w:t>
+        <w:t xml:space="preserve">Chapter 19: The Linthicum Theater</w:t>
       </w:r>
     </w:p>
     <w:p>
@@ -7268,14 +8083,14 @@
         </w:pict>
       </w:r>
     </w:p>
-    <w:bookmarkEnd w:id="28"/>
-    <w:bookmarkStart w:id="29" w:name="chapter-19-spartan-technology"/>
+    <w:bookmarkEnd w:id="32"/>
+    <w:bookmarkStart w:id="33" w:name="chapter-20-spartan-technology"/>
     <w:p>
       <w:pPr>
         <w:pStyle w:val="Heading1"/>
       </w:pPr>
       <w:r>
-        <w:t xml:space="preserve">Chapter 19: Spartan Technology</w:t>
+        <w:t xml:space="preserve">Chapter 20: Spartan Technology</w:t>
       </w:r>
     </w:p>
     <w:p>
@@ -7676,14 +8491,14 @@
         </w:pict>
       </w:r>
     </w:p>
-    <w:bookmarkEnd w:id="29"/>
-    <w:bookmarkStart w:id="30" w:name="X1018e99dd05767531ce9ce22b14753fb2df5c20"/>
+    <w:bookmarkEnd w:id="33"/>
+    <w:bookmarkStart w:id="34" w:name="X9979bf4a9258b02d83d50d38b0dfa8336782862"/>
     <w:p>
       <w:pPr>
         <w:pStyle w:val="Heading1"/>
       </w:pPr>
       <w:r>
-        <w:t xml:space="preserve">Chapter 20: The Safety Queen and the Triconex Puzzle</w:t>
+        <w:t xml:space="preserve">Chapter 21: The Safety Queen and the Triconex Puzzle</w:t>
       </w:r>
     </w:p>
     <w:p>
@@ -8222,14 +9037,14 @@
         </w:pict>
       </w:r>
     </w:p>
-    <w:bookmarkEnd w:id="30"/>
-    <w:bookmarkStart w:id="31" w:name="X3966bc343f2de3a36037cbdb5a39fe09d961d2f"/>
+    <w:bookmarkEnd w:id="34"/>
+    <w:bookmarkStart w:id="35" w:name="Xa55aab4c643f976496e84405495b093390feb9f"/>
     <w:p>
       <w:pPr>
         <w:pStyle w:val="Heading1"/>
       </w:pPr>
       <w:r>
-        <w:t xml:space="preserve">Chapter 21: The 1.7 Billion Dollar Jump and the Wichita HQ</w:t>
+        <w:t xml:space="preserve">Chapter 22: The 1.7 Billion Dollar Jump and the Wichita HQ</w:t>
       </w:r>
     </w:p>
     <w:p>
@@ -8972,14 +9787,14 @@
         </w:pict>
       </w:r>
     </w:p>
-    <w:bookmarkEnd w:id="31"/>
-    <w:bookmarkStart w:id="32" w:name="X8a80b07b86c6146e60cd97236947ea6739208a3"/>
+    <w:bookmarkEnd w:id="35"/>
+    <w:bookmarkStart w:id="36" w:name="X78db63113f5b2a56c12c009cfa1e721c9c318ba"/>
     <w:p>
       <w:pPr>
         <w:pStyle w:val="Heading1"/>
       </w:pPr>
       <w:r>
-        <w:t xml:space="preserve">Chapter 22: The Purple Belt and the Gray Hair</w:t>
+        <w:t xml:space="preserve">Chapter 23: The Purple Belt and the Gray Hair</w:t>
       </w:r>
     </w:p>
     <w:p>
@@ -9370,14 +10185,14 @@
         </w:pict>
       </w:r>
     </w:p>
-    <w:bookmarkEnd w:id="32"/>
-    <w:bookmarkStart w:id="34" w:name="X79f7c730c55840f3b57934c5aac14f1f8852c6f"/>
+    <w:bookmarkEnd w:id="36"/>
+    <w:bookmarkStart w:id="38" w:name="X40029ae477135848e14c1f32b3711a103a7792c"/>
     <w:p>
       <w:pPr>
         <w:pStyle w:val="Heading1"/>
       </w:pPr>
       <w:r>
-        <w:t xml:space="preserve">Chapter 23: The Golden Handcuffs and the Great Escape</w:t>
+        <w:t xml:space="preserve">Chapter 24: The Golden Handcuffs and the Great Escape</w:t>
       </w:r>
     </w:p>
     <w:p>
@@ -10011,7 +10826,7 @@
         <w:t xml:space="preserve">diagnosis was still sitting in my cognitive database, but the physical reality was counting down.</w:t>
       </w:r>
     </w:p>
-    <w:bookmarkStart w:id="33" w:name="Xc9443c4515f24063bbf2ca1cf7a78a5af38aac7"/>
+    <w:bookmarkStart w:id="37" w:name="Xc9443c4515f24063bbf2ca1cf7a78a5af38aac7"/>
     <w:p>
       <w:pPr>
         <w:pStyle w:val="Heading2"/>
@@ -10020,15 +10835,15 @@
         <w:t xml:space="preserve">The cancer was ticking away like a silent, unmitigated time bomb in the passenger seat, quietly preparing to trigger the ultimate, catastrophic system alarm.</w:t>
       </w:r>
     </w:p>
-    <w:bookmarkEnd w:id="33"/>
-    <w:bookmarkEnd w:id="34"/>
-    <w:bookmarkStart w:id="35" w:name="chapter-24-takeda-mitre-and-the-airbnbs"/>
+    <w:bookmarkEnd w:id="37"/>
+    <w:bookmarkEnd w:id="38"/>
+    <w:bookmarkStart w:id="39" w:name="chapter-25-takeda-mitre-and-the-airbnbs"/>
     <w:p>
       <w:pPr>
         <w:pStyle w:val="Heading1"/>
       </w:pPr>
       <w:r>
-        <w:t xml:space="preserve">Chapter 24: Takeda, MITRE, and the Airbnbs</w:t>
+        <w:t xml:space="preserve">Chapter 25: Takeda, MITRE, and the Airbnbs</w:t>
       </w:r>
     </w:p>
     <w:p>
@@ -10375,14 +11190,14 @@
         </w:pict>
       </w:r>
     </w:p>
-    <w:bookmarkEnd w:id="35"/>
-    <w:bookmarkStart w:id="36" w:name="X8fa845f248d9aef9b25ca464d4fa80d9cac5658"/>
+    <w:bookmarkEnd w:id="39"/>
+    <w:bookmarkStart w:id="40" w:name="X0442337727b5e6baf75f1a0d44216a31d159b26"/>
     <w:p>
       <w:pPr>
         <w:pStyle w:val="Heading1"/>
       </w:pPr>
       <w:r>
-        <w:t xml:space="preserve">Chapter 25: The Double Surgery and the Cold Sweat</w:t>
+        <w:t xml:space="preserve">Chapter 26: The Double Surgery and the Cold Sweat</w:t>
       </w:r>
     </w:p>
     <w:p>
@@ -10775,14 +11590,14 @@
         </w:pict>
       </w:r>
     </w:p>
-    <w:bookmarkEnd w:id="36"/>
-    <w:bookmarkStart w:id="37" w:name="chapter-26-does-it-light-up"/>
+    <w:bookmarkEnd w:id="40"/>
+    <w:bookmarkStart w:id="41" w:name="chapter-27-does-it-light-up"/>
     <w:p>
       <w:pPr>
         <w:pStyle w:val="Heading1"/>
       </w:pPr>
       <w:r>
-        <w:t xml:space="preserve">Chapter 26: Does It Light Up?</w:t>
+        <w:t xml:space="preserve">Chapter 27: Does It Light Up?</w:t>
       </w:r>
     </w:p>
     <w:p>
@@ -11142,8 +11957,8 @@
         </w:pict>
       </w:r>
     </w:p>
-    <w:bookmarkEnd w:id="37"/>
-    <w:bookmarkStart w:id="38" w:name="epilogue-the-calculation"/>
+    <w:bookmarkEnd w:id="41"/>
+    <w:bookmarkStart w:id="42" w:name="epilogue-the-calculation"/>
     <w:p>
       <w:pPr>
         <w:pStyle w:val="Heading1"/>
@@ -11466,7 +12281,7 @@
         </w:pict>
       </w:r>
     </w:p>
-    <w:bookmarkEnd w:id="38"/>
+    <w:bookmarkEnd w:id="42"/>
     <w:sectPr>
       <w:footnotePr>
         <w:numRestart w:val="eachSect"/>

</xml_diff>

<commit_message>
Update Chapter 9 with the true story of the Stet Docket
</commit_message>
<xml_diff>
--- a/The_Improbability_of_Me_Master_Draft.docx
+++ b/The_Improbability_of_Me_Master_Draft.docx
@@ -3371,7 +3371,7 @@
         <w:pStyle w:val="BodyText"/>
       </w:pPr>
       <w:r>
-        <w:t xml:space="preserve">My friend Kareem, a buddy from Baltimore City College High School, had the plan.</w:t>
+        <w:t xml:space="preserve">My buddy from Baltimore City College High School, Kareem, had a plan.</w:t>
       </w:r>
       <w:r>
         <w:t xml:space="preserve"> </w:t>
@@ -3391,23 +3391,15 @@
         <w:pStyle w:val="BodyText"/>
       </w:pPr>
       <w:r>
-        <w:t xml:space="preserve">It made sense. The Marines were tough, they were respected, and more importantly, they were away. I wanted money for school, I wanted to see the world, and specifically, I wanted to go to Japan. I had been studying Japanese since the 6th grade—a little piece of discipline and culture that didn’t fit with the chaos around me.</w:t>
-      </w:r>
-    </w:p>
-    <w:p>
-      <w:pPr>
-        <w:pStyle w:val="BodyText"/>
-      </w:pPr>
-      <w:r>
-        <w:t xml:space="preserve">We went to the enlistment office, ready to sign our lives away to the Corps. But the Marine recruiter was out to lunch or doing PT—who knows. The office was empty.</w:t>
-      </w:r>
-    </w:p>
-    <w:p>
-      <w:pPr>
-        <w:pStyle w:val="BodyText"/>
-      </w:pPr>
-      <w:r>
-        <w:t xml:space="preserve">Just as we turned to leave, Tech Sergeant Cartwright walked out of the Air Force office next door. He took one look at us and smiled.</w:t>
+        <w:t xml:space="preserve">I figured, all right, whatever. It made sense. The Marines were tough, they were respected, and more importantly, they were away from fucking Baltimore. I wanted money for school, I wanted to see the world, and specifically, I wanted to go to Japan. I had been studying Japanese since the sixth grade—a little piece of discipline and culture that just didn’t fit with the chaos around me.</w:t>
+      </w:r>
+    </w:p>
+    <w:p>
+      <w:pPr>
+        <w:pStyle w:val="BodyText"/>
+      </w:pPr>
+      <w:r>
+        <w:t xml:space="preserve">We went to the enlistment office, ready to sign our lives away to the Corps. But the Marine recruiter was out to lunch or doing PT, or whatever Marines do. The office was empty. Just as we turned to leave, Tech Sergeant Cartwright walked out of the Air Force office next door. He looked at us and smiled.</w:t>
       </w:r>
     </w:p>
     <w:p>
@@ -3417,6 +3409,12 @@
       <w:r>
         <w:t xml:space="preserve">“What are you boys here for?”</w:t>
       </w:r>
+      <w:r>
+        <w:t xml:space="preserve"> </w:t>
+      </w:r>
+      <w:r>
+        <w:t xml:space="preserve">he asked.</w:t>
+      </w:r>
     </w:p>
     <w:p>
       <w:pPr>
@@ -3437,13 +3435,25 @@
         <w:pStyle w:val="BodyText"/>
       </w:pPr>
       <w:r>
-        <w:t xml:space="preserve">Cartwright shook his head like a disappointed father.</w:t>
-      </w:r>
-      <w:r>
-        <w:t xml:space="preserve"> </w:t>
-      </w:r>
-      <w:r>
-        <w:t xml:space="preserve">“Don’t do that to yourself, son. You join the Air Force, I will fly you around the world. I will give you access to fine wine and fine women. You’ll sleep in a bed, not a foxhole.”</w:t>
+        <w:t xml:space="preserve">Tech Sergeant Cartwright shook his head like a disappointed father.</w:t>
+      </w:r>
+      <w:r>
+        <w:t xml:space="preserve"> </w:t>
+      </w:r>
+      <w:r>
+        <w:t xml:space="preserve">“Don’t do that to yourself, son,”</w:t>
+      </w:r>
+      <w:r>
+        <w:t xml:space="preserve"> </w:t>
+      </w:r>
+      <w:r>
+        <w:t xml:space="preserve">he said.</w:t>
+      </w:r>
+      <w:r>
+        <w:t xml:space="preserve"> </w:t>
+      </w:r>
+      <w:r>
+        <w:t xml:space="preserve">“You join the Air Force, I will fly you around the world. I will give you access to fine wine and fine women. You’ll sleep in a bed, not in a foxhole.”</w:t>
       </w:r>
     </w:p>
     <w:p>
@@ -3463,47 +3473,31 @@
         <w:t xml:space="preserve"> </w:t>
       </w:r>
       <w:r>
-        <w:t xml:space="preserve">Anything that got me out of Baltimore was the right path. I signed the papers for the Delayed Enlistment Program right there.</w:t>
-      </w:r>
-    </w:p>
-    <w:p>
-      <w:pPr>
-        <w:pStyle w:val="BodyText"/>
-      </w:pPr>
-      <w:r>
-        <w:t xml:space="preserve">My ship date was set: January 3, 1995.</w:t>
-      </w:r>
-    </w:p>
-    <w:p>
-      <w:pPr>
-        <w:pStyle w:val="BodyText"/>
-      </w:pPr>
-      <w:r>
-        <w:t xml:space="preserve">I had a few months to kill. I just had to stay out of trouble.</w:t>
-      </w:r>
-    </w:p>
-    <w:p>
-      <w:pPr>
-        <w:pStyle w:val="BodyText"/>
-      </w:pPr>
-      <w:r>
-        <w:t xml:space="preserve">One night, I was sitting at home, feeling under the weather, trying to keep a low profile. The phone rang.</w:t>
-      </w:r>
-    </w:p>
-    <w:p>
-      <w:pPr>
-        <w:pStyle w:val="BodyText"/>
-      </w:pPr>
-      <w:r>
-        <w:t xml:space="preserve">It was Charlie, Big Ed’s younger brother. He was at the School 84 Rec Center, and he was panicked. Some guys were threatening to kill him.</w:t>
-      </w:r>
-    </w:p>
-    <w:p>
-      <w:pPr>
-        <w:pStyle w:val="BodyText"/>
-      </w:pPr>
-      <w:r>
-        <w:t xml:space="preserve">“Where is Ed?”</w:t>
+        <w:t xml:space="preserve">Anything that got me out of Baltimore was the right path. I signed the papers for the Delayed Enlistment Program right then and there. I was seventeen. My ship date was set for January 3, 1995. I had a few months to kill. I just had to stay out of trouble.</w:t>
+      </w:r>
+    </w:p>
+    <w:p>
+      <w:pPr>
+        <w:pStyle w:val="BodyText"/>
+      </w:pPr>
+      <w:r>
+        <w:t xml:space="preserve">Well, that’s not always as easy as it sounds.</w:t>
+      </w:r>
+    </w:p>
+    <w:p>
+      <w:pPr>
+        <w:pStyle w:val="BodyText"/>
+      </w:pPr>
+      <w:r>
+        <w:t xml:space="preserve">One night, I was sitting at home. I was sick, feeling under the weather, just trying to keep a low profile, when the phone rang. It was Charlie O’Heron—Big Ed’s younger brother. He was up the street at the School 84 Rec Center, and he was panicked. Some guys were threatening to kill him.</w:t>
+      </w:r>
+    </w:p>
+    <w:p>
+      <w:pPr>
+        <w:pStyle w:val="BodyText"/>
+      </w:pPr>
+      <w:r>
+        <w:t xml:space="preserve">“Where’s Ed? Where’s your big brother?”</w:t>
       </w:r>
       <w:r>
         <w:t xml:space="preserve"> </w:t>
@@ -3517,15 +3511,27 @@
         <w:pStyle w:val="BodyText"/>
       </w:pPr>
       <w:r>
-        <w:t xml:space="preserve">“He said I’m on my own.”</w:t>
-      </w:r>
-    </w:p>
-    <w:p>
-      <w:pPr>
-        <w:pStyle w:val="BodyText"/>
-      </w:pPr>
-      <w:r>
-        <w:t xml:space="preserve">That burned me. You don’t leave your brother on his own. That is a violation of the code.</w:t>
+        <w:t xml:space="preserve">“I’m on my own,”</w:t>
+      </w:r>
+      <w:r>
+        <w:t xml:space="preserve"> </w:t>
+      </w:r>
+      <w:r>
+        <w:t xml:space="preserve">Charlie said.</w:t>
+      </w:r>
+      <w:r>
+        <w:t xml:space="preserve"> </w:t>
+      </w:r>
+      <w:r>
+        <w:t xml:space="preserve">“Ed told me to figure it out.”</w:t>
+      </w:r>
+    </w:p>
+    <w:p>
+      <w:pPr>
+        <w:pStyle w:val="BodyText"/>
+      </w:pPr>
+      <w:r>
+        <w:t xml:space="preserve">That fucking burned me up. You don’t leave your brother on his own. That’s a direct violation of the code.</w:t>
       </w:r>
       <w:r>
         <w:t xml:space="preserve"> </w:t>
@@ -3565,45 +3571,43 @@
         <w:pStyle w:val="BodyText"/>
       </w:pPr>
       <w:r>
-        <w:t xml:space="preserve">I called my best friend, Mike Hammonds. I told him the situation. Mike didn’t ask how many guys, or if they had guns, or why we were doing this. He just said,</w:t>
-      </w:r>
-      <w:r>
-        <w:t xml:space="preserve"> </w:t>
-      </w:r>
-      <w:r>
-        <w:t xml:space="preserve">“I’ll be right there.”</w:t>
-      </w:r>
-    </w:p>
-    <w:p>
-      <w:pPr>
-        <w:pStyle w:val="BodyText"/>
-      </w:pPr>
-      <w:r>
-        <w:t xml:space="preserve">Minutes later, he rolled up.</w:t>
-      </w:r>
-    </w:p>
-    <w:p>
-      <w:pPr>
-        <w:pStyle w:val="BodyText"/>
-      </w:pPr>
-      <w:r>
-        <w:t xml:space="preserve">Charlie told us it was a group of them, so I decided I needed an equalizer. I grabbed a small machete. It wasn’t my favorite weapon—hacking feels awkward to me, less precise than stabbing—but a machete has a psychological weight to it. People see that wide blade and they freeze. I tucked it inside my jacket, under my arm, and we headed for the Rec Center.</w:t>
-      </w:r>
-    </w:p>
-    <w:p>
-      <w:pPr>
-        <w:pStyle w:val="BodyText"/>
-      </w:pPr>
-      <w:r>
-        <w:t xml:space="preserve">We walked in—Charlie first, then Mike, then me bringing up the rear.</w:t>
-      </w:r>
-    </w:p>
-    <w:p>
-      <w:pPr>
-        <w:pStyle w:val="BodyText"/>
-      </w:pPr>
-      <w:r>
-        <w:t xml:space="preserve">Charlie pointed out the issue. He had been playing ball, things got rough, and he tried to walk away. Someone threw a ball at his face. Charlie caught it and set it down—a small act of defiance that enraged the guy. They told him the second he stepped outside, they were going to beat him to death.</w:t>
+        <w:t xml:space="preserve">I called my best friend, Mike Hammonds, and told him the situation. Mike didn’t ask how many guys there were, or if they had guns. He just asked,</w:t>
+      </w:r>
+      <w:r>
+        <w:t xml:space="preserve"> </w:t>
+      </w:r>
+      <w:r>
+        <w:t xml:space="preserve">“Are we going to do this?”</w:t>
+      </w:r>
+      <w:r>
+        <w:t xml:space="preserve"> </w:t>
+      </w:r>
+      <w:r>
+        <w:t xml:space="preserve">He told me he’d be right there. Minutes later, he rolled up.</w:t>
+      </w:r>
+    </w:p>
+    <w:p>
+      <w:pPr>
+        <w:pStyle w:val="BodyText"/>
+      </w:pPr>
+      <w:r>
+        <w:t xml:space="preserve">Charlie told us it was a whole group of them, so I decided I needed an equalizer. I grabbed a small machete. It wasn’t my favorite weapon—hacking feels awkward to me, much less precise than stabbing—but a machete has a good psychological weight to it. People see that wide blade and they freeze. I tucked it inside my jacket, under my arm, and we walked up to the Rec Center.</w:t>
+      </w:r>
+    </w:p>
+    <w:p>
+      <w:pPr>
+        <w:pStyle w:val="BodyText"/>
+      </w:pPr>
+      <w:r>
+        <w:t xml:space="preserve">We walked in: Charlie first, then Mike, then me bringing up the rear. Charlie pointed out the issue. He had been playing ball, things got rough, and he tried to walk away. Someone threw a basketball at his face. Charlie just caught it and set it down. It was a small act of defiance, but it enraged the guy. They told Charlie that the second he stepped outside, they were going to beat him to death.</w:t>
+      </w:r>
+    </w:p>
+    <w:p>
+      <w:pPr>
+        <w:pStyle w:val="BodyText"/>
+      </w:pPr>
+      <w:r>
+        <w:t xml:space="preserve">There was no fighting inside the 84 Rec Center. If you got caught fighting in there, you got kicked out permanently. Then where would you go? So everybody kind of respected it. It was like holy ground.</w:t>
       </w:r>
     </w:p>
     <w:p>
@@ -3631,87 +3635,109 @@
         <w:pStyle w:val="BodyText"/>
       </w:pPr>
       <w:r>
-        <w:t xml:space="preserve">We walked out the doors. As soon as we crossed the threshold, the atmosphere shifted. It was like stepping into a different world.</w:t>
-      </w:r>
-    </w:p>
-    <w:p>
-      <w:pPr>
-        <w:pStyle w:val="BodyText"/>
-      </w:pPr>
-      <w:r>
-        <w:t xml:space="preserve">It happened in seconds. The crowd swarmed. I saw Charlie cowering on the ground, getting pummeled. I saw Mike throwing bombs, fighting two or three guys at once.</w:t>
-      </w:r>
-    </w:p>
-    <w:p>
-      <w:pPr>
-        <w:pStyle w:val="BodyText"/>
-      </w:pPr>
-      <w:r>
-        <w:t xml:space="preserve">I moved toward Charlie. Two guys were stomping him. I rushed them, knocking them off. One of them ran up a little wheelchair ramp next to the stairs and jumped off, trying to deliver a flying kick to my head.</w:t>
-      </w:r>
-    </w:p>
-    <w:p>
-      <w:pPr>
-        <w:pStyle w:val="BodyText"/>
-      </w:pPr>
-      <w:r>
-        <w:t xml:space="preserve">I didn’t flinch. I swung my arm as hard as I could, connecting with his forearm in mid-air. I felt the bone fracture under the impact. He hit the ground screaming.</w:t>
-      </w:r>
-    </w:p>
-    <w:p>
-      <w:pPr>
-        <w:pStyle w:val="BodyText"/>
-      </w:pPr>
-      <w:r>
-        <w:t xml:space="preserve">The force of the swing dislodged the machete from my jacket. It clattered to the concrete.</w:t>
-      </w:r>
-    </w:p>
-    <w:p>
-      <w:pPr>
-        <w:pStyle w:val="BodyText"/>
-      </w:pPr>
-      <w:r>
-        <w:t xml:space="preserve">For a split second, everyone looked at it. I snatched it up, gripping the handle. I didn’t swing it. I just held it.</w:t>
-      </w:r>
-    </w:p>
-    <w:p>
-      <w:pPr>
-        <w:pStyle w:val="BodyText"/>
-      </w:pPr>
-      <w:r>
-        <w:t xml:space="preserve">Information received. The crowd backed up. A knife is a threat; a machete is a horror movie.</w:t>
-      </w:r>
-    </w:p>
-    <w:p>
-      <w:pPr>
-        <w:pStyle w:val="BodyText"/>
-      </w:pPr>
-      <w:r>
-        <w:t xml:space="preserve">I looked over at Mike. He had a guy locked up in a WWE-style DDT hold, his head tucked under Mike’s arm. Mike looked at me, calm as a monk in a hurricane.</w:t>
-      </w:r>
-    </w:p>
-    <w:p>
-      <w:pPr>
-        <w:pStyle w:val="BodyText"/>
-      </w:pPr>
-      <w:r>
-        <w:t xml:space="preserve">“Come over and break this motherfucker’s ribs.”</w:t>
-      </w:r>
-    </w:p>
-    <w:p>
-      <w:pPr>
-        <w:pStyle w:val="BodyText"/>
-      </w:pPr>
-      <w:r>
-        <w:t xml:space="preserve">As I walked toward Mike, the sea of people parted. I didn’t even need the blade. I delivered a kick to the guy’s ass, Mike let him go, and I looked around the circle.</w:t>
-      </w:r>
-    </w:p>
-    <w:p>
-      <w:pPr>
-        <w:pStyle w:val="BodyText"/>
-      </w:pPr>
-      <w:r>
-        <w:t xml:space="preserve">“Let’s get going.”</w:t>
+        <w:t xml:space="preserve">We walked out the doors. Mike went out first, Charlie went next, and I was just a couple of feet behind. As soon as we crossed the threshold, it was like stepping through a portal into pure pandemonium. It happened in seconds. The crowd swarmed. I saw Charlie cowering on the ground, getting pummeled. I saw Mike Hammonds throwing bombs, fighting off two or three guys at once.</w:t>
+      </w:r>
+    </w:p>
+    <w:p>
+      <w:pPr>
+        <w:pStyle w:val="BodyText"/>
+      </w:pPr>
+      <w:r>
+        <w:t xml:space="preserve">I moved toward Charlie. I figured Hammonds had his shit under control. There were two guys stomping Charlie, so I rushed them and knocked them off. One of the guys ran up a little ramp by the Rec Center—like a small retaining wall—and jumped off it like he thought he was Bruce Lee.</w:t>
+      </w:r>
+    </w:p>
+    <w:p>
+      <w:pPr>
+        <w:pStyle w:val="BodyText"/>
+      </w:pPr>
+      <w:r>
+        <w:t xml:space="preserve">I just swung with my left hand—a hard, overhand left—and completely connected. I punched that motherfucker right in his forearm, and I heard a loud snap. That was Mike Lowry. That little force basically broke his fucking arm. He was laying there on the ground crying like a bitch.</w:t>
+      </w:r>
+    </w:p>
+    <w:p>
+      <w:pPr>
+        <w:pStyle w:val="BodyText"/>
+      </w:pPr>
+      <w:r>
+        <w:t xml:space="preserve">But that’s when I realized things were getting serious. I pulled out the machete.</w:t>
+      </w:r>
+    </w:p>
+    <w:p>
+      <w:pPr>
+        <w:pStyle w:val="BodyText"/>
+      </w:pPr>
+      <w:r>
+        <w:t xml:space="preserve">“Alright, here we go,”</w:t>
+      </w:r>
+      <w:r>
+        <w:t xml:space="preserve"> </w:t>
+      </w:r>
+      <w:r>
+        <w:t xml:space="preserve">I thought.</w:t>
+      </w:r>
+    </w:p>
+    <w:p>
+      <w:pPr>
+        <w:pStyle w:val="BodyText"/>
+      </w:pPr>
+      <w:r>
+        <w:t xml:space="preserve">As soon as I pulled it out, everybody started yelling,</w:t>
+      </w:r>
+      <w:r>
+        <w:t xml:space="preserve"> </w:t>
+      </w:r>
+      <w:r>
+        <w:t xml:space="preserve">“He’s got a machete! He’s got a knife!”</w:t>
+      </w:r>
+    </w:p>
+    <w:p>
+      <w:pPr>
+        <w:pStyle w:val="BodyText"/>
+      </w:pPr>
+      <w:r>
+        <w:t xml:space="preserve">I looked over at Mike. He had some guy locked up in a WWF DDT-style hold, ready to just smash the guy’s head straight into the concrete. Mike looked over at me, calm as a monkey.</w:t>
+      </w:r>
+    </w:p>
+    <w:p>
+      <w:pPr>
+        <w:pStyle w:val="BodyText"/>
+      </w:pPr>
+      <w:r>
+        <w:t xml:space="preserve">“Come over here and break this motherfucker’s ribs,”</w:t>
+      </w:r>
+      <w:r>
+        <w:t xml:space="preserve"> </w:t>
+      </w:r>
+      <w:r>
+        <w:t xml:space="preserve">Mike said.</w:t>
+      </w:r>
+    </w:p>
+    <w:p>
+      <w:pPr>
+        <w:pStyle w:val="BodyText"/>
+      </w:pPr>
+      <w:r>
+        <w:t xml:space="preserve">I walked over to Mike, and the sea of people just parted. I didn’t even need to use the blade. I delivered a kick right to that guy’s ass.</w:t>
+      </w:r>
+    </w:p>
+    <w:p>
+      <w:pPr>
+        <w:pStyle w:val="BodyText"/>
+      </w:pPr>
+      <w:r>
+        <w:t xml:space="preserve">“Come on, we gotta go,”</w:t>
+      </w:r>
+      <w:r>
+        <w:t xml:space="preserve"> </w:t>
+      </w:r>
+      <w:r>
+        <w:t xml:space="preserve">I said.</w:t>
+      </w:r>
+      <w:r>
+        <w:t xml:space="preserve"> </w:t>
+      </w:r>
+      <w:r>
+        <w:t xml:space="preserve">“Ain’t got time for this shit. Let’s get going.”</w:t>
       </w:r>
     </w:p>
     <w:p>
@@ -3727,23 +3753,15 @@
         <w:pStyle w:val="BodyText"/>
       </w:pPr>
       <w:r>
-        <w:t xml:space="preserve">I went back to my house, the high-voltage adrenaline fading rapidly into a shivering, hollow sickness. My joints throbbed, my throat felt like sandpaper, and my skin was cold and clammy. I collapsed onto the sofa, trying to keep a low profile and let my body regulate. I thought the storm had passed. I thought I was clear.</w:t>
-      </w:r>
-    </w:p>
-    <w:p>
-      <w:pPr>
-        <w:pStyle w:val="BodyText"/>
-      </w:pPr>
-      <w:r>
-        <w:t xml:space="preserve">Then came the knock.</w:t>
-      </w:r>
-    </w:p>
-    <w:p>
-      <w:pPr>
-        <w:pStyle w:val="BodyText"/>
-      </w:pPr>
-      <w:r>
-        <w:t xml:space="preserve">It wasn’t a normal knock. It was a rhythmic, violent battery that rattled the old wooden frame of the door and vibrated through the floorboards.</w:t>
+        <w:t xml:space="preserve">I went back to my house. The high-voltage adrenaline was rapidly fading, and I was just back to being sick. I sat down.</w:t>
+      </w:r>
+    </w:p>
+    <w:p>
+      <w:pPr>
+        <w:pStyle w:val="BodyText"/>
+      </w:pPr>
+      <w:r>
+        <w:t xml:space="preserve">Then came a knock. It wasn’t a normal knock. It was a violent battery that rattled the wooden frame of the house.</w:t>
       </w:r>
     </w:p>
     <w:p>
@@ -3759,330 +3777,59 @@
         <w:pStyle w:val="BodyText"/>
       </w:pPr>
       <w:r>
-        <w:t xml:space="preserve">I bolted upright, my heart hammering against my ribs. I looked at my younger sister. She was standing in the hallway, her face completely drained of color, her eyes wide with a primal, childlike terror. Her hands were shaking so hard she could barely control them as she reached toward the deadbolt.</w:t>
-      </w:r>
-    </w:p>
-    <w:p>
-      <w:pPr>
-        <w:pStyle w:val="BodyText"/>
-      </w:pPr>
-      <w:r>
-        <w:t xml:space="preserve">“Don’t open the door!”</w:t>
-      </w:r>
-      <w:r>
-        <w:t xml:space="preserve"> </w:t>
-      </w:r>
-      <w:r>
-        <w:t xml:space="preserve">I hissed, my voice a sharp, desperate whisper.</w:t>
-      </w:r>
-      <w:r>
-        <w:t xml:space="preserve"> </w:t>
-      </w:r>
-      <w:r>
-        <w:t xml:space="preserve">“Do not let them in! They don’t have a warrant!”</w:t>
-      </w:r>
-    </w:p>
-    <w:p>
-      <w:pPr>
-        <w:pStyle w:val="BodyText"/>
-      </w:pPr>
-      <w:r>
-        <w:t xml:space="preserve">But she was young, and the sheer authority of the badge and the roaring voices outside overrode my command. The panic took her. She turned the latch, and the heavy door flew inward with a violent crash.</w:t>
-      </w:r>
-    </w:p>
-    <w:p>
-      <w:pPr>
-        <w:pStyle w:val="BodyText"/>
-      </w:pPr>
-      <w:r>
-        <w:t xml:space="preserve">A swarm of Baltimore City Police officers flooded the room. They didn’t care about procedural decorum, warrants, or civil rights. They were hyped on their own adrenaline, guns drawn, their boots making a chaotic, heavy stamp on our floor. They pushed past my sister, ignoring her tears, and zeroed in on me. I was tall, broad, and intimidating, but I was sick and completely unarmed.</w:t>
-      </w:r>
-    </w:p>
-    <w:p>
-      <w:pPr>
-        <w:pStyle w:val="BodyText"/>
-      </w:pPr>
-      <w:r>
-        <w:t xml:space="preserve">They slammed me face-first against the plaster wall, the rough paint scraping my cheek. A heavy, black-booted knee was driven hard into the small of my back, pinning me in place.</w:t>
-      </w:r>
-    </w:p>
-    <w:p>
-      <w:pPr>
-        <w:pStyle w:val="BodyText"/>
-      </w:pPr>
-      <w:r>
-        <w:t xml:space="preserve">“Where is the machete?”</w:t>
-      </w:r>
-      <w:r>
-        <w:t xml:space="preserve"> </w:t>
-      </w:r>
-      <w:r>
-        <w:t xml:space="preserve">a detective growled, his forearm digging deep into the side of my neck, cutting off my airway just enough to make my vision blur.</w:t>
-      </w:r>
-      <w:r>
-        <w:t xml:space="preserve"> </w:t>
-      </w:r>
-      <w:r>
-        <w:t xml:space="preserve">“Where is the goddamn blade, you little prick?”</w:t>
-      </w:r>
-    </w:p>
-    <w:p>
-      <w:pPr>
-        <w:pStyle w:val="BodyText"/>
-      </w:pPr>
-      <w:r>
-        <w:t xml:space="preserve">“I don’t know what you’re talking about,”</w:t>
-      </w:r>
-      <w:r>
-        <w:t xml:space="preserve"> </w:t>
-      </w:r>
-      <w:r>
-        <w:t xml:space="preserve">I choked out, playing the only hand I had.</w:t>
-      </w:r>
-      <w:r>
-        <w:t xml:space="preserve"> </w:t>
-      </w:r>
-      <w:r>
-        <w:t xml:space="preserve">“I don’t own a machete.”</w:t>
-      </w:r>
-    </w:p>
-    <w:p>
-      <w:pPr>
-        <w:pStyle w:val="BodyText"/>
-      </w:pPr>
-      <w:r>
-        <w:t xml:space="preserve">“Don’t be a smartass,”</w:t>
-      </w:r>
-      <w:r>
-        <w:t xml:space="preserve"> </w:t>
-      </w:r>
-      <w:r>
-        <w:t xml:space="preserve">the detective sneered, pushing my face harder into the drywall.</w:t>
-      </w:r>
-      <w:r>
-        <w:t xml:space="preserve"> </w:t>
-      </w:r>
-      <w:r>
-        <w:t xml:space="preserve">“We know what happened at the Rec Center. We have three witnesses who saw you holding a sword. If you don’t tell us where it is, we will tear this house down brick by brick until we find it.”</w:t>
-      </w:r>
-    </w:p>
-    <w:p>
-      <w:pPr>
-        <w:pStyle w:val="BodyText"/>
-      </w:pPr>
-      <w:r>
-        <w:t xml:space="preserve">They didn’t find it. I had stashed it too well. But they didn’t need the physical steel to make my life a living hell. They yanked my arms behind my back, the cold metal of the handcuffs clicking shut, biting deep into my wrists. They hauled me out onto the street in front of the neighbors and threw me into the back of a waiting cruiser.</w:t>
-      </w:r>
-    </w:p>
-    <w:p>
-      <w:pPr>
-        <w:pStyle w:val="BodyText"/>
-      </w:pPr>
-      <w:r>
-        <w:t xml:space="preserve">The physical transition to the Southern District cell was a descent into a specific kind of urban purgatory. The holding tank smelled of a nauseating mix of industrial Pine-Sol, old urine, stale sweat, and cheap, damp tobacco. The light was a harsh, flickering green-white from the humming fluorescent tubes overhead, casting long, sickly shadows across the concrete floor.</w:t>
-      </w:r>
-    </w:p>
-    <w:p>
-      <w:pPr>
-        <w:pStyle w:val="BodyText"/>
-      </w:pPr>
-      <w:r>
-        <w:t xml:space="preserve">I sat on the cold steel bench, rubbing my raw wrists, listening to the dull, constant buzz of the station and the muffled shouting of booking officers down the hall.</w:t>
-      </w:r>
-    </w:p>
-    <w:p>
-      <w:pPr>
-        <w:pStyle w:val="BodyText"/>
-      </w:pPr>
-      <w:r>
-        <w:t xml:space="preserve">Sitting across from me was a career street guy—an older Black man with deep, weathered lines carved into his face and a quiet, relaxed posture that suggested he viewed the holding cell as a second living room. He looked at my size, my matted hair, and my shivering frame.</w:t>
-      </w:r>
-    </w:p>
-    <w:p>
-      <w:pPr>
-        <w:pStyle w:val="BodyText"/>
-      </w:pPr>
-      <w:r>
-        <w:t xml:space="preserve">“What they got you for, big youngin?”</w:t>
-      </w:r>
-      <w:r>
-        <w:t xml:space="preserve"> </w:t>
-      </w:r>
-      <w:r>
-        <w:t xml:space="preserve">he asked, his voice a slow, gravelly drawl.</w:t>
-      </w:r>
-    </w:p>
-    <w:p>
-      <w:pPr>
-        <w:pStyle w:val="BodyText"/>
-      </w:pPr>
-      <w:r>
-        <w:t xml:space="preserve">I explained the fight at the Rec Center. I told him about the brother who had cowered inside, the crowd that had swarmed, and the machete I had drawn to level the playing field.</w:t>
-      </w:r>
-    </w:p>
-    <w:p>
-      <w:pPr>
-        <w:pStyle w:val="BodyText"/>
-      </w:pPr>
-      <w:r>
-        <w:t xml:space="preserve">The old man grinned, showing a missing bicuspid, and let out a soft laugh.</w:t>
-      </w:r>
-      <w:r>
-        <w:t xml:space="preserve"> </w:t>
-      </w:r>
-      <w:r>
-        <w:t xml:space="preserve">“Machete? Damn. You don’t play, do you? And that brother… he’s a straight-up bitch for leaving his own blood like that. You did right by the kid. But listen to me, youngin.”</w:t>
-      </w:r>
-      <w:r>
-        <w:t xml:space="preserve"> </w:t>
-      </w:r>
-      <w:r>
-        <w:t xml:space="preserve">He leaned forward, resting his elbows on his knees, his eyes locked onto mine.</w:t>
-      </w:r>
-      <w:r>
-        <w:t xml:space="preserve"> </w:t>
-      </w:r>
-      <w:r>
-        <w:t xml:space="preserve">“When they take you before the Commissioner tomorrow morning, you gotta play your hand. Don’t go in there trying to look like a tough guy. They don’t care about tough. You show them you got a ticket out of here.”</w:t>
-      </w:r>
-    </w:p>
-    <w:p>
-      <w:pPr>
-        <w:pStyle w:val="BodyText"/>
-      </w:pPr>
-      <w:r>
-        <w:t xml:space="preserve">I knew exactly what he meant.</w:t>
-      </w:r>
-    </w:p>
-    <w:p>
-      <w:pPr>
-        <w:pStyle w:val="BodyText"/>
-      </w:pPr>
-      <w:r>
-        <w:t xml:space="preserve">The next morning, they led me out of the cell and into the Commissioner’s office. My heart was redlining, my pulse loud in my ears. I knew my entire future was balanced on a razor blade. If they pressed aggravated assault or weapons charges, Tech Sergeant Cartwright’s enlistment papers were garbage. The Air Force would void the contract. Japan would be gone. My entire life’s escape hatch would be welded shut, and I would be permanently trapped in the gravity of Baltimore.</w:t>
-      </w:r>
-    </w:p>
-    <w:p>
-      <w:pPr>
-        <w:pStyle w:val="BodyText"/>
-      </w:pPr>
-      <w:r>
-        <w:t xml:space="preserve">The Commissioner was a tired, gray-haired man who looked like he had been reading arrest reports since the Wilson administration. A half-empty Styrofoam cup of cold coffee sat on his desk, next to a stack of files three inches thick. He didn’t look up at me when they marched me in.</w:t>
-      </w:r>
-    </w:p>
-    <w:p>
-      <w:pPr>
-        <w:pStyle w:val="BodyText"/>
-      </w:pPr>
-      <w:r>
-        <w:t xml:space="preserve">I stood there in my cuffs, took a slow, steady breath, and delivered the most important pitch of my life. I didn’t plead. I didn’t ask for mercy. I framed the situation as a simple, logical transaction.</w:t>
-      </w:r>
-    </w:p>
-    <w:p>
-      <w:pPr>
-        <w:pStyle w:val="BodyText"/>
-      </w:pPr>
-      <w:r>
-        <w:t xml:space="preserve">“Sir,”</w:t>
-      </w:r>
-      <w:r>
-        <w:t xml:space="preserve"> </w:t>
-      </w:r>
-      <w:r>
-        <w:t xml:space="preserve">I said, my voice calm and measured.</w:t>
-      </w:r>
-      <w:r>
-        <w:t xml:space="preserve"> </w:t>
-      </w:r>
-      <w:r>
-        <w:t xml:space="preserve">“I have a Delayed Enlistment contract with the United States Air Force. My ship date is January 3rd. That is exactly two weeks from now.”</w:t>
-      </w:r>
-    </w:p>
-    <w:p>
-      <w:pPr>
-        <w:pStyle w:val="BodyText"/>
-      </w:pPr>
-      <w:r>
-        <w:t xml:space="preserve">The Commissioner paused. He slowly raised his head, his tired eyes narrowing as he looked at me.</w:t>
-      </w:r>
-    </w:p>
-    <w:p>
-      <w:pPr>
-        <w:pStyle w:val="BodyText"/>
-      </w:pPr>
-      <w:r>
-        <w:t xml:space="preserve">I pressed the advantage.</w:t>
-      </w:r>
-      <w:r>
-        <w:t xml:space="preserve"> </w:t>
-      </w:r>
-      <w:r>
-        <w:t xml:space="preserve">“If you press these charges, you keep me in Baltimore. You keep me in your system, which means I remain a constant threat, a drain on your resources, and a problem for your officers on the street. But if you let me go, the federal government takes custody of me. They ship me to Texas, and then they ship me across the Pacific. I will be completely out of your jurisdiction, permanently. I will never stand on a Baltimore corner again. I am offering you a self-correcting problem.”</w:t>
-      </w:r>
-    </w:p>
-    <w:p>
-      <w:pPr>
-        <w:pStyle w:val="BodyText"/>
-      </w:pPr>
-      <w:r>
-        <w:t xml:space="preserve">I reached into my pocket—the guards had let me keep my folded papers—and placed the Air Force contract on his desk.</w:t>
-      </w:r>
-    </w:p>
-    <w:p>
-      <w:pPr>
-        <w:pStyle w:val="BodyText"/>
-      </w:pPr>
-      <w:r>
-        <w:t xml:space="preserve">The Commissioner looked down at the papers, then back up at me. I could see the analytical gears turning in his head. It was a matter of administrative efficiency. Prosecuting a kid for defending a friend with a machete would require court hours, witness testimonies, and public funds—all to keep a high-risk youth trapped in the same toxic ecosystem. Letting me join the military cleared his docket and solved the problem permanently.</w:t>
-      </w:r>
-    </w:p>
-    <w:p>
-      <w:pPr>
-        <w:pStyle w:val="BodyText"/>
-      </w:pPr>
-      <w:r>
-        <w:t xml:space="preserve">He picked up a heavy red stamp, breathed a sigh, and slammed it down onto my file with a loud, satisfying</w:t>
-      </w:r>
-      <w:r>
-        <w:t xml:space="preserve"> </w:t>
-      </w:r>
-      <w:r>
-        <w:rPr>
-          <w:i/>
-          <w:iCs/>
-        </w:rPr>
-        <w:t xml:space="preserve">thwack</w:t>
-      </w:r>
-      <w:r>
-        <w:t xml:space="preserve">.</w:t>
-      </w:r>
-    </w:p>
-    <w:p>
-      <w:pPr>
-        <w:pStyle w:val="BodyText"/>
-      </w:pPr>
-      <w:r>
-        <w:t xml:space="preserve">“I’m giving you a Stet,”</w:t>
-      </w:r>
-      <w:r>
-        <w:t xml:space="preserve"> </w:t>
-      </w:r>
-      <w:r>
-        <w:t xml:space="preserve">the Commissioner said, his voice flat and warning.</w:t>
-      </w:r>
-      <w:r>
-        <w:t xml:space="preserve"> </w:t>
-      </w:r>
-      <w:r>
-        <w:t xml:space="preserve">“Stet processus. It is an indefinite postponement. If you get so much as a jaywalking ticket in the next two weeks, I will personally reopen this file and see to it that you serve the maximum sentence. You are to go straight home, stay inside, and get the hell out of my city on January 3rd. Do you understand me?”</w:t>
-      </w:r>
-    </w:p>
-    <w:p>
-      <w:pPr>
-        <w:pStyle w:val="BodyText"/>
-      </w:pPr>
-      <w:r>
-        <w:t xml:space="preserve">“Yes, sir,”</w:t>
+        <w:t xml:space="preserve">I bolted up, my heart hammering against my ribs. I looked at my younger sister. She was standing in the hallway, already headed for the door.</w:t>
+      </w:r>
+    </w:p>
+    <w:p>
+      <w:pPr>
+        <w:pStyle w:val="BodyText"/>
+      </w:pPr>
+      <w:r>
+        <w:t xml:space="preserve">“Don’t let ’em in!”</w:t>
+      </w:r>
+      <w:r>
+        <w:t xml:space="preserve"> </w:t>
+      </w:r>
+      <w:r>
+        <w:t xml:space="preserve">I yelled.</w:t>
+      </w:r>
+    </w:p>
+    <w:p>
+      <w:pPr>
+        <w:pStyle w:val="BodyText"/>
+      </w:pPr>
+      <w:r>
+        <w:t xml:space="preserve">But she was young, and the sheer authority of the badge just had a presence over her. She didn’t know what to do, so she just opened the door.</w:t>
+      </w:r>
+    </w:p>
+    <w:p>
+      <w:pPr>
+        <w:pStyle w:val="BodyText"/>
+      </w:pPr>
+      <w:r>
+        <w:t xml:space="preserve">In came two Baltimore Police officers from the Southern District. They didn’t care about procedural decorum, warrants, or civil rights. They were just hyped up on their own shit.</w:t>
+      </w:r>
+    </w:p>
+    <w:p>
+      <w:pPr>
+        <w:pStyle w:val="BodyText"/>
+      </w:pPr>
+      <w:r>
+        <w:t xml:space="preserve">“Where’s the fucking machete?”</w:t>
+      </w:r>
+      <w:r>
+        <w:t xml:space="preserve"> </w:t>
+      </w:r>
+      <w:r>
+        <w:t xml:space="preserve">they demanded.</w:t>
+      </w:r>
+    </w:p>
+    <w:p>
+      <w:pPr>
+        <w:pStyle w:val="BodyText"/>
+      </w:pPr>
+      <w:r>
+        <w:t xml:space="preserve">“What machete?”</w:t>
       </w:r>
       <w:r>
         <w:t xml:space="preserve"> </w:t>
@@ -4090,37 +3837,191 @@
       <w:r>
         <w:t xml:space="preserve">I said.</w:t>
       </w:r>
-    </w:p>
-    <w:p>
-      <w:pPr>
-        <w:pStyle w:val="BodyText"/>
-      </w:pPr>
-      <w:r>
-        <w:t xml:space="preserve">The physical relief of walking out of that station into the biting, crisp Baltimore morning was overwhelming. I stood on the sidewalk, rubbing the raw, red indentations where the cuffs had bit into my skin, and took a deep, clean breath. I had engineered my escape. I had played the logic of the system against itself and won.</w:t>
-      </w:r>
-    </w:p>
-    <w:p>
-      <w:pPr>
-        <w:pStyle w:val="BodyText"/>
-      </w:pPr>
-      <w:r>
-        <w:t xml:space="preserve">On January 3, 1995, I boarded a plane to San Antonio. I left the bayonet, the fixed blade, and the machete behind in the Williams Street house.</w:t>
-      </w:r>
-    </w:p>
-    <w:p>
-      <w:pPr>
-        <w:pStyle w:val="BodyText"/>
-      </w:pPr>
-      <w:r>
-        <w:t xml:space="preserve">But I took the lessons with me. I took the hyper-vigilance, the threat assessment, and the understanding that when the physical chassis of your life is threatened, you have to bypass the pride and engineer a structural solution. I was leaving the hoodlum behind.</w:t>
-      </w:r>
-    </w:p>
-    <w:p>
-      <w:pPr>
-        <w:pStyle w:val="BodyText"/>
-      </w:pPr>
-      <w:r>
-        <w:t xml:space="preserve">But the Air Force was about to find out that the hoodlum’s operating system was still fully operational.</w:t>
+      <w:r>
+        <w:t xml:space="preserve"> </w:t>
+      </w:r>
+      <w:r>
+        <w:t xml:space="preserve">“I don’t have a machete. I don’t even own a machete.”</w:t>
+      </w:r>
+    </w:p>
+    <w:p>
+      <w:pPr>
+        <w:pStyle w:val="BodyText"/>
+      </w:pPr>
+      <w:r>
+        <w:t xml:space="preserve">“If you’re gonna be a little prick, then you’re gonna go to fucking Southern District,”</w:t>
+      </w:r>
+      <w:r>
+        <w:t xml:space="preserve"> </w:t>
+      </w:r>
+      <w:r>
+        <w:t xml:space="preserve">one of them said.</w:t>
+      </w:r>
+    </w:p>
+    <w:p>
+      <w:pPr>
+        <w:pStyle w:val="BodyText"/>
+      </w:pPr>
+      <w:r>
+        <w:t xml:space="preserve">They handcuffed me and hauled me down to the Southern District lockup. I was hanging out in the cell with all kinds of wonderful and interesting people. The Black guy in the cell next to me leaned over.</w:t>
+      </w:r>
+    </w:p>
+    <w:p>
+      <w:pPr>
+        <w:pStyle w:val="BodyText"/>
+      </w:pPr>
+      <w:r>
+        <w:t xml:space="preserve">“What you in here for, big youngin?”</w:t>
+      </w:r>
+      <w:r>
+        <w:t xml:space="preserve"> </w:t>
+      </w:r>
+      <w:r>
+        <w:t xml:space="preserve">he asked.</w:t>
+      </w:r>
+    </w:p>
+    <w:p>
+      <w:pPr>
+        <w:pStyle w:val="BodyText"/>
+      </w:pPr>
+      <w:r>
+        <w:t xml:space="preserve">“I don’t know, they picked me up for a fight,”</w:t>
+      </w:r>
+      <w:r>
+        <w:t xml:space="preserve"> </w:t>
+      </w:r>
+      <w:r>
+        <w:t xml:space="preserve">I said.</w:t>
+      </w:r>
+      <w:r>
+        <w:t xml:space="preserve"> </w:t>
+      </w:r>
+      <w:r>
+        <w:t xml:space="preserve">“But I was just sitting in my house.”</w:t>
+      </w:r>
+    </w:p>
+    <w:p>
+      <w:pPr>
+        <w:pStyle w:val="BodyText"/>
+      </w:pPr>
+      <w:r>
+        <w:t xml:space="preserve">He looked at me and said,</w:t>
+      </w:r>
+      <w:r>
+        <w:t xml:space="preserve"> </w:t>
+      </w:r>
+      <w:r>
+        <w:t xml:space="preserve">“The violent crime task force son picked me up.”</w:t>
+      </w:r>
+    </w:p>
+    <w:p>
+      <w:pPr>
+        <w:pStyle w:val="BodyText"/>
+      </w:pPr>
+      <w:r>
+        <w:t xml:space="preserve">“Oh man, all right, cool,”</w:t>
+      </w:r>
+      <w:r>
+        <w:t xml:space="preserve"> </w:t>
+      </w:r>
+      <w:r>
+        <w:t xml:space="preserve">I said.</w:t>
+      </w:r>
+      <w:r>
+        <w:t xml:space="preserve"> </w:t>
+      </w:r>
+      <w:r>
+        <w:t xml:space="preserve">“Good to know.”</w:t>
+      </w:r>
+      <w:r>
+        <w:t xml:space="preserve"> </w:t>
+      </w:r>
+      <w:r>
+        <w:t xml:space="preserve">He was pretty chill.</w:t>
+      </w:r>
+    </w:p>
+    <w:p>
+      <w:pPr>
+        <w:pStyle w:val="BodyText"/>
+      </w:pPr>
+      <w:r>
+        <w:t xml:space="preserve">I sat there and waited. And waited. And waited. The next morning, the police came by. They brought me a goddamn Egg McMuffin and a cup of black coffee. I don’t even drink coffee, but that’s just what they gave you in the Southern District holding tank, so I sat there eating a shitty McMuffin and drinking shitty black coffee.</w:t>
+      </w:r>
+    </w:p>
+    <w:p>
+      <w:pPr>
+        <w:pStyle w:val="BodyText"/>
+      </w:pPr>
+      <w:r>
+        <w:t xml:space="preserve">Eventually, my dad—Thompson—came to get me. He got right in front of the commissioner and told him,</w:t>
+      </w:r>
+      <w:r>
+        <w:t xml:space="preserve"> </w:t>
+      </w:r>
+      <w:r>
+        <w:t xml:space="preserve">“Hey, this kid is already signed up for the Air Force. Don’t fucking destroy his life over this stupid shit.”</w:t>
+      </w:r>
+    </w:p>
+    <w:p>
+      <w:pPr>
+        <w:pStyle w:val="BodyText"/>
+      </w:pPr>
+      <w:r>
+        <w:t xml:space="preserve">The commissioner saw it my dad’s way. There was no real trial or anything. I stood in front of the commissioner, and he gave me a Stet docket. Basically, it was an indefinite postponement of the charges.</w:t>
+      </w:r>
+    </w:p>
+    <w:p>
+      <w:pPr>
+        <w:pStyle w:val="BodyText"/>
+      </w:pPr>
+      <w:r>
+        <w:t xml:space="preserve">He was pretty straightforward.</w:t>
+      </w:r>
+      <w:r>
+        <w:t xml:space="preserve"> </w:t>
+      </w:r>
+      <w:r>
+        <w:t xml:space="preserve">“If I even get a fucking whiff of you doing something between now and January when you ship out,”</w:t>
+      </w:r>
+      <w:r>
+        <w:t xml:space="preserve"> </w:t>
+      </w:r>
+      <w:r>
+        <w:t xml:space="preserve">the commissioner told me,</w:t>
+      </w:r>
+      <w:r>
+        <w:t xml:space="preserve"> </w:t>
+      </w:r>
+      <w:r>
+        <w:t xml:space="preserve">“I’m gonna put you away.”</w:t>
+      </w:r>
+    </w:p>
+    <w:p>
+      <w:pPr>
+        <w:pStyle w:val="BodyText"/>
+      </w:pPr>
+      <w:r>
+        <w:t xml:space="preserve">“Understood,”</w:t>
+      </w:r>
+      <w:r>
+        <w:t xml:space="preserve"> </w:t>
+      </w:r>
+      <w:r>
+        <w:t xml:space="preserve">I said.</w:t>
+      </w:r>
+      <w:r>
+        <w:t xml:space="preserve"> </w:t>
+      </w:r>
+      <w:r>
+        <w:t xml:space="preserve">“You won’t hear a peep out of me.”</w:t>
+      </w:r>
+    </w:p>
+    <w:p>
+      <w:pPr>
+        <w:pStyle w:val="BodyText"/>
+      </w:pPr>
+      <w:r>
+        <w:t xml:space="preserve">I laid low for the next couple of months. And on January 3, 1995, I shipped out, leaving Baltimore behind.</w:t>
       </w:r>
     </w:p>
     <w:p>

</xml_diff>

<commit_message>
Update Chapter 1 based on latest voice dictation
</commit_message>
<xml_diff>
--- a/The_Improbability_of_Me_Master_Draft.docx
+++ b/The_Improbability_of_Me_Master_Draft.docx
@@ -187,147 +187,109 @@
         <w:pStyle w:val="FirstParagraph"/>
       </w:pPr>
       <w:r>
-        <w:t xml:space="preserve">So I’m kind of a fuck-up. I’ll admit it.</w:t>
-      </w:r>
-    </w:p>
-    <w:p>
-      <w:pPr>
-        <w:pStyle w:val="BodyText"/>
-      </w:pPr>
-      <w:r>
-        <w:t xml:space="preserve">Actually, let’s be real. I was a spectacular fuck-up. The kind other people used as a living warning label. For years I was the guy parents pointed at and said, “Don’t end up like him.”</w:t>
-      </w:r>
-    </w:p>
-    <w:p>
-      <w:pPr>
-        <w:pStyle w:val="BodyText"/>
-      </w:pPr>
-      <w:r>
-        <w:t xml:space="preserve">Now I walk into the headquarters of one of the world’s largest companies every single day, tap a security badge, and stroll straight into zones most engineers will never see. I carry a high-security laptop in a beat-up backpack and hold a Master of Science in Systems Engineering from Johns Hopkins. I’ve led Operational Technology (OT) cybersecurity programs—securing the computers and networks that control physical systems like power grids, pipelines, and manufacturing plants—run multi-billion-dollar modernization and functional safety projects at Koch Industries, and worked on highly sensitive national security architectures at MITRE that I’m still not allowed to talk about.</w:t>
-      </w:r>
-    </w:p>
-    <w:p>
-      <w:pPr>
-        <w:pStyle w:val="BodyText"/>
-      </w:pPr>
-      <w:r>
-        <w:t xml:space="preserve">And in nearly every one of those high-stakes rooms, I was the only motherfucker at the table who used to stand in front of a judge wearing shackles and an orange jumpsuit.</w:t>
-      </w:r>
-    </w:p>
-    <w:p>
-      <w:pPr>
-        <w:pStyle w:val="BodyText"/>
-      </w:pPr>
-      <w:r>
-        <w:t xml:space="preserve">I live in the violent split between two completely different files.</w:t>
-      </w:r>
-    </w:p>
-    <w:p>
-      <w:pPr>
-        <w:pStyle w:val="BodyText"/>
-      </w:pPr>
-      <w:r>
-        <w:t xml:space="preserve">The badge is just thick plastic with an RFID chip and a copper antenna. Tap it on the reader, it chirps, the light flips green, and the doors open. My dirty sneakers squeak across the polished granite like they don’t belong, because they fucking don’t.</w:t>
-      </w:r>
-    </w:p>
-    <w:p>
-      <w:pPr>
-        <w:pStyle w:val="BodyText"/>
-      </w:pPr>
-      <w:r>
-        <w:t xml:space="preserve">If that system ever cross-checked my real background against the badge, the alarms should have lit up like a Christmas tree and a security team should have been on my ass in seconds.</w:t>
-      </w:r>
-    </w:p>
-    <w:p>
-      <w:pPr>
-        <w:pStyle w:val="BodyText"/>
-      </w:pPr>
-      <w:r>
-        <w:t xml:space="preserve">Because the man walking these sterile hallways is the same asshole federal prosecutors once labeled a “Kingpin.”</w:t>
-      </w:r>
-    </w:p>
-    <w:p>
-      <w:pPr>
-        <w:pStyle w:val="BodyText"/>
-      </w:pPr>
-      <w:r>
-        <w:t xml:space="preserve">They weren’t completely wrong. I built and ran part of a multi-million-dollar anabolic steroid trafficking network that supplied the East Coast, West Coast, and parts of South America. I didn’t sling on corners. I managed encrypted accounts, rotated Western Union wires to Bulgaria and Thailand, and broke down bulk shipments in my living room while I fixed Air Force Two during the day. In my head I was a logistics genius. In reality I was deep in a game that was way bigger than I realized, and I don’t for a second take any pride in the idiot I was in my previous life. Don’t think that for a second.</w:t>
-      </w:r>
-    </w:p>
-    <w:p>
-      <w:pPr>
-        <w:pStyle w:val="BodyText"/>
-      </w:pPr>
-      <w:r>
-        <w:t xml:space="preserve">Until a single point of failure at JFK Airport turned the whole matrix into a flaming pile of wreckage.</w:t>
-      </w:r>
-    </w:p>
-    <w:p>
-      <w:pPr>
-        <w:pStyle w:val="BodyText"/>
-      </w:pPr>
-      <w:r>
-        <w:t xml:space="preserve">I’ve done real time in a cage. I’ve worn an ankle monitor that rubbed my skin raw while trying to hold down a job at Northrop Grumman. I’ve sat in a Baltimore courtroom while some arrogant judge looked down his nose at me. In a courtroom full of Baltimore’s worst shitheads, he actually said I was the most dangerous man in the room. He said my crime was one of</w:t>
-      </w:r>
-      <w:r>
-        <w:t xml:space="preserve"> </w:t>
-      </w:r>
-      <w:r>
-        <w:t xml:space="preserve">“intelligence and guile.”</w:t>
-      </w:r>
-      <w:r>
-        <w:t xml:space="preserve"> </w:t>
-      </w:r>
-      <w:r>
-        <w:t xml:space="preserve">He said he wanted to make an example out of me. I’ve had cancer try to hollow me out from the inside, and I raw-dogged the recovery from a full titanium hip replacement with zero opioids like a goddamn animal.</w:t>
-      </w:r>
-    </w:p>
-    <w:p>
-      <w:pPr>
-        <w:pStyle w:val="BodyText"/>
-      </w:pPr>
-      <w:r>
-        <w:t xml:space="preserve">The actuarial tables said I should be dead, locked up for life, or another broken statistic scraping by on the margins. Fuck all that. I re-engineered the system instead.</w:t>
-      </w:r>
-    </w:p>
-    <w:p>
-      <w:pPr>
-        <w:pStyle w:val="BodyText"/>
-      </w:pPr>
-      <w:r>
-        <w:t xml:space="preserve">The same high-voltage threat-scanning brain I built dodging knives and crackheads on Greenmount and North Avenue is the exact same operating system I now use to hunt nation-state actors inside critical infrastructure networks. The street code never uninstalled. I just patched it for legitimate architecture.</w:t>
-      </w:r>
-    </w:p>
-    <w:p>
-      <w:pPr>
-        <w:pStyle w:val="BodyText"/>
-      </w:pPr>
-      <w:r>
-        <w:t xml:space="preserve">This isn’t some corny “overcoming adversity” fairy tale. I’m not here for pity and I’m damn sure not here to inspire you with cheap motivational bullshit. I’m not a role model and you’ll never see a children’s book from me. This is a cold, brutal audit of how a human system can be driven to catastrophic redline failure, shatter into a thousand jagged pieces, and still get rebuilt stronger than the original design.</w:t>
-      </w:r>
-    </w:p>
-    <w:p>
-      <w:pPr>
-        <w:pStyle w:val="BodyText"/>
-      </w:pPr>
-      <w:r>
-        <w:t xml:space="preserve">The Japanese have a word for it: kintsugi. They take the broken pieces and fill the cracks with gold. The flaws aren’t hidden. They’re highlighted. That’s exactly how I see my scars now.</w:t>
-      </w:r>
-    </w:p>
-    <w:p>
-      <w:pPr>
-        <w:pStyle w:val="BodyText"/>
-      </w:pPr>
-      <w:r>
-        <w:t xml:space="preserve">The systems thinking didn’t start at Johns Hopkins. It started on Baltimore city buses as a scrawny kid learning how to scan every crowd, map every exit, and calculate who was about to try to kill me in the next ten seconds.</w:t>
-      </w:r>
-    </w:p>
-    <w:p>
-      <w:pPr>
-        <w:pStyle w:val="BodyText"/>
-      </w:pPr>
-      <w:r>
-        <w:t xml:space="preserve">This book is the blueprint of how not to do it, and exactly how to crawl out of the wreckage if you fuck up as badly as I did.</w:t>
+        <w:t xml:space="preserve">So I’m kind of a fuckup. I’ll admit it. Actually, let’s be real. I was a spectacular fuckup. The classic</w:t>
+      </w:r>
+      <w:r>
+        <w:t xml:space="preserve"> </w:t>
+      </w:r>
+      <w:r>
+        <w:t xml:space="preserve">“don’t be like that fucking guy.”</w:t>
+      </w:r>
+    </w:p>
+    <w:p>
+      <w:pPr>
+        <w:pStyle w:val="BodyText"/>
+      </w:pPr>
+      <w:r>
+        <w:t xml:space="preserve">But I didn’t start out that way.</w:t>
+      </w:r>
+    </w:p>
+    <w:p>
+      <w:pPr>
+        <w:pStyle w:val="BodyText"/>
+      </w:pPr>
+      <w:r>
+        <w:t xml:space="preserve">For the majority of my life, I was the golden boy. I was the teacher’s pet, the top performer in school, just an all-around smart kid. But somewhere along the line, shit got a little bit out of control. This story is all about how things spiraled out of control and how easily that can happen.</w:t>
+      </w:r>
+    </w:p>
+    <w:p>
+      <w:pPr>
+        <w:pStyle w:val="BodyText"/>
+      </w:pPr>
+      <w:r>
+        <w:t xml:space="preserve">But it’s not just about letting shit spiral. It’s about grabbing fucking life by the horns and getting back on that motherfucker after you’ve been knocked down to rock bottom.</w:t>
+      </w:r>
+    </w:p>
+    <w:p>
+      <w:pPr>
+        <w:pStyle w:val="BodyText"/>
+      </w:pPr>
+      <w:r>
+        <w:t xml:space="preserve">And I’ve hit rock bottom. I’ve been put in jail, stripped of my freedom, and dragged through all of that shit.</w:t>
+      </w:r>
+    </w:p>
+    <w:p>
+      <w:pPr>
+        <w:pStyle w:val="BodyText"/>
+      </w:pPr>
+      <w:r>
+        <w:t xml:space="preserve">Nowadays, I am a high-powered, principled engineer at some of the world’s largest companies. I’ve worked on systems that no one will ever see. I’ve worked on critical infrastructure. I’ve worked on projects for National Labs and federally funded research and development centers that I can never talk about. I’ve been a CTO at one of the world’s largest automation distributors. I’ve been a director at one of the world’s largest privately owned companies, Koch Industries.</w:t>
+      </w:r>
+    </w:p>
+    <w:p>
+      <w:pPr>
+        <w:pStyle w:val="BodyText"/>
+      </w:pPr>
+      <w:r>
+        <w:t xml:space="preserve">I grew up in South Baltimore, but I had to go to school in North Baltimore. I had to deal with the local indigenous population that hated me because of my light complexion. A whole bunch of shit.</w:t>
+      </w:r>
+    </w:p>
+    <w:p>
+      <w:pPr>
+        <w:pStyle w:val="BodyText"/>
+      </w:pPr>
+      <w:r>
+        <w:t xml:space="preserve">I joined the military. They poisoned me. It’s all right, it’s all good. What’s a little fucking poison between friends? I also accidentally became an international drug kingpin for anabolic steroids. That was a fucking adventure right there.</w:t>
+      </w:r>
+    </w:p>
+    <w:p>
+      <w:pPr>
+        <w:pStyle w:val="BodyText"/>
+      </w:pPr>
+      <w:r>
+        <w:t xml:space="preserve">Life happens. I’ve got scars across my head and my face. I’ve got a fake left hip. I’ve got scars on my legs. I’ve got scars across my abdomen where they had to cut me open and cut out the cancerous fucking ball that the Air Force poisoned me with.</w:t>
+      </w:r>
+    </w:p>
+    <w:p>
+      <w:pPr>
+        <w:pStyle w:val="BodyText"/>
+      </w:pPr>
+      <w:r>
+        <w:t xml:space="preserve">When I look at it as a functional safety engineer, I’m trained on understanding the probability of failure on demand for systems. I’d say the probability of failure on demand for my own fucking life was pretty close to certain. But I managed to unfuck myself. I came back from that, re-engineered my life, and was able to take the shit that made me a fuckup and turn it into something that makes me special.</w:t>
+      </w:r>
+    </w:p>
+    <w:p>
+      <w:pPr>
+        <w:pStyle w:val="BodyText"/>
+      </w:pPr>
+      <w:r>
+        <w:t xml:space="preserve">The Japanese have a word for this. Of course I’m going to talk about Japanese, because I studied Japanese since I was in the sixth grade, and when I was in the military I lived over there for three years. The Japanese have a word for that crack that they’ve made better, those broken pieces that they filled with gold. It’s called Kintsugi.</w:t>
+      </w:r>
+    </w:p>
+    <w:p>
+      <w:pPr>
+        <w:pStyle w:val="BodyText"/>
+      </w:pPr>
+      <w:r>
+        <w:t xml:space="preserve">Kintsugi is about highlighting those things that made us broken. So now, I see all my scars and everything I’ve been through, and I understand that this is me. This is what I’ve become. This is who I am.</w:t>
+      </w:r>
+    </w:p>
+    <w:p>
+      <w:pPr>
+        <w:pStyle w:val="BodyText"/>
+      </w:pPr>
+      <w:r>
+        <w:t xml:space="preserve">This book is all about how not to get into these fucking stupid situations in the first place. And, if you find yourself already in that fucked up life, here’s how to get out of that motherfucker and do it right. So with this, I’m gonna kick this book off and get this thing started.</w:t>
       </w:r>
     </w:p>
     <w:p>

</xml_diff>